<commit_message>
Relaxed prompt testing and refinement
</commit_message>
<xml_diff>
--- a/Documentation_demo/Documentation.docx
+++ b/Documentation_demo/Documentation.docx
@@ -642,23 +642,13 @@
           <w:szCs w:val="24"/>
         </w:rPr>
       </w:pPr>
-      <w:proofErr w:type="spellStart"/>
-      <w:r>
-        <w:rPr>
-          <w:rFonts w:cstheme="minorHAnsi"/>
-          <w:sz w:val="24"/>
-          <w:szCs w:val="24"/>
-        </w:rPr>
-        <w:t>Streamlit</w:t>
-      </w:r>
-      <w:proofErr w:type="spellEnd"/>
-      <w:r>
-        <w:rPr>
-          <w:rFonts w:cstheme="minorHAnsi"/>
-          <w:sz w:val="24"/>
-          <w:szCs w:val="24"/>
-        </w:rPr>
-        <w:t>-based chat UI</w:t>
+      <w:r>
+        <w:rPr>
+          <w:rFonts w:cstheme="minorHAnsi"/>
+          <w:sz w:val="24"/>
+          <w:szCs w:val="24"/>
+        </w:rPr>
+        <w:t>Streamlit-based chat UI</w:t>
       </w:r>
     </w:p>
     <w:p>
@@ -1108,20 +1098,8 @@
           <w:sz w:val="24"/>
           <w:szCs w:val="24"/>
         </w:rPr>
-        <w:t xml:space="preserve"> Deployment &amp; </w:t>
-      </w:r>
-      <w:proofErr w:type="spellStart"/>
-      <w:r>
-        <w:rPr>
-          <w:rFonts w:cstheme="minorHAnsi"/>
-          <w:b/>
-          <w:bCs/>
-          <w:sz w:val="24"/>
-          <w:szCs w:val="24"/>
-        </w:rPr>
-        <w:t>MLOps</w:t>
-      </w:r>
-      <w:proofErr w:type="spellEnd"/>
+        <w:t xml:space="preserve"> Deployment &amp; MLOps</w:t>
+      </w:r>
     </w:p>
     <w:p>
       <w:pPr>
@@ -1136,23 +1114,13 @@
           <w:szCs w:val="24"/>
         </w:rPr>
       </w:pPr>
-      <w:proofErr w:type="spellStart"/>
-      <w:r>
-        <w:rPr>
-          <w:rFonts w:cstheme="minorHAnsi"/>
-          <w:sz w:val="24"/>
-          <w:szCs w:val="24"/>
-        </w:rPr>
-        <w:t>Dockerized</w:t>
-      </w:r>
-      <w:proofErr w:type="spellEnd"/>
-      <w:r>
-        <w:rPr>
-          <w:rFonts w:cstheme="minorHAnsi"/>
-          <w:sz w:val="24"/>
-          <w:szCs w:val="24"/>
-        </w:rPr>
-        <w:t xml:space="preserve"> application</w:t>
+      <w:r>
+        <w:rPr>
+          <w:rFonts w:cstheme="minorHAnsi"/>
+          <w:sz w:val="24"/>
+          <w:szCs w:val="24"/>
+        </w:rPr>
+        <w:t>Dockerized application</w:t>
       </w:r>
     </w:p>
     <w:p>
@@ -1431,7 +1399,6 @@
                 <w:szCs w:val="24"/>
               </w:rPr>
             </w:pPr>
-            <w:proofErr w:type="spellStart"/>
             <w:r>
               <w:rPr>
                 <w:rFonts w:cstheme="minorHAnsi"/>
@@ -1440,7 +1407,6 @@
               </w:rPr>
               <w:t>LangChain</w:t>
             </w:r>
-            <w:proofErr w:type="spellEnd"/>
           </w:p>
         </w:tc>
       </w:tr>
@@ -1488,23 +1454,13 @@
                 <w:szCs w:val="24"/>
               </w:rPr>
             </w:pPr>
-            <w:proofErr w:type="spellStart"/>
             <w:r>
               <w:rPr>
                 <w:rFonts w:cstheme="minorHAnsi"/>
                 <w:sz w:val="24"/>
                 <w:szCs w:val="24"/>
               </w:rPr>
-              <w:t>HuggingFace</w:t>
-            </w:r>
-            <w:proofErr w:type="spellEnd"/>
-            <w:r>
-              <w:rPr>
-                <w:rFonts w:cstheme="minorHAnsi"/>
-                <w:sz w:val="24"/>
-                <w:szCs w:val="24"/>
-              </w:rPr>
-              <w:t xml:space="preserve"> / OpenAI</w:t>
+              <w:t>HuggingFace / OpenAI</w:t>
             </w:r>
           </w:p>
         </w:tc>
@@ -1559,18 +1515,8 @@
                 <w:sz w:val="24"/>
                 <w:szCs w:val="24"/>
               </w:rPr>
-              <w:t xml:space="preserve">FAISS or </w:t>
+              <w:t>FAISS or ChromaDB</w:t>
             </w:r>
-            <w:proofErr w:type="spellStart"/>
-            <w:r>
-              <w:rPr>
-                <w:rFonts w:cstheme="minorHAnsi"/>
-                <w:sz w:val="24"/>
-                <w:szCs w:val="24"/>
-              </w:rPr>
-              <w:t>ChromaDB</w:t>
-            </w:r>
-            <w:proofErr w:type="spellEnd"/>
             <w:r>
               <w:rPr>
                 <w:rFonts w:cstheme="minorHAnsi"/>
@@ -1681,7 +1627,6 @@
                 <w:szCs w:val="24"/>
               </w:rPr>
             </w:pPr>
-            <w:proofErr w:type="spellStart"/>
             <w:r>
               <w:rPr>
                 <w:rFonts w:cstheme="minorHAnsi"/>
@@ -1690,7 +1635,6 @@
               </w:rPr>
               <w:t>Streamlit</w:t>
             </w:r>
-            <w:proofErr w:type="spellEnd"/>
           </w:p>
         </w:tc>
       </w:tr>
@@ -1903,23 +1847,13 @@
                 <w:szCs w:val="24"/>
               </w:rPr>
             </w:pPr>
-            <w:proofErr w:type="spellStart"/>
             <w:r>
               <w:rPr>
                 <w:rFonts w:cstheme="minorHAnsi"/>
                 <w:sz w:val="24"/>
                 <w:szCs w:val="24"/>
               </w:rPr>
-              <w:t>MLflow</w:t>
-            </w:r>
-            <w:proofErr w:type="spellEnd"/>
-            <w:r>
-              <w:rPr>
-                <w:rFonts w:cstheme="minorHAnsi"/>
-                <w:sz w:val="24"/>
-                <w:szCs w:val="24"/>
-              </w:rPr>
-              <w:t xml:space="preserve"> for experiments</w:t>
+              <w:t>MLflow for experiments</w:t>
             </w:r>
           </w:p>
         </w:tc>
@@ -2334,25 +2268,7 @@
           <w:sz w:val="24"/>
           <w:szCs w:val="24"/>
         </w:rPr>
-        <w:t xml:space="preserve">User → </w:t>
-      </w:r>
-      <w:proofErr w:type="spellStart"/>
-      <w:r>
-        <w:rPr>
-          <w:rFonts w:cstheme="minorHAnsi"/>
-          <w:sz w:val="24"/>
-          <w:szCs w:val="24"/>
-        </w:rPr>
-        <w:t>Streamlit</w:t>
-      </w:r>
-      <w:proofErr w:type="spellEnd"/>
-      <w:r>
-        <w:rPr>
-          <w:rFonts w:cstheme="minorHAnsi"/>
-          <w:sz w:val="24"/>
-          <w:szCs w:val="24"/>
-        </w:rPr>
-        <w:t xml:space="preserve"> UI → Query</w:t>
+        <w:t>User → Streamlit UI → Query</w:t>
       </w:r>
     </w:p>
     <w:p>
@@ -3017,42 +2933,8 @@
           <w:sz w:val="24"/>
           <w:szCs w:val="24"/>
         </w:rPr>
-        <w:t xml:space="preserve">git clone </w:t>
-      </w:r>
-      <w:proofErr w:type="spellStart"/>
-      <w:r>
-        <w:rPr>
-          <w:rFonts w:cstheme="minorHAnsi"/>
-          <w:i/>
-          <w:iCs/>
-          <w:sz w:val="24"/>
-          <w:szCs w:val="24"/>
-        </w:rPr>
-        <w:t>JankiMandviya</w:t>
-      </w:r>
-      <w:proofErr w:type="spellEnd"/>
-      <w:r>
-        <w:rPr>
-          <w:rFonts w:cstheme="minorHAnsi"/>
-          <w:i/>
-          <w:iCs/>
-          <w:sz w:val="24"/>
-          <w:szCs w:val="24"/>
-        </w:rPr>
-        <w:t>/</w:t>
-      </w:r>
-      <w:proofErr w:type="spellStart"/>
-      <w:r>
-        <w:rPr>
-          <w:rFonts w:cstheme="minorHAnsi"/>
-          <w:i/>
-          <w:iCs/>
-          <w:sz w:val="24"/>
-          <w:szCs w:val="24"/>
-        </w:rPr>
-        <w:t>Enterprise_document_RAG_assistant</w:t>
-      </w:r>
-      <w:proofErr w:type="spellEnd"/>
+        <w:t>git clone JankiMandviya/Enterprise_document_RAG_assistant</w:t>
+      </w:r>
     </w:p>
     <w:p>
       <w:pPr>
@@ -3169,7 +3051,6 @@
         </w:rPr>
         <w:t xml:space="preserve">$ </w:t>
       </w:r>
-      <w:proofErr w:type="spellStart"/>
       <w:r>
         <w:rPr>
           <w:rFonts w:cstheme="minorHAnsi"/>
@@ -3178,53 +3059,8 @@
           <w:sz w:val="24"/>
           <w:szCs w:val="24"/>
         </w:rPr>
-        <w:t>py</w:t>
-      </w:r>
-      <w:proofErr w:type="spellEnd"/>
-      <w:r>
-        <w:rPr>
-          <w:rFonts w:cstheme="minorHAnsi"/>
-          <w:i/>
-          <w:iCs/>
-          <w:sz w:val="24"/>
-          <w:szCs w:val="24"/>
-        </w:rPr>
-        <w:t xml:space="preserve"> -3.11 -m </w:t>
-      </w:r>
-      <w:proofErr w:type="spellStart"/>
-      <w:r>
-        <w:rPr>
-          <w:rFonts w:cstheme="minorHAnsi"/>
-          <w:i/>
-          <w:iCs/>
-          <w:sz w:val="24"/>
-          <w:szCs w:val="24"/>
-        </w:rPr>
-        <w:t>venv</w:t>
-      </w:r>
-      <w:proofErr w:type="spellEnd"/>
-      <w:r>
-        <w:rPr>
-          <w:rFonts w:cstheme="minorHAnsi"/>
-          <w:i/>
-          <w:iCs/>
-          <w:sz w:val="24"/>
-          <w:szCs w:val="24"/>
-        </w:rPr>
-        <w:t xml:space="preserve"> </w:t>
-      </w:r>
-      <w:proofErr w:type="spellStart"/>
-      <w:r>
-        <w:rPr>
-          <w:rFonts w:cstheme="minorHAnsi"/>
-          <w:i/>
-          <w:iCs/>
-          <w:sz w:val="24"/>
-          <w:szCs w:val="24"/>
-        </w:rPr>
-        <w:t>RAG_venv</w:t>
-      </w:r>
-      <w:proofErr w:type="spellEnd"/>
+        <w:t>py -3.11 -m venv RAG_venv</w:t>
+      </w:r>
     </w:p>
     <w:p>
       <w:pPr>
@@ -3277,29 +3113,7 @@
           <w:sz w:val="24"/>
           <w:szCs w:val="24"/>
         </w:rPr>
-        <w:t xml:space="preserve">source </w:t>
-      </w:r>
-      <w:proofErr w:type="spellStart"/>
-      <w:r>
-        <w:rPr>
-          <w:rFonts w:cstheme="minorHAnsi"/>
-          <w:i/>
-          <w:iCs/>
-          <w:sz w:val="24"/>
-          <w:szCs w:val="24"/>
-        </w:rPr>
-        <w:t>RAG_venv</w:t>
-      </w:r>
-      <w:proofErr w:type="spellEnd"/>
-      <w:r>
-        <w:rPr>
-          <w:rFonts w:cstheme="minorHAnsi"/>
-          <w:i/>
-          <w:iCs/>
-          <w:sz w:val="24"/>
-          <w:szCs w:val="24"/>
-        </w:rPr>
-        <w:t>/Scripts/activate</w:t>
+        <w:t>source RAG_venv/Scripts/activate</w:t>
       </w:r>
     </w:p>
     <w:p>
@@ -3321,18 +3135,8 @@
           <w:sz w:val="24"/>
           <w:szCs w:val="24"/>
         </w:rPr>
-        <w:t xml:space="preserve">Check python version in </w:t>
-      </w:r>
-      <w:proofErr w:type="spellStart"/>
-      <w:r>
-        <w:rPr>
-          <w:rFonts w:cstheme="minorHAnsi"/>
-          <w:sz w:val="24"/>
-          <w:szCs w:val="24"/>
-        </w:rPr>
-        <w:t>venv</w:t>
-      </w:r>
-      <w:proofErr w:type="spellEnd"/>
+        <w:t>Check python version in venv</w:t>
+      </w:r>
     </w:p>
     <w:p>
       <w:pPr>
@@ -3477,25 +3281,7 @@
           <w:sz w:val="24"/>
           <w:szCs w:val="24"/>
         </w:rPr>
-        <w:t xml:space="preserve">Install </w:t>
-      </w:r>
-      <w:proofErr w:type="spellStart"/>
-      <w:r>
-        <w:rPr>
-          <w:rFonts w:cstheme="minorHAnsi"/>
-          <w:sz w:val="24"/>
-          <w:szCs w:val="24"/>
-        </w:rPr>
-        <w:t>ollama</w:t>
-      </w:r>
-      <w:proofErr w:type="spellEnd"/>
-      <w:r>
-        <w:rPr>
-          <w:rFonts w:cstheme="minorHAnsi"/>
-          <w:sz w:val="24"/>
-          <w:szCs w:val="24"/>
-        </w:rPr>
-        <w:t xml:space="preserve"> from following link in the same system you are making setup for the project since the Llama is going to run locally for data security purposes.</w:t>
+        <w:t>Install ollama from following link in the same system you are making setup for the project since the Llama is going to run locally for data security purposes.</w:t>
       </w:r>
     </w:p>
     <w:p>
@@ -3539,36 +3325,8 @@
           <w:sz w:val="24"/>
           <w:szCs w:val="24"/>
         </w:rPr>
-        <w:t xml:space="preserve">Once </w:t>
-      </w:r>
-      <w:proofErr w:type="spellStart"/>
-      <w:r>
-        <w:rPr>
-          <w:rFonts w:cstheme="minorHAnsi"/>
-          <w:sz w:val="24"/>
-          <w:szCs w:val="24"/>
-        </w:rPr>
-        <w:t>ollama</w:t>
-      </w:r>
-      <w:proofErr w:type="spellEnd"/>
-      <w:r>
-        <w:rPr>
-          <w:rFonts w:cstheme="minorHAnsi"/>
-          <w:sz w:val="24"/>
-          <w:szCs w:val="24"/>
-        </w:rPr>
-        <w:t xml:space="preserve"> is installed, in terminal check version of </w:t>
-      </w:r>
-      <w:proofErr w:type="spellStart"/>
-      <w:r>
-        <w:rPr>
-          <w:rFonts w:cstheme="minorHAnsi"/>
-          <w:sz w:val="24"/>
-          <w:szCs w:val="24"/>
-        </w:rPr>
-        <w:t>ollama</w:t>
-      </w:r>
-      <w:proofErr w:type="spellEnd"/>
+        <w:t>Once ollama is installed, in terminal check version of ollama</w:t>
+      </w:r>
     </w:p>
     <w:p>
       <w:pPr>
@@ -3586,25 +3344,7 @@
           <w:sz w:val="24"/>
           <w:szCs w:val="24"/>
         </w:rPr>
-        <w:t xml:space="preserve">$ </w:t>
-      </w:r>
-      <w:proofErr w:type="spellStart"/>
-      <w:r>
-        <w:rPr>
-          <w:rFonts w:cstheme="minorHAnsi"/>
-          <w:sz w:val="24"/>
-          <w:szCs w:val="24"/>
-        </w:rPr>
-        <w:t>ollama</w:t>
-      </w:r>
-      <w:proofErr w:type="spellEnd"/>
-      <w:r>
-        <w:rPr>
-          <w:rFonts w:cstheme="minorHAnsi"/>
-          <w:sz w:val="24"/>
-          <w:szCs w:val="24"/>
-        </w:rPr>
-        <w:t xml:space="preserve"> </w:t>
+        <w:t xml:space="preserve">$ ollama </w:t>
       </w:r>
       <w:r>
         <w:rPr>
@@ -3663,23 +3403,13 @@
         </w:rPr>
         <w:t xml:space="preserve">$ </w:t>
       </w:r>
-      <w:proofErr w:type="spellStart"/>
-      <w:r>
-        <w:rPr>
-          <w:rFonts w:cstheme="minorHAnsi"/>
-          <w:sz w:val="24"/>
-          <w:szCs w:val="24"/>
-        </w:rPr>
-        <w:t>ollama</w:t>
-      </w:r>
-      <w:proofErr w:type="spellEnd"/>
-      <w:r>
-        <w:rPr>
-          <w:rFonts w:cstheme="minorHAnsi"/>
-          <w:sz w:val="24"/>
-          <w:szCs w:val="24"/>
-        </w:rPr>
-        <w:t xml:space="preserve"> pull mistral:7b-instruct-q4_0</w:t>
+      <w:r>
+        <w:rPr>
+          <w:rFonts w:cstheme="minorHAnsi"/>
+          <w:sz w:val="24"/>
+          <w:szCs w:val="24"/>
+        </w:rPr>
+        <w:t>ollama pull mistral:7b-instruct-q4_0</w:t>
       </w:r>
     </w:p>
     <w:p>
@@ -3701,18 +3431,8 @@
           <w:sz w:val="24"/>
           <w:szCs w:val="24"/>
         </w:rPr>
-        <w:t xml:space="preserve">Once model is pulled, check if service is </w:t>
-      </w:r>
-      <w:proofErr w:type="gramStart"/>
-      <w:r>
-        <w:rPr>
-          <w:rFonts w:cstheme="minorHAnsi"/>
-          <w:sz w:val="24"/>
-          <w:szCs w:val="24"/>
-        </w:rPr>
-        <w:t>running..</w:t>
-      </w:r>
-      <w:proofErr w:type="gramEnd"/>
+        <w:t>Once model is pulled, check if service is running..</w:t>
+      </w:r>
     </w:p>
     <w:p>
       <w:pPr>
@@ -3730,25 +3450,7 @@
           <w:sz w:val="24"/>
           <w:szCs w:val="24"/>
         </w:rPr>
-        <w:t xml:space="preserve">$ </w:t>
-      </w:r>
-      <w:proofErr w:type="spellStart"/>
-      <w:r>
-        <w:rPr>
-          <w:rFonts w:cstheme="minorHAnsi"/>
-          <w:sz w:val="24"/>
-          <w:szCs w:val="24"/>
-        </w:rPr>
-        <w:t>ollama</w:t>
-      </w:r>
-      <w:proofErr w:type="spellEnd"/>
-      <w:r>
-        <w:rPr>
-          <w:rFonts w:cstheme="minorHAnsi"/>
-          <w:sz w:val="24"/>
-          <w:szCs w:val="24"/>
-        </w:rPr>
-        <w:t xml:space="preserve"> list</w:t>
+        <w:t>$ ollama list</w:t>
       </w:r>
     </w:p>
     <w:p>
@@ -3855,8 +3557,6 @@
         </w:rPr>
         <w:t xml:space="preserve">Note the name of the model and the same name must appear in </w:t>
       </w:r>
-      <w:proofErr w:type="spellStart"/>
-      <w:proofErr w:type="gramStart"/>
       <w:r>
         <w:rPr>
           <w:rFonts w:cstheme="minorHAnsi"/>
@@ -3865,23 +3565,13 @@
         </w:rPr>
         <w:t>CallLLM</w:t>
       </w:r>
-      <w:proofErr w:type="spellEnd"/>
-      <w:r>
-        <w:rPr>
-          <w:rFonts w:cstheme="minorHAnsi"/>
-          <w:sz w:val="24"/>
-          <w:szCs w:val="24"/>
-        </w:rPr>
-        <w:t>(</w:t>
-      </w:r>
-      <w:proofErr w:type="gramEnd"/>
-      <w:r>
-        <w:rPr>
-          <w:rFonts w:cstheme="minorHAnsi"/>
-          <w:sz w:val="24"/>
-          <w:szCs w:val="24"/>
-        </w:rPr>
-        <w:t>) API payload’s name field.</w:t>
+      <w:r>
+        <w:rPr>
+          <w:rFonts w:cstheme="minorHAnsi"/>
+          <w:sz w:val="24"/>
+          <w:szCs w:val="24"/>
+        </w:rPr>
+        <w:t>() API payload’s name field.</w:t>
       </w:r>
     </w:p>
     <w:p>
@@ -3894,7 +3584,6 @@
           <w:szCs w:val="24"/>
         </w:rPr>
       </w:pPr>
-      <w:proofErr w:type="spellStart"/>
       <w:r>
         <w:rPr>
           <w:rFonts w:cstheme="minorHAnsi"/>
@@ -3903,7 +3592,6 @@
         </w:rPr>
         <w:t>Eg.</w:t>
       </w:r>
-      <w:proofErr w:type="spellEnd"/>
     </w:p>
     <w:p>
       <w:pPr>
@@ -4014,23 +3702,13 @@
         </w:rPr>
         <w:t xml:space="preserve">$ </w:t>
       </w:r>
-      <w:proofErr w:type="spellStart"/>
-      <w:r>
-        <w:rPr>
-          <w:rFonts w:cstheme="minorHAnsi"/>
-          <w:sz w:val="24"/>
-          <w:szCs w:val="24"/>
-        </w:rPr>
-        <w:t>ollama</w:t>
-      </w:r>
-      <w:proofErr w:type="spellEnd"/>
-      <w:r>
-        <w:rPr>
-          <w:rFonts w:cstheme="minorHAnsi"/>
-          <w:sz w:val="24"/>
-          <w:szCs w:val="24"/>
-        </w:rPr>
-        <w:t xml:space="preserve"> pull llama3</w:t>
+      <w:r>
+        <w:rPr>
+          <w:rFonts w:cstheme="minorHAnsi"/>
+          <w:sz w:val="24"/>
+          <w:szCs w:val="24"/>
+        </w:rPr>
+        <w:t>ollama pull llama3</w:t>
       </w:r>
     </w:p>
     <w:p>
@@ -4051,23 +3729,13 @@
         </w:rPr>
         <w:t xml:space="preserve">$ </w:t>
       </w:r>
-      <w:proofErr w:type="spellStart"/>
-      <w:r>
-        <w:rPr>
-          <w:rFonts w:cstheme="minorHAnsi"/>
-          <w:sz w:val="24"/>
-          <w:szCs w:val="24"/>
-        </w:rPr>
-        <w:t>ollama</w:t>
-      </w:r>
-      <w:proofErr w:type="spellEnd"/>
-      <w:r>
-        <w:rPr>
-          <w:rFonts w:cstheme="minorHAnsi"/>
-          <w:sz w:val="24"/>
-          <w:szCs w:val="24"/>
-        </w:rPr>
-        <w:t xml:space="preserve"> pull llama3:8b-instruct-q2_K</w:t>
+      <w:r>
+        <w:rPr>
+          <w:rFonts w:cstheme="minorHAnsi"/>
+          <w:sz w:val="24"/>
+          <w:szCs w:val="24"/>
+        </w:rPr>
+        <w:t>ollama pull llama3:8b-instruct-q2_K</w:t>
       </w:r>
     </w:p>
     <w:p>
@@ -4088,23 +3756,13 @@
         </w:rPr>
         <w:t xml:space="preserve">$ </w:t>
       </w:r>
-      <w:proofErr w:type="spellStart"/>
-      <w:r>
-        <w:rPr>
-          <w:rFonts w:cstheme="minorHAnsi"/>
-          <w:sz w:val="24"/>
-          <w:szCs w:val="24"/>
-        </w:rPr>
-        <w:t>ollama</w:t>
-      </w:r>
-      <w:proofErr w:type="spellEnd"/>
-      <w:r>
-        <w:rPr>
-          <w:rFonts w:cstheme="minorHAnsi"/>
-          <w:sz w:val="24"/>
-          <w:szCs w:val="24"/>
-        </w:rPr>
-        <w:t xml:space="preserve"> pull llama3:8b-instruct-q4_0</w:t>
+      <w:r>
+        <w:rPr>
+          <w:rFonts w:cstheme="minorHAnsi"/>
+          <w:sz w:val="24"/>
+          <w:szCs w:val="24"/>
+        </w:rPr>
+        <w:t>ollama pull llama3:8b-instruct-q4_0</w:t>
       </w:r>
     </w:p>
     <w:p>
@@ -5151,7 +4809,6 @@
                 <w:szCs w:val="24"/>
               </w:rPr>
             </w:pPr>
-            <w:proofErr w:type="spellStart"/>
             <w:r>
               <w:rPr>
                 <w:rFonts w:cstheme="minorHAnsi"/>
@@ -5160,7 +4817,6 @@
               </w:rPr>
               <w:t>Chunker</w:t>
             </w:r>
-            <w:proofErr w:type="spellEnd"/>
           </w:p>
         </w:tc>
         <w:tc>
@@ -5826,25 +5482,7 @@
                 <w:sz w:val="24"/>
                 <w:szCs w:val="24"/>
               </w:rPr>
-              <w:t xml:space="preserve">Best for </w:t>
-            </w:r>
-            <w:proofErr w:type="spellStart"/>
-            <w:r>
-              <w:rPr>
-                <w:rFonts w:cstheme="minorHAnsi"/>
-                <w:sz w:val="24"/>
-                <w:szCs w:val="24"/>
-              </w:rPr>
-              <w:t>behavior</w:t>
-            </w:r>
-            <w:proofErr w:type="spellEnd"/>
-            <w:r>
-              <w:rPr>
-                <w:rFonts w:cstheme="minorHAnsi"/>
-                <w:sz w:val="24"/>
-                <w:szCs w:val="24"/>
-              </w:rPr>
-              <w:t xml:space="preserve"> change</w:t>
+              <w:t>Best for behavior change</w:t>
             </w:r>
           </w:p>
         </w:tc>
@@ -5905,25 +5543,7 @@
           <w:sz w:val="24"/>
           <w:szCs w:val="24"/>
         </w:rPr>
-        <w:t xml:space="preserve">ecause LLMs hallucinate if they were to provide answers purely on its own knowledge and LLM doesn't know our document content for giving correct answers. </w:t>
-      </w:r>
-      <w:proofErr w:type="gramStart"/>
-      <w:r>
-        <w:rPr>
-          <w:rFonts w:cstheme="minorHAnsi"/>
-          <w:sz w:val="24"/>
-          <w:szCs w:val="24"/>
-        </w:rPr>
-        <w:t>therefore</w:t>
-      </w:r>
-      <w:proofErr w:type="gramEnd"/>
-      <w:r>
-        <w:rPr>
-          <w:rFonts w:cstheme="minorHAnsi"/>
-          <w:sz w:val="24"/>
-          <w:szCs w:val="24"/>
-        </w:rPr>
-        <w:t xml:space="preserve"> it is important to get chunks from vector </w:t>
+        <w:t xml:space="preserve">ecause LLMs hallucinate if they were to provide answers purely on its own knowledge and LLM doesn't know our document content for giving correct answers. therefore it is important to get chunks from vector </w:t>
       </w:r>
       <w:r>
         <w:rPr>
@@ -6337,23 +5957,13 @@
           <w:szCs w:val="24"/>
         </w:rPr>
       </w:pPr>
-      <w:proofErr w:type="gramStart"/>
-      <w:r>
-        <w:rPr>
-          <w:rFonts w:cstheme="minorHAnsi"/>
-          <w:sz w:val="24"/>
-          <w:szCs w:val="24"/>
-        </w:rPr>
-        <w:t>So</w:t>
-      </w:r>
-      <w:proofErr w:type="gramEnd"/>
-      <w:r>
-        <w:rPr>
-          <w:rFonts w:cstheme="minorHAnsi"/>
-          <w:sz w:val="24"/>
-          <w:szCs w:val="24"/>
-        </w:rPr>
-        <w:t xml:space="preserve"> we chunk text to balance:</w:t>
+      <w:r>
+        <w:rPr>
+          <w:rFonts w:cstheme="minorHAnsi"/>
+          <w:sz w:val="24"/>
+          <w:szCs w:val="24"/>
+        </w:rPr>
+        <w:t>So we chunk text to balance:</w:t>
       </w:r>
     </w:p>
     <w:p>
@@ -6764,25 +6374,7 @@
           <w:szCs w:val="24"/>
         </w:rPr>
         <w:lastRenderedPageBreak/>
-        <w:t xml:space="preserve">We will use </w:t>
-      </w:r>
-      <w:proofErr w:type="spellStart"/>
-      <w:r>
-        <w:rPr>
-          <w:rFonts w:cstheme="minorHAnsi"/>
-          <w:sz w:val="24"/>
-          <w:szCs w:val="24"/>
-        </w:rPr>
-        <w:t>LangChain</w:t>
-      </w:r>
-      <w:proofErr w:type="spellEnd"/>
-      <w:r>
-        <w:rPr>
-          <w:rFonts w:cstheme="minorHAnsi"/>
-          <w:sz w:val="24"/>
-          <w:szCs w:val="24"/>
-        </w:rPr>
-        <w:t xml:space="preserve"> loaders for this task, because they have unified interface for PDFs, Docx, CSV. </w:t>
+        <w:t xml:space="preserve">We will use LangChain loaders for this task, because they have unified interface for PDFs, Docx, CSV. </w:t>
       </w:r>
     </w:p>
     <w:p>
@@ -6912,7 +6504,6 @@
                 <w:szCs w:val="24"/>
               </w:rPr>
             </w:pPr>
-            <w:proofErr w:type="spellStart"/>
             <w:r>
               <w:rPr>
                 <w:rFonts w:cstheme="minorHAnsi"/>
@@ -6921,7 +6512,6 @@
               </w:rPr>
               <w:t>LangChain</w:t>
             </w:r>
-            <w:proofErr w:type="spellEnd"/>
           </w:p>
         </w:tc>
         <w:tc>
@@ -7084,25 +6674,7 @@
           <w:sz w:val="24"/>
           <w:szCs w:val="24"/>
         </w:rPr>
-        <w:t xml:space="preserve">We choose </w:t>
-      </w:r>
-      <w:proofErr w:type="spellStart"/>
-      <w:r>
-        <w:rPr>
-          <w:rFonts w:cstheme="minorHAnsi"/>
-          <w:sz w:val="24"/>
-          <w:szCs w:val="24"/>
-        </w:rPr>
-        <w:t>LangChain</w:t>
-      </w:r>
-      <w:proofErr w:type="spellEnd"/>
-      <w:r>
-        <w:rPr>
-          <w:rFonts w:cstheme="minorHAnsi"/>
-          <w:sz w:val="24"/>
-          <w:szCs w:val="24"/>
-        </w:rPr>
-        <w:t>.</w:t>
+        <w:t>We choose LangChain.</w:t>
       </w:r>
     </w:p>
     <w:p>
@@ -7444,31 +7016,19 @@
         </w:rPr>
         <w:t>The </w:t>
       </w:r>
-      <w:proofErr w:type="spellStart"/>
-      <w:r>
-        <w:fldChar w:fldCharType="begin"/>
-      </w:r>
-      <w:r>
-        <w:instrText>HYPERLINK "https://docs.langchain.com/oss/python/integrations/splitters/recursive_text_splitter"</w:instrText>
-      </w:r>
-      <w:r>
-        <w:fldChar w:fldCharType="separate"/>
-      </w:r>
-      <w:r>
-        <w:rPr>
-          <w:rStyle w:val="Hyperlink"/>
-          <w:rFonts w:cstheme="minorHAnsi"/>
-          <w:b/>
-          <w:bCs/>
-          <w:sz w:val="24"/>
-          <w:szCs w:val="24"/>
-        </w:rPr>
-        <w:t>RecursiveCharacterTextSplitter</w:t>
-      </w:r>
-      <w:proofErr w:type="spellEnd"/>
-      <w:r>
-        <w:fldChar w:fldCharType="end"/>
-      </w:r>
+      <w:hyperlink r:id="rId17" w:history="1">
+        <w:r>
+          <w:rPr>
+            <w:rStyle w:val="Hyperlink"/>
+            <w:rFonts w:cstheme="minorHAnsi"/>
+            <w:b/>
+            <w:bCs/>
+            <w:sz w:val="24"/>
+            <w:szCs w:val="24"/>
+          </w:rPr>
+          <w:t>RecursiveCharacterTextSplitter</w:t>
+        </w:r>
+      </w:hyperlink>
       <w:r>
         <w:rPr>
           <w:rFonts w:cstheme="minorHAnsi"/>
@@ -7612,25 +7172,7 @@
           <w:sz w:val="24"/>
           <w:szCs w:val="24"/>
         </w:rPr>
-        <w:t xml:space="preserve">In this stage, we will convert cleaned chunks text in </w:t>
-      </w:r>
-      <w:proofErr w:type="gramStart"/>
-      <w:r>
-        <w:rPr>
-          <w:rFonts w:cstheme="minorHAnsi"/>
-          <w:sz w:val="24"/>
-          <w:szCs w:val="24"/>
-        </w:rPr>
-        <w:t>embeddings(</w:t>
-      </w:r>
-      <w:proofErr w:type="gramEnd"/>
-      <w:r>
-        <w:rPr>
-          <w:rFonts w:cstheme="minorHAnsi"/>
-          <w:sz w:val="24"/>
-          <w:szCs w:val="24"/>
-        </w:rPr>
-        <w:t>multi-dimensional space numerical data).</w:t>
+        <w:t>In this stage, we will convert cleaned chunks text in embeddings(multi-dimensional space numerical data).</w:t>
       </w:r>
     </w:p>
     <w:p>
@@ -7648,25 +7190,7 @@
           <w:sz w:val="24"/>
           <w:szCs w:val="24"/>
         </w:rPr>
-        <w:t xml:space="preserve">Right </w:t>
-      </w:r>
-      <w:proofErr w:type="gramStart"/>
-      <w:r>
-        <w:rPr>
-          <w:rFonts w:cstheme="minorHAnsi"/>
-          <w:sz w:val="24"/>
-          <w:szCs w:val="24"/>
-        </w:rPr>
-        <w:t>now</w:t>
-      </w:r>
-      <w:proofErr w:type="gramEnd"/>
-      <w:r>
-        <w:rPr>
-          <w:rFonts w:cstheme="minorHAnsi"/>
-          <w:sz w:val="24"/>
-          <w:szCs w:val="24"/>
-        </w:rPr>
-        <w:t xml:space="preserve"> </w:t>
+        <w:t xml:space="preserve">Right now </w:t>
       </w:r>
       <w:r>
         <w:rPr>
@@ -7826,23 +7350,13 @@
           <w:szCs w:val="24"/>
         </w:rPr>
       </w:pPr>
-      <w:proofErr w:type="gramStart"/>
-      <w:r>
-        <w:rPr>
-          <w:rFonts w:cstheme="minorHAnsi"/>
-          <w:sz w:val="24"/>
-          <w:szCs w:val="24"/>
-        </w:rPr>
-        <w:t>So</w:t>
-      </w:r>
-      <w:proofErr w:type="gramEnd"/>
-      <w:r>
-        <w:rPr>
-          <w:rFonts w:cstheme="minorHAnsi"/>
-          <w:sz w:val="24"/>
-          <w:szCs w:val="24"/>
-        </w:rPr>
-        <w:t xml:space="preserve"> we can find </w:t>
+      <w:r>
+        <w:rPr>
+          <w:rFonts w:cstheme="minorHAnsi"/>
+          <w:sz w:val="24"/>
+          <w:szCs w:val="24"/>
+        </w:rPr>
+        <w:t xml:space="preserve">So we can find </w:t>
       </w:r>
       <w:r>
         <w:rPr>
@@ -8179,25 +7693,7 @@
           <w:sz w:val="24"/>
           <w:szCs w:val="24"/>
         </w:rPr>
-        <w:t>entence-transformers (</w:t>
-      </w:r>
-      <w:proofErr w:type="spellStart"/>
-      <w:r>
-        <w:rPr>
-          <w:rFonts w:cstheme="minorHAnsi"/>
-          <w:sz w:val="24"/>
-          <w:szCs w:val="24"/>
-        </w:rPr>
-        <w:t>MiniLM</w:t>
-      </w:r>
-      <w:proofErr w:type="spellEnd"/>
-      <w:r>
-        <w:rPr>
-          <w:rFonts w:cstheme="minorHAnsi"/>
-          <w:sz w:val="24"/>
-          <w:szCs w:val="24"/>
-        </w:rPr>
-        <w:t xml:space="preserve"> or BGE)</w:t>
+        <w:t>entence-transformers (MiniLM or BGE)</w:t>
       </w:r>
       <w:r>
         <w:rPr>
@@ -8351,29 +7847,7 @@
           <w:sz w:val="24"/>
           <w:szCs w:val="24"/>
         </w:rPr>
-        <w:t xml:space="preserve">Why </w:t>
-      </w:r>
-      <w:proofErr w:type="spellStart"/>
-      <w:r>
-        <w:rPr>
-          <w:rFonts w:cstheme="minorHAnsi"/>
-          <w:b/>
-          <w:bCs/>
-          <w:sz w:val="24"/>
-          <w:szCs w:val="24"/>
-        </w:rPr>
-        <w:t>SentenceTransformers</w:t>
-      </w:r>
-      <w:proofErr w:type="spellEnd"/>
-      <w:r>
-        <w:rPr>
-          <w:rFonts w:cstheme="minorHAnsi"/>
-          <w:b/>
-          <w:bCs/>
-          <w:sz w:val="24"/>
-          <w:szCs w:val="24"/>
-        </w:rPr>
-        <w:t>?</w:t>
+        <w:t>Why SentenceTransformers?</w:t>
       </w:r>
     </w:p>
     <w:p>
@@ -8590,9 +8064,8 @@
           <w:szCs w:val="24"/>
           <w:u w:val="single"/>
         </w:rPr>
-        <w:t>e5-base-v</w:t>
-      </w:r>
-      <w:proofErr w:type="gramStart"/>
+        <w:t>e5-base-v2</w:t>
+      </w:r>
       <w:r>
         <w:rPr>
           <w:rFonts w:cstheme="minorHAnsi"/>
@@ -8602,30 +8075,7 @@
           <w:szCs w:val="24"/>
           <w:u w:val="single"/>
         </w:rPr>
-        <w:t>2</w:t>
-      </w:r>
-      <w:r>
-        <w:rPr>
-          <w:rFonts w:cstheme="minorHAnsi"/>
-          <w:b/>
-          <w:bCs/>
-          <w:sz w:val="24"/>
-          <w:szCs w:val="24"/>
-          <w:u w:val="single"/>
-        </w:rPr>
-        <w:t xml:space="preserve"> :</w:t>
-      </w:r>
-      <w:proofErr w:type="gramEnd"/>
-      <w:r>
-        <w:rPr>
-          <w:rFonts w:cstheme="minorHAnsi"/>
-          <w:b/>
-          <w:bCs/>
-          <w:sz w:val="24"/>
-          <w:szCs w:val="24"/>
-          <w:u w:val="single"/>
-        </w:rPr>
-        <w:t xml:space="preserve"> </w:t>
+        <w:t xml:space="preserve"> : </w:t>
       </w:r>
     </w:p>
     <w:p>
@@ -9196,25 +8646,7 @@
           <w:sz w:val="24"/>
           <w:szCs w:val="24"/>
         </w:rPr>
-        <w:t>"</w:t>
-      </w:r>
-      <w:proofErr w:type="gramStart"/>
-      <w:r>
-        <w:rPr>
-          <w:rFonts w:cstheme="minorHAnsi"/>
-          <w:sz w:val="24"/>
-          <w:szCs w:val="24"/>
-        </w:rPr>
-        <w:t>passage</w:t>
-      </w:r>
-      <w:proofErr w:type="gramEnd"/>
-      <w:r>
-        <w:rPr>
-          <w:rFonts w:cstheme="minorHAnsi"/>
-          <w:sz w:val="24"/>
-          <w:szCs w:val="24"/>
-        </w:rPr>
-        <w:t>: &lt;chunk text&gt;"</w:t>
+        <w:t>"passage: &lt;chunk text&gt;"</w:t>
       </w:r>
     </w:p>
     <w:p>
@@ -9253,25 +8685,7 @@
           <w:sz w:val="24"/>
           <w:szCs w:val="24"/>
         </w:rPr>
-        <w:t>"</w:t>
-      </w:r>
-      <w:proofErr w:type="gramStart"/>
-      <w:r>
-        <w:rPr>
-          <w:rFonts w:cstheme="minorHAnsi"/>
-          <w:sz w:val="24"/>
-          <w:szCs w:val="24"/>
-        </w:rPr>
-        <w:t>query</w:t>
-      </w:r>
-      <w:proofErr w:type="gramEnd"/>
-      <w:r>
-        <w:rPr>
-          <w:rFonts w:cstheme="minorHAnsi"/>
-          <w:sz w:val="24"/>
-          <w:szCs w:val="24"/>
-        </w:rPr>
-        <w:t>: &lt;user question&gt;"</w:t>
+        <w:t>"query: &lt;user question&gt;"</w:t>
       </w:r>
     </w:p>
     <w:p>
@@ -9576,35 +8990,7 @@
           <w:sz w:val="24"/>
           <w:szCs w:val="24"/>
         </w:rPr>
-        <w:t xml:space="preserve">Here, we chunk </w:t>
-      </w:r>
-      <w:proofErr w:type="spellStart"/>
-      <w:proofErr w:type="gramStart"/>
-      <w:r>
-        <w:rPr>
-          <w:rFonts w:cstheme="minorHAnsi"/>
-          <w:sz w:val="24"/>
-          <w:szCs w:val="24"/>
-        </w:rPr>
-        <w:t>chunk.page</w:t>
-      </w:r>
-      <w:proofErr w:type="gramEnd"/>
-      <w:r>
-        <w:rPr>
-          <w:rFonts w:cstheme="minorHAnsi"/>
-          <w:sz w:val="24"/>
-          <w:szCs w:val="24"/>
-        </w:rPr>
-        <w:t>_content</w:t>
-      </w:r>
-      <w:proofErr w:type="spellEnd"/>
-      <w:r>
-        <w:rPr>
-          <w:rFonts w:cstheme="minorHAnsi"/>
-          <w:sz w:val="24"/>
-          <w:szCs w:val="24"/>
-        </w:rPr>
-        <w:t xml:space="preserve"> not metadata. </w:t>
+        <w:t xml:space="preserve">Here, we chunk chunk.page_content not metadata. </w:t>
       </w:r>
       <w:r>
         <w:rPr>
@@ -9684,289 +9070,81 @@
           <w:szCs w:val="24"/>
         </w:rPr>
       </w:pPr>
-      <w:proofErr w:type="spellStart"/>
-      <w:r>
-        <w:rPr>
-          <w:rFonts w:cstheme="minorHAnsi"/>
-          <w:sz w:val="24"/>
-          <w:szCs w:val="24"/>
-        </w:rPr>
-        <w:t>input_texts</w:t>
-      </w:r>
-      <w:proofErr w:type="spellEnd"/>
-      <w:r>
-        <w:rPr>
-          <w:rFonts w:cstheme="minorHAnsi"/>
-          <w:sz w:val="24"/>
-          <w:szCs w:val="24"/>
-        </w:rPr>
-        <w:t xml:space="preserve"> = [</w:t>
-      </w:r>
-    </w:p>
-    <w:p>
-      <w:pPr>
-        <w:rPr>
-          <w:rFonts w:cstheme="minorHAnsi"/>
-          <w:sz w:val="24"/>
-          <w:szCs w:val="24"/>
-        </w:rPr>
-      </w:pPr>
-      <w:r>
-        <w:rPr>
-          <w:rFonts w:cstheme="minorHAnsi"/>
-          <w:sz w:val="24"/>
-          <w:szCs w:val="24"/>
-        </w:rPr>
-        <w:t>    '</w:t>
-      </w:r>
-      <w:proofErr w:type="gramStart"/>
-      <w:r>
-        <w:rPr>
-          <w:rFonts w:cstheme="minorHAnsi"/>
-          <w:sz w:val="24"/>
-          <w:szCs w:val="24"/>
-        </w:rPr>
-        <w:t>query</w:t>
-      </w:r>
-      <w:proofErr w:type="gramEnd"/>
-      <w:r>
-        <w:rPr>
-          <w:rFonts w:cstheme="minorHAnsi"/>
-          <w:sz w:val="24"/>
-          <w:szCs w:val="24"/>
-        </w:rPr>
-        <w:t>: how much protein should a female eat',</w:t>
-      </w:r>
-    </w:p>
-    <w:p>
-      <w:pPr>
-        <w:rPr>
-          <w:rFonts w:cstheme="minorHAnsi"/>
-          <w:sz w:val="24"/>
-          <w:szCs w:val="24"/>
-        </w:rPr>
-      </w:pPr>
-      <w:r>
-        <w:rPr>
-          <w:rFonts w:cstheme="minorHAnsi"/>
-          <w:sz w:val="24"/>
-          <w:szCs w:val="24"/>
-        </w:rPr>
-        <w:t>    '</w:t>
-      </w:r>
-      <w:proofErr w:type="gramStart"/>
-      <w:r>
-        <w:rPr>
-          <w:rFonts w:cstheme="minorHAnsi"/>
-          <w:sz w:val="24"/>
-          <w:szCs w:val="24"/>
-        </w:rPr>
-        <w:t>query</w:t>
-      </w:r>
-      <w:proofErr w:type="gramEnd"/>
-      <w:r>
-        <w:rPr>
-          <w:rFonts w:cstheme="minorHAnsi"/>
-          <w:sz w:val="24"/>
-          <w:szCs w:val="24"/>
-        </w:rPr>
-        <w:t>: summit define',</w:t>
-      </w:r>
-    </w:p>
-    <w:p>
-      <w:pPr>
-        <w:rPr>
-          <w:rFonts w:cstheme="minorHAnsi"/>
-          <w:sz w:val="24"/>
-          <w:szCs w:val="24"/>
-        </w:rPr>
-      </w:pPr>
-      <w:r>
-        <w:rPr>
-          <w:rFonts w:cstheme="minorHAnsi"/>
-          <w:sz w:val="24"/>
-          <w:szCs w:val="24"/>
-        </w:rPr>
-        <w:t>    "</w:t>
-      </w:r>
-      <w:proofErr w:type="gramStart"/>
-      <w:r>
-        <w:rPr>
-          <w:rFonts w:cstheme="minorHAnsi"/>
-          <w:sz w:val="24"/>
-          <w:szCs w:val="24"/>
-        </w:rPr>
-        <w:t>passage</w:t>
-      </w:r>
-      <w:proofErr w:type="gramEnd"/>
-      <w:r>
-        <w:rPr>
-          <w:rFonts w:cstheme="minorHAnsi"/>
-          <w:sz w:val="24"/>
-          <w:szCs w:val="24"/>
-        </w:rPr>
-        <w:t>: As a general guideline, the CDC's average requirement of protein for women ages 19 to 70 is 46 grams per day. But, as you can see from this chart, you'll need to increase that if you're expecting or training for a marathon. Check out the chart below to see how much protein you should be eating each day.",</w:t>
-      </w:r>
-    </w:p>
-    <w:p>
-      <w:pPr>
-        <w:rPr>
-          <w:rFonts w:cstheme="minorHAnsi"/>
-          <w:sz w:val="24"/>
-          <w:szCs w:val="24"/>
-        </w:rPr>
-      </w:pPr>
-      <w:r>
-        <w:rPr>
-          <w:rFonts w:cstheme="minorHAnsi"/>
-          <w:sz w:val="24"/>
-          <w:szCs w:val="24"/>
-        </w:rPr>
-        <w:t>    "</w:t>
-      </w:r>
-      <w:proofErr w:type="gramStart"/>
-      <w:r>
-        <w:rPr>
-          <w:rFonts w:cstheme="minorHAnsi"/>
-          <w:sz w:val="24"/>
-          <w:szCs w:val="24"/>
-        </w:rPr>
-        <w:t>passage</w:t>
-      </w:r>
-      <w:proofErr w:type="gramEnd"/>
-      <w:r>
-        <w:rPr>
-          <w:rFonts w:cstheme="minorHAnsi"/>
-          <w:sz w:val="24"/>
-          <w:szCs w:val="24"/>
-        </w:rPr>
-        <w:t>: Definition of summit for English Language Learners</w:t>
-      </w:r>
-      <w:proofErr w:type="gramStart"/>
-      <w:r>
-        <w:rPr>
-          <w:rFonts w:cstheme="minorHAnsi"/>
-          <w:sz w:val="24"/>
-          <w:szCs w:val="24"/>
-        </w:rPr>
-        <w:t>. :</w:t>
-      </w:r>
-      <w:proofErr w:type="gramEnd"/>
-      <w:r>
-        <w:rPr>
-          <w:rFonts w:cstheme="minorHAnsi"/>
-          <w:sz w:val="24"/>
-          <w:szCs w:val="24"/>
-        </w:rPr>
-        <w:t xml:space="preserve"> </w:t>
-      </w:r>
-      <w:proofErr w:type="gramStart"/>
-      <w:r>
-        <w:rPr>
-          <w:rFonts w:cstheme="minorHAnsi"/>
-          <w:sz w:val="24"/>
-          <w:szCs w:val="24"/>
-        </w:rPr>
-        <w:t>1  the</w:t>
-      </w:r>
-      <w:proofErr w:type="gramEnd"/>
-      <w:r>
-        <w:rPr>
-          <w:rFonts w:cstheme="minorHAnsi"/>
-          <w:sz w:val="24"/>
-          <w:szCs w:val="24"/>
-        </w:rPr>
-        <w:t xml:space="preserve"> highest point of a </w:t>
-      </w:r>
-      <w:proofErr w:type="gramStart"/>
-      <w:r>
-        <w:rPr>
-          <w:rFonts w:cstheme="minorHAnsi"/>
-          <w:sz w:val="24"/>
-          <w:szCs w:val="24"/>
-        </w:rPr>
-        <w:t>mountain :</w:t>
-      </w:r>
-      <w:proofErr w:type="gramEnd"/>
-      <w:r>
-        <w:rPr>
-          <w:rFonts w:cstheme="minorHAnsi"/>
-          <w:sz w:val="24"/>
-          <w:szCs w:val="24"/>
-        </w:rPr>
-        <w:t xml:space="preserve"> the top of a mountain</w:t>
-      </w:r>
-      <w:proofErr w:type="gramStart"/>
-      <w:r>
-        <w:rPr>
-          <w:rFonts w:cstheme="minorHAnsi"/>
-          <w:sz w:val="24"/>
-          <w:szCs w:val="24"/>
-        </w:rPr>
-        <w:t>. :</w:t>
-      </w:r>
-      <w:proofErr w:type="gramEnd"/>
-      <w:r>
-        <w:rPr>
-          <w:rFonts w:cstheme="minorHAnsi"/>
-          <w:sz w:val="24"/>
-          <w:szCs w:val="24"/>
-        </w:rPr>
-        <w:t xml:space="preserve"> </w:t>
-      </w:r>
-      <w:proofErr w:type="gramStart"/>
-      <w:r>
-        <w:rPr>
-          <w:rFonts w:cstheme="minorHAnsi"/>
-          <w:sz w:val="24"/>
-          <w:szCs w:val="24"/>
-        </w:rPr>
-        <w:t>2  the</w:t>
-      </w:r>
-      <w:proofErr w:type="gramEnd"/>
-      <w:r>
-        <w:rPr>
-          <w:rFonts w:cstheme="minorHAnsi"/>
-          <w:sz w:val="24"/>
-          <w:szCs w:val="24"/>
-        </w:rPr>
-        <w:t xml:space="preserve"> highest level</w:t>
-      </w:r>
-      <w:proofErr w:type="gramStart"/>
-      <w:r>
-        <w:rPr>
-          <w:rFonts w:cstheme="minorHAnsi"/>
-          <w:sz w:val="24"/>
-          <w:szCs w:val="24"/>
-        </w:rPr>
-        <w:t>. :</w:t>
-      </w:r>
-      <w:proofErr w:type="gramEnd"/>
-      <w:r>
-        <w:rPr>
-          <w:rFonts w:cstheme="minorHAnsi"/>
-          <w:sz w:val="24"/>
-          <w:szCs w:val="24"/>
-        </w:rPr>
-        <w:t xml:space="preserve"> </w:t>
-      </w:r>
-      <w:proofErr w:type="gramStart"/>
-      <w:r>
-        <w:rPr>
-          <w:rFonts w:cstheme="minorHAnsi"/>
-          <w:sz w:val="24"/>
-          <w:szCs w:val="24"/>
-        </w:rPr>
-        <w:t>3  a</w:t>
-      </w:r>
-      <w:proofErr w:type="gramEnd"/>
-      <w:r>
-        <w:rPr>
-          <w:rFonts w:cstheme="minorHAnsi"/>
-          <w:sz w:val="24"/>
-          <w:szCs w:val="24"/>
-        </w:rPr>
-        <w:t xml:space="preserve"> meeting or series of meetings between the leaders of two or more governments."</w:t>
+      <w:r>
+        <w:rPr>
+          <w:rFonts w:cstheme="minorHAnsi"/>
+          <w:sz w:val="24"/>
+          <w:szCs w:val="24"/>
+        </w:rPr>
+        <w:t>input_texts = [</w:t>
+      </w:r>
+    </w:p>
+    <w:p>
+      <w:pPr>
+        <w:rPr>
+          <w:rFonts w:cstheme="minorHAnsi"/>
+          <w:sz w:val="24"/>
+          <w:szCs w:val="24"/>
+        </w:rPr>
+      </w:pPr>
+      <w:r>
+        <w:rPr>
+          <w:rFonts w:cstheme="minorHAnsi"/>
+          <w:sz w:val="24"/>
+          <w:szCs w:val="24"/>
+        </w:rPr>
+        <w:t>    'query: how much protein should a female eat',</w:t>
+      </w:r>
+    </w:p>
+    <w:p>
+      <w:pPr>
+        <w:rPr>
+          <w:rFonts w:cstheme="minorHAnsi"/>
+          <w:sz w:val="24"/>
+          <w:szCs w:val="24"/>
+        </w:rPr>
+      </w:pPr>
+      <w:r>
+        <w:rPr>
+          <w:rFonts w:cstheme="minorHAnsi"/>
+          <w:sz w:val="24"/>
+          <w:szCs w:val="24"/>
+        </w:rPr>
+        <w:t>    'query: summit define',</w:t>
+      </w:r>
+    </w:p>
+    <w:p>
+      <w:pPr>
+        <w:rPr>
+          <w:rFonts w:cstheme="minorHAnsi"/>
+          <w:sz w:val="24"/>
+          <w:szCs w:val="24"/>
+        </w:rPr>
+      </w:pPr>
+      <w:r>
+        <w:rPr>
+          <w:rFonts w:cstheme="minorHAnsi"/>
+          <w:sz w:val="24"/>
+          <w:szCs w:val="24"/>
+        </w:rPr>
+        <w:t>    "passage: As a general guideline, the CDC's average requirement of protein for women ages 19 to 70 is 46 grams per day. But, as you can see from this chart, you'll need to increase that if you're expecting or training for a marathon. Check out the chart below to see how much protein you should be eating each day.",</w:t>
+      </w:r>
+    </w:p>
+    <w:p>
+      <w:pPr>
+        <w:rPr>
+          <w:rFonts w:cstheme="minorHAnsi"/>
+          <w:sz w:val="24"/>
+          <w:szCs w:val="24"/>
+        </w:rPr>
+      </w:pPr>
+      <w:r>
+        <w:rPr>
+          <w:rFonts w:cstheme="minorHAnsi"/>
+          <w:sz w:val="24"/>
+          <w:szCs w:val="24"/>
+        </w:rPr>
+        <w:t>    "passage: Definition of summit for English Language Learners. : 1  the highest point of a mountain : the top of a mountain. : 2  the highest level. : 3  a meeting or series of meetings between the leaders of two or more governments."</w:t>
       </w:r>
     </w:p>
     <w:p>
@@ -10010,25 +9188,7 @@
           <w:sz w:val="24"/>
           <w:szCs w:val="24"/>
         </w:rPr>
-        <w:t xml:space="preserve">But we will keep all chunks passages in </w:t>
-      </w:r>
-      <w:proofErr w:type="spellStart"/>
-      <w:r>
-        <w:rPr>
-          <w:rFonts w:cstheme="minorHAnsi"/>
-          <w:sz w:val="24"/>
-          <w:szCs w:val="24"/>
-        </w:rPr>
-        <w:t>input_texts</w:t>
-      </w:r>
-      <w:proofErr w:type="spellEnd"/>
-      <w:r>
-        <w:rPr>
-          <w:rFonts w:cstheme="minorHAnsi"/>
-          <w:sz w:val="24"/>
-          <w:szCs w:val="24"/>
-        </w:rPr>
-        <w:t>.</w:t>
+        <w:t>But we will keep all chunks passages in input_texts.</w:t>
       </w:r>
     </w:p>
     <w:p>
@@ -10066,36 +9226,17 @@
           <w:sz w:val="24"/>
           <w:szCs w:val="24"/>
         </w:rPr>
-        <w:t>Once we get embedding vector of shape (</w:t>
-      </w:r>
-      <w:proofErr w:type="spellStart"/>
-      <w:r>
-        <w:rPr>
-          <w:rFonts w:cstheme="minorHAnsi"/>
-          <w:sz w:val="24"/>
-          <w:szCs w:val="24"/>
-        </w:rPr>
-        <w:t>no_of_chunks</w:t>
-      </w:r>
-      <w:proofErr w:type="spellEnd"/>
-      <w:r>
-        <w:rPr>
-          <w:rFonts w:cstheme="minorHAnsi"/>
-          <w:sz w:val="24"/>
-          <w:szCs w:val="24"/>
-        </w:rPr>
-        <w:t>, 768), we will not modify original chunks. We will keep them as it is and maintain this embedding vector separately for cosine similarity score calculation.</w:t>
-      </w:r>
-    </w:p>
-    <w:p>
-      <w:pPr>
-        <w:rPr>
-          <w:rFonts w:cstheme="minorHAnsi"/>
-          <w:sz w:val="24"/>
-          <w:szCs w:val="24"/>
-        </w:rPr>
-      </w:pPr>
-      <w:proofErr w:type="spellStart"/>
+        <w:t>Once we get embedding vector of shape (no_of_chunks, 768), we will not modify original chunks. We will keep them as it is and maintain this embedding vector separately for cosine similarity score calculation.</w:t>
+      </w:r>
+    </w:p>
+    <w:p>
+      <w:pPr>
+        <w:rPr>
+          <w:rFonts w:cstheme="minorHAnsi"/>
+          <w:sz w:val="24"/>
+          <w:szCs w:val="24"/>
+        </w:rPr>
+      </w:pPr>
       <w:r>
         <w:rPr>
           <w:rFonts w:cstheme="minorHAnsi"/>
@@ -10104,7 +9245,6 @@
         </w:rPr>
         <w:t>text_chunks</w:t>
       </w:r>
-      <w:proofErr w:type="spellEnd"/>
       <w:r>
         <w:rPr>
           <w:rFonts w:cstheme="minorHAnsi"/>
@@ -10128,25 +9268,7 @@
           <w:sz w:val="24"/>
           <w:szCs w:val="24"/>
         </w:rPr>
-        <w:t>embeddings -&gt; array of embeddings generated by sentence transformer with shape (</w:t>
-      </w:r>
-      <w:proofErr w:type="spellStart"/>
-      <w:r>
-        <w:rPr>
-          <w:rFonts w:cstheme="minorHAnsi"/>
-          <w:sz w:val="24"/>
-          <w:szCs w:val="24"/>
-        </w:rPr>
-        <w:t>no_of_chunks</w:t>
-      </w:r>
-      <w:proofErr w:type="spellEnd"/>
-      <w:r>
-        <w:rPr>
-          <w:rFonts w:cstheme="minorHAnsi"/>
-          <w:sz w:val="24"/>
-          <w:szCs w:val="24"/>
-        </w:rPr>
-        <w:t>, 768).</w:t>
+        <w:t>embeddings -&gt; array of embeddings generated by sentence transformer with shape (no_of_chunks, 768).</w:t>
       </w:r>
     </w:p>
     <w:p>
@@ -10200,107 +9322,31 @@
           <w:szCs w:val="24"/>
         </w:rPr>
       </w:pPr>
-      <w:proofErr w:type="spellStart"/>
-      <w:r>
-        <w:rPr>
-          <w:rFonts w:cstheme="minorHAnsi"/>
-          <w:sz w:val="24"/>
-          <w:szCs w:val="24"/>
-        </w:rPr>
-        <w:t>q_emb</w:t>
-      </w:r>
-      <w:proofErr w:type="spellEnd"/>
-      <w:r>
-        <w:rPr>
-          <w:rFonts w:cstheme="minorHAnsi"/>
-          <w:sz w:val="24"/>
-          <w:szCs w:val="24"/>
-        </w:rPr>
-        <w:t xml:space="preserve"> = </w:t>
-      </w:r>
-      <w:proofErr w:type="spellStart"/>
-      <w:r>
-        <w:rPr>
-          <w:rFonts w:cstheme="minorHAnsi"/>
-          <w:sz w:val="24"/>
-          <w:szCs w:val="24"/>
-        </w:rPr>
-        <w:t>embedding_</w:t>
-      </w:r>
-      <w:proofErr w:type="gramStart"/>
-      <w:r>
-        <w:rPr>
-          <w:rFonts w:cstheme="minorHAnsi"/>
-          <w:sz w:val="24"/>
-          <w:szCs w:val="24"/>
-        </w:rPr>
-        <w:t>model.encode</w:t>
-      </w:r>
-      <w:proofErr w:type="spellEnd"/>
-      <w:proofErr w:type="gramEnd"/>
-      <w:r>
-        <w:rPr>
-          <w:rFonts w:cstheme="minorHAnsi"/>
-          <w:sz w:val="24"/>
-          <w:szCs w:val="24"/>
-        </w:rPr>
-        <w:t xml:space="preserve">(query, </w:t>
-      </w:r>
-      <w:proofErr w:type="spellStart"/>
-      <w:r>
-        <w:rPr>
-          <w:rFonts w:cstheme="minorHAnsi"/>
-          <w:sz w:val="24"/>
-          <w:szCs w:val="24"/>
-        </w:rPr>
-        <w:t>normalize_embeddings</w:t>
-      </w:r>
-      <w:proofErr w:type="spellEnd"/>
-      <w:r>
-        <w:rPr>
-          <w:rFonts w:cstheme="minorHAnsi"/>
-          <w:sz w:val="24"/>
-          <w:szCs w:val="24"/>
-        </w:rPr>
-        <w:t>=True)  </w:t>
-      </w:r>
-    </w:p>
-    <w:p>
-      <w:pPr>
-        <w:rPr>
-          <w:rFonts w:cstheme="minorHAnsi"/>
-          <w:sz w:val="24"/>
-          <w:szCs w:val="24"/>
-        </w:rPr>
-      </w:pPr>
-      <w:r>
-        <w:rPr>
-          <w:rFonts w:cstheme="minorHAnsi"/>
-          <w:sz w:val="24"/>
-          <w:szCs w:val="24"/>
-        </w:rPr>
-        <w:t xml:space="preserve">scores = embeddings @ </w:t>
-      </w:r>
-      <w:proofErr w:type="spellStart"/>
-      <w:r>
-        <w:rPr>
-          <w:rFonts w:cstheme="minorHAnsi"/>
-          <w:sz w:val="24"/>
-          <w:szCs w:val="24"/>
-        </w:rPr>
-        <w:t>q_</w:t>
-      </w:r>
-      <w:proofErr w:type="gramStart"/>
-      <w:r>
-        <w:rPr>
-          <w:rFonts w:cstheme="minorHAnsi"/>
-          <w:sz w:val="24"/>
-          <w:szCs w:val="24"/>
-        </w:rPr>
-        <w:t>emb.T</w:t>
-      </w:r>
-      <w:proofErr w:type="spellEnd"/>
-      <w:proofErr w:type="gramEnd"/>
+      <w:r>
+        <w:rPr>
+          <w:rFonts w:cstheme="minorHAnsi"/>
+          <w:sz w:val="24"/>
+          <w:szCs w:val="24"/>
+        </w:rPr>
+        <w:t>q_emb = embedding_model.encode(query, normalize_embeddings=True)  </w:t>
+      </w:r>
+    </w:p>
+    <w:p>
+      <w:pPr>
+        <w:rPr>
+          <w:rFonts w:cstheme="minorHAnsi"/>
+          <w:sz w:val="24"/>
+          <w:szCs w:val="24"/>
+        </w:rPr>
+      </w:pPr>
+      <w:r>
+        <w:rPr>
+          <w:rFonts w:cstheme="minorHAnsi"/>
+          <w:sz w:val="24"/>
+          <w:szCs w:val="24"/>
+        </w:rPr>
+        <w:t>scores = embeddings @ q_emb.T</w:t>
+      </w:r>
     </w:p>
     <w:p>
       <w:pPr>
@@ -10327,221 +9373,73 @@
           <w:szCs w:val="24"/>
         </w:rPr>
       </w:pPr>
-      <w:proofErr w:type="spellStart"/>
-      <w:r>
-        <w:rPr>
-          <w:rFonts w:cstheme="minorHAnsi"/>
-          <w:sz w:val="24"/>
-          <w:szCs w:val="24"/>
-        </w:rPr>
-        <w:t>top_k</w:t>
-      </w:r>
-      <w:proofErr w:type="spellEnd"/>
-      <w:r>
-        <w:rPr>
-          <w:rFonts w:cstheme="minorHAnsi"/>
-          <w:sz w:val="24"/>
-          <w:szCs w:val="24"/>
-        </w:rPr>
-        <w:t xml:space="preserve"> = </w:t>
-      </w:r>
-      <w:proofErr w:type="spellStart"/>
-      <w:proofErr w:type="gramStart"/>
-      <w:r>
-        <w:rPr>
-          <w:rFonts w:cstheme="minorHAnsi"/>
-          <w:sz w:val="24"/>
-          <w:szCs w:val="24"/>
-        </w:rPr>
-        <w:t>scores.squeeze</w:t>
-      </w:r>
-      <w:proofErr w:type="spellEnd"/>
-      <w:proofErr w:type="gramEnd"/>
-      <w:r>
-        <w:rPr>
-          <w:rFonts w:cstheme="minorHAnsi"/>
-          <w:sz w:val="24"/>
-          <w:szCs w:val="24"/>
-        </w:rPr>
-        <w:t>(</w:t>
-      </w:r>
-      <w:proofErr w:type="gramStart"/>
-      <w:r>
-        <w:rPr>
-          <w:rFonts w:cstheme="minorHAnsi"/>
-          <w:sz w:val="24"/>
-          <w:szCs w:val="24"/>
-        </w:rPr>
-        <w:t>).</w:t>
-      </w:r>
-      <w:proofErr w:type="spellStart"/>
-      <w:r>
-        <w:rPr>
-          <w:rFonts w:cstheme="minorHAnsi"/>
-          <w:sz w:val="24"/>
-          <w:szCs w:val="24"/>
-        </w:rPr>
-        <w:t>argsort</w:t>
-      </w:r>
-      <w:proofErr w:type="spellEnd"/>
-      <w:r>
-        <w:rPr>
-          <w:rFonts w:cstheme="minorHAnsi"/>
-          <w:sz w:val="24"/>
-          <w:szCs w:val="24"/>
-        </w:rPr>
-        <w:t>()[::</w:t>
-      </w:r>
-      <w:proofErr w:type="gramEnd"/>
-      <w:r>
-        <w:rPr>
-          <w:rFonts w:cstheme="minorHAnsi"/>
-          <w:sz w:val="24"/>
-          <w:szCs w:val="24"/>
-        </w:rPr>
-        <w:t>-</w:t>
-      </w:r>
-      <w:proofErr w:type="gramStart"/>
-      <w:r>
-        <w:rPr>
-          <w:rFonts w:cstheme="minorHAnsi"/>
-          <w:sz w:val="24"/>
-          <w:szCs w:val="24"/>
-        </w:rPr>
-        <w:t>1][</w:t>
-      </w:r>
-      <w:proofErr w:type="gramEnd"/>
-      <w:r>
-        <w:rPr>
-          <w:rFonts w:cstheme="minorHAnsi"/>
-          <w:sz w:val="24"/>
-          <w:szCs w:val="24"/>
-        </w:rPr>
-        <w:t>:5]</w:t>
-      </w:r>
-    </w:p>
-    <w:p>
-      <w:pPr>
-        <w:rPr>
-          <w:rFonts w:cstheme="minorHAnsi"/>
-          <w:sz w:val="24"/>
-          <w:szCs w:val="24"/>
-        </w:rPr>
-      </w:pPr>
-      <w:r>
-        <w:rPr>
-          <w:rFonts w:cstheme="minorHAnsi"/>
-          <w:sz w:val="24"/>
-          <w:szCs w:val="24"/>
-        </w:rPr>
-        <w:t>print(</w:t>
-      </w:r>
-      <w:proofErr w:type="spellStart"/>
-      <w:r>
-        <w:rPr>
-          <w:rFonts w:cstheme="minorHAnsi"/>
-          <w:sz w:val="24"/>
-          <w:szCs w:val="24"/>
-        </w:rPr>
-        <w:t>top_k</w:t>
-      </w:r>
-      <w:proofErr w:type="spellEnd"/>
-      <w:r>
-        <w:rPr>
-          <w:rFonts w:cstheme="minorHAnsi"/>
-          <w:sz w:val="24"/>
-          <w:szCs w:val="24"/>
-        </w:rPr>
-        <w:t>)</w:t>
-      </w:r>
-    </w:p>
-    <w:p>
-      <w:pPr>
-        <w:rPr>
-          <w:rFonts w:cstheme="minorHAnsi"/>
-          <w:sz w:val="24"/>
-          <w:szCs w:val="24"/>
-        </w:rPr>
-      </w:pPr>
-    </w:p>
-    <w:p>
-      <w:pPr>
-        <w:rPr>
-          <w:rFonts w:cstheme="minorHAnsi"/>
-          <w:sz w:val="24"/>
-          <w:szCs w:val="24"/>
-        </w:rPr>
-      </w:pPr>
-      <w:proofErr w:type="spellStart"/>
-      <w:r>
-        <w:rPr>
-          <w:rFonts w:cstheme="minorHAnsi"/>
-          <w:sz w:val="24"/>
-          <w:szCs w:val="24"/>
-        </w:rPr>
-        <w:t>for k</w:t>
-      </w:r>
-      <w:proofErr w:type="spellEnd"/>
-      <w:r>
-        <w:rPr>
-          <w:rFonts w:cstheme="minorHAnsi"/>
-          <w:sz w:val="24"/>
-          <w:szCs w:val="24"/>
-        </w:rPr>
-        <w:t xml:space="preserve"> in </w:t>
-      </w:r>
-      <w:proofErr w:type="spellStart"/>
-      <w:r>
-        <w:rPr>
-          <w:rFonts w:cstheme="minorHAnsi"/>
-          <w:sz w:val="24"/>
-          <w:szCs w:val="24"/>
-        </w:rPr>
-        <w:t>top_k</w:t>
-      </w:r>
-      <w:proofErr w:type="spellEnd"/>
-      <w:r>
-        <w:rPr>
-          <w:rFonts w:cstheme="minorHAnsi"/>
-          <w:sz w:val="24"/>
-          <w:szCs w:val="24"/>
-        </w:rPr>
-        <w:t>:</w:t>
-      </w:r>
-    </w:p>
-    <w:p>
-      <w:pPr>
-        <w:rPr>
-          <w:rFonts w:cstheme="minorHAnsi"/>
-          <w:sz w:val="24"/>
-          <w:szCs w:val="24"/>
-        </w:rPr>
-      </w:pPr>
-      <w:r>
-        <w:rPr>
-          <w:rFonts w:cstheme="minorHAnsi"/>
-          <w:sz w:val="24"/>
-          <w:szCs w:val="24"/>
-        </w:rPr>
-        <w:t>    print(</w:t>
-      </w:r>
-      <w:proofErr w:type="spellStart"/>
-      <w:r>
-        <w:rPr>
-          <w:rFonts w:cstheme="minorHAnsi"/>
-          <w:sz w:val="24"/>
-          <w:szCs w:val="24"/>
-        </w:rPr>
-        <w:t>text_chunks</w:t>
-      </w:r>
-      <w:proofErr w:type="spellEnd"/>
-      <w:r>
-        <w:rPr>
-          <w:rFonts w:cstheme="minorHAnsi"/>
-          <w:sz w:val="24"/>
-          <w:szCs w:val="24"/>
-        </w:rPr>
-        <w:t>[k])</w:t>
+      <w:r>
+        <w:rPr>
+          <w:rFonts w:cstheme="minorHAnsi"/>
+          <w:sz w:val="24"/>
+          <w:szCs w:val="24"/>
+        </w:rPr>
+        <w:t>top_k = scores.squeeze().argsort()[::-1][:5]</w:t>
+      </w:r>
+    </w:p>
+    <w:p>
+      <w:pPr>
+        <w:rPr>
+          <w:rFonts w:cstheme="minorHAnsi"/>
+          <w:sz w:val="24"/>
+          <w:szCs w:val="24"/>
+        </w:rPr>
+      </w:pPr>
+      <w:r>
+        <w:rPr>
+          <w:rFonts w:cstheme="minorHAnsi"/>
+          <w:sz w:val="24"/>
+          <w:szCs w:val="24"/>
+        </w:rPr>
+        <w:t>print(top_k)</w:t>
+      </w:r>
+    </w:p>
+    <w:p>
+      <w:pPr>
+        <w:rPr>
+          <w:rFonts w:cstheme="minorHAnsi"/>
+          <w:sz w:val="24"/>
+          <w:szCs w:val="24"/>
+        </w:rPr>
+      </w:pPr>
+    </w:p>
+    <w:p>
+      <w:pPr>
+        <w:rPr>
+          <w:rFonts w:cstheme="minorHAnsi"/>
+          <w:sz w:val="24"/>
+          <w:szCs w:val="24"/>
+        </w:rPr>
+      </w:pPr>
+      <w:r>
+        <w:rPr>
+          <w:rFonts w:cstheme="minorHAnsi"/>
+          <w:sz w:val="24"/>
+          <w:szCs w:val="24"/>
+        </w:rPr>
+        <w:t>for k in top_k:</w:t>
+      </w:r>
+    </w:p>
+    <w:p>
+      <w:pPr>
+        <w:rPr>
+          <w:rFonts w:cstheme="minorHAnsi"/>
+          <w:sz w:val="24"/>
+          <w:szCs w:val="24"/>
+        </w:rPr>
+      </w:pPr>
+      <w:r>
+        <w:rPr>
+          <w:rFonts w:cstheme="minorHAnsi"/>
+          <w:sz w:val="24"/>
+          <w:szCs w:val="24"/>
+        </w:rPr>
+        <w:t>    print(text_chunks[k])</w:t>
       </w:r>
     </w:p>
     <w:p>
@@ -10615,7 +9513,6 @@
         </w:rPr>
         <w:t>In FAISS indexes, we will use ‘</w:t>
       </w:r>
-      <w:proofErr w:type="spellStart"/>
       <w:r>
         <w:rPr>
           <w:rFonts w:cstheme="minorHAnsi"/>
@@ -10624,7 +9521,6 @@
         </w:rPr>
         <w:t>IndexFlatIP</w:t>
       </w:r>
-      <w:proofErr w:type="spellEnd"/>
       <w:r>
         <w:rPr>
           <w:rFonts w:cstheme="minorHAnsi"/>
@@ -10657,25 +9553,7 @@
           <w:sz w:val="24"/>
           <w:szCs w:val="24"/>
         </w:rPr>
-        <w:t xml:space="preserve">Because we already have normalized embeddings, simply finding dot product with embeddings in FAISS, will return cosine similarity. We are using Flat indexing because it is accurate and reasonably fast for data size&lt;=1 </w:t>
-      </w:r>
-      <w:proofErr w:type="gramStart"/>
-      <w:r>
-        <w:rPr>
-          <w:rFonts w:cstheme="minorHAnsi"/>
-          <w:sz w:val="24"/>
-          <w:szCs w:val="24"/>
-        </w:rPr>
-        <w:t>Million</w:t>
-      </w:r>
-      <w:proofErr w:type="gramEnd"/>
-      <w:r>
-        <w:rPr>
-          <w:rFonts w:cstheme="minorHAnsi"/>
-          <w:sz w:val="24"/>
-          <w:szCs w:val="24"/>
-        </w:rPr>
-        <w:t>. Since we have small dataset Flat index will product fast results.</w:t>
+        <w:t>Because we already have normalized embeddings, simply finding dot product with embeddings in FAISS, will return cosine similarity. We are using Flat indexing because it is accurate and reasonably fast for data size&lt;=1 Million. Since we have small dataset Flat index will product fast results.</w:t>
       </w:r>
     </w:p>
     <w:p>
@@ -10693,27 +9571,7 @@
           <w:sz w:val="24"/>
           <w:szCs w:val="24"/>
         </w:rPr>
-        <w:t xml:space="preserve">FAISS accepts float32 embeddings. Check the datatype using </w:t>
-      </w:r>
-      <w:proofErr w:type="spellStart"/>
-      <w:proofErr w:type="gramStart"/>
-      <w:r>
-        <w:rPr>
-          <w:rFonts w:cstheme="minorHAnsi"/>
-          <w:sz w:val="24"/>
-          <w:szCs w:val="24"/>
-        </w:rPr>
-        <w:t>embeddings.dtype</w:t>
-      </w:r>
-      <w:proofErr w:type="spellEnd"/>
-      <w:proofErr w:type="gramEnd"/>
-      <w:r>
-        <w:rPr>
-          <w:rFonts w:cstheme="minorHAnsi"/>
-          <w:sz w:val="24"/>
-          <w:szCs w:val="24"/>
-        </w:rPr>
-        <w:t xml:space="preserve"> before adding them to database.</w:t>
+        <w:t>FAISS accepts float32 embeddings. Check the datatype using embeddings.dtype before adding them to database.</w:t>
       </w:r>
     </w:p>
     <w:p>
@@ -10879,18 +9737,8 @@
           <w:sz w:val="24"/>
           <w:szCs w:val="24"/>
         </w:rPr>
-        <w:t xml:space="preserve">same </w:t>
-      </w:r>
-      <w:proofErr w:type="spellStart"/>
-      <w:r>
-        <w:rPr>
-          <w:rFonts w:cstheme="minorHAnsi"/>
-          <w:sz w:val="24"/>
-          <w:szCs w:val="24"/>
-        </w:rPr>
-        <w:t>dtype</w:t>
-      </w:r>
-      <w:proofErr w:type="spellEnd"/>
+        <w:t>same dtype</w:t>
+      </w:r>
     </w:p>
     <w:p>
       <w:pPr>
@@ -11994,61 +10842,33 @@
           <w:sz w:val="24"/>
           <w:szCs w:val="24"/>
         </w:rPr>
-        <w:t xml:space="preserve">Note: after this stage, LLM will get data in following </w:t>
-      </w:r>
-      <w:proofErr w:type="gramStart"/>
-      <w:r>
-        <w:rPr>
-          <w:rFonts w:cstheme="minorHAnsi"/>
-          <w:sz w:val="24"/>
-          <w:szCs w:val="24"/>
-        </w:rPr>
-        <w:t>format(</w:t>
-      </w:r>
-      <w:proofErr w:type="gramEnd"/>
-      <w:r>
-        <w:rPr>
-          <w:rFonts w:cstheme="minorHAnsi"/>
-          <w:sz w:val="24"/>
-          <w:szCs w:val="24"/>
-        </w:rPr>
-        <w:t>removing any unnecessary metadata).</w:t>
-      </w:r>
-    </w:p>
-    <w:p>
-      <w:pPr>
-        <w:rPr>
-          <w:rFonts w:cstheme="minorHAnsi"/>
-          <w:sz w:val="24"/>
-          <w:szCs w:val="24"/>
-        </w:rPr>
-      </w:pPr>
-    </w:p>
-    <w:p>
-      <w:pPr>
-        <w:rPr>
-          <w:rFonts w:cstheme="minorHAnsi"/>
-          <w:sz w:val="24"/>
-          <w:szCs w:val="24"/>
-        </w:rPr>
-      </w:pPr>
-      <w:proofErr w:type="spellStart"/>
-      <w:r>
-        <w:rPr>
-          <w:rFonts w:cstheme="minorHAnsi"/>
-          <w:sz w:val="24"/>
-          <w:szCs w:val="24"/>
-        </w:rPr>
-        <w:t>Eg.</w:t>
-      </w:r>
-      <w:proofErr w:type="spellEnd"/>
-      <w:r>
-        <w:rPr>
-          <w:rFonts w:cstheme="minorHAnsi"/>
-          <w:sz w:val="24"/>
-          <w:szCs w:val="24"/>
-        </w:rPr>
-        <w:t xml:space="preserve"> </w:t>
+        <w:t>Note: after this stage, LLM will get data in following format(removing any unnecessary metadata).</w:t>
+      </w:r>
+    </w:p>
+    <w:p>
+      <w:pPr>
+        <w:rPr>
+          <w:rFonts w:cstheme="minorHAnsi"/>
+          <w:sz w:val="24"/>
+          <w:szCs w:val="24"/>
+        </w:rPr>
+      </w:pPr>
+    </w:p>
+    <w:p>
+      <w:pPr>
+        <w:rPr>
+          <w:rFonts w:cstheme="minorHAnsi"/>
+          <w:sz w:val="24"/>
+          <w:szCs w:val="24"/>
+        </w:rPr>
+      </w:pPr>
+      <w:r>
+        <w:rPr>
+          <w:rFonts w:cstheme="minorHAnsi"/>
+          <w:sz w:val="24"/>
+          <w:szCs w:val="24"/>
+        </w:rPr>
+        <w:t xml:space="preserve">Eg. </w:t>
       </w:r>
     </w:p>
     <w:p>
@@ -12082,43 +10902,7 @@
           <w:sz w:val="24"/>
           <w:szCs w:val="24"/>
         </w:rPr>
-        <w:t xml:space="preserve">[source: {chunk['source']} | title: {chunk['title']} | page: {chunk['page']} | </w:t>
-      </w:r>
-      <w:proofErr w:type="spellStart"/>
-      <w:r>
-        <w:rPr>
-          <w:rFonts w:cstheme="minorHAnsi"/>
-          <w:sz w:val="24"/>
-          <w:szCs w:val="24"/>
-        </w:rPr>
-        <w:t>similarity_score</w:t>
-      </w:r>
-      <w:proofErr w:type="spellEnd"/>
-      <w:r>
-        <w:rPr>
-          <w:rFonts w:cstheme="minorHAnsi"/>
-          <w:sz w:val="24"/>
-          <w:szCs w:val="24"/>
-        </w:rPr>
-        <w:t>: {chunk['</w:t>
-      </w:r>
-      <w:proofErr w:type="spellStart"/>
-      <w:r>
-        <w:rPr>
-          <w:rFonts w:cstheme="minorHAnsi"/>
-          <w:sz w:val="24"/>
-          <w:szCs w:val="24"/>
-        </w:rPr>
-        <w:t>similarity_score</w:t>
-      </w:r>
-      <w:proofErr w:type="spellEnd"/>
-      <w:r>
-        <w:rPr>
-          <w:rFonts w:cstheme="minorHAnsi"/>
-          <w:sz w:val="24"/>
-          <w:szCs w:val="24"/>
-        </w:rPr>
-        <w:t>']}]</w:t>
+        <w:t>[source: {chunk['source']} | title: {chunk['title']} | page: {chunk['page']} | similarity_score: {chunk['similarity_score']}]</w:t>
       </w:r>
     </w:p>
     <w:p>
@@ -12237,7 +11021,7 @@
                     <pic:cNvPicPr/>
                   </pic:nvPicPr>
                   <pic:blipFill>
-                    <a:blip r:embed="rId17"/>
+                    <a:blip r:embed="rId18"/>
                     <a:stretch>
                       <a:fillRect/>
                     </a:stretch>
@@ -13286,7 +12070,6 @@
         </w:rPr>
         <w:t xml:space="preserve"> </w:t>
       </w:r>
-      <w:proofErr w:type="gramStart"/>
       <w:r>
         <w:rPr>
           <w:rFonts w:cstheme="minorHAnsi"/>
@@ -13295,18 +12078,7 @@
           <w:sz w:val="24"/>
           <w:szCs w:val="24"/>
         </w:rPr>
-        <w:t>Multi-chunk</w:t>
-      </w:r>
-      <w:proofErr w:type="gramEnd"/>
-      <w:r>
-        <w:rPr>
-          <w:rFonts w:cstheme="minorHAnsi"/>
-          <w:b/>
-          <w:bCs/>
-          <w:sz w:val="24"/>
-          <w:szCs w:val="24"/>
-        </w:rPr>
-        <w:t xml:space="preserve"> synthesis is expected</w:t>
+        <w:t>Multi-chunk synthesis is expected</w:t>
       </w:r>
     </w:p>
     <w:p>
@@ -13420,25 +12192,7 @@
           <w:sz w:val="24"/>
           <w:szCs w:val="24"/>
         </w:rPr>
-        <w:t>“</w:t>
-      </w:r>
-      <w:proofErr w:type="gramStart"/>
-      <w:r>
-        <w:rPr>
-          <w:rFonts w:cstheme="minorHAnsi"/>
-          <w:sz w:val="24"/>
-          <w:szCs w:val="24"/>
-        </w:rPr>
-        <w:t>according</w:t>
-      </w:r>
-      <w:proofErr w:type="gramEnd"/>
-      <w:r>
-        <w:rPr>
-          <w:rFonts w:cstheme="minorHAnsi"/>
-          <w:sz w:val="24"/>
-          <w:szCs w:val="24"/>
-        </w:rPr>
-        <w:t xml:space="preserve"> to”</w:t>
+        <w:t>“according to”</w:t>
       </w:r>
     </w:p>
     <w:p>
@@ -13459,25 +12213,7 @@
           <w:sz w:val="24"/>
           <w:szCs w:val="24"/>
         </w:rPr>
-        <w:t>“</w:t>
-      </w:r>
-      <w:proofErr w:type="gramStart"/>
-      <w:r>
-        <w:rPr>
-          <w:rFonts w:cstheme="minorHAnsi"/>
-          <w:sz w:val="24"/>
-          <w:szCs w:val="24"/>
-        </w:rPr>
-        <w:t>does</w:t>
-      </w:r>
-      <w:proofErr w:type="gramEnd"/>
-      <w:r>
-        <w:rPr>
-          <w:rFonts w:cstheme="minorHAnsi"/>
-          <w:sz w:val="24"/>
-          <w:szCs w:val="24"/>
-        </w:rPr>
-        <w:t xml:space="preserve"> it say”</w:t>
+        <w:t>“does it say”</w:t>
       </w:r>
     </w:p>
     <w:p>
@@ -14699,25 +13435,7 @@
                 <w:sz w:val="24"/>
                 <w:szCs w:val="24"/>
               </w:rPr>
-              <w:t>Phi</w:t>
-            </w:r>
-            <w:proofErr w:type="gramStart"/>
-            <w:r>
-              <w:rPr>
-                <w:rFonts w:cstheme="minorHAnsi"/>
-                <w:sz w:val="24"/>
-                <w:szCs w:val="24"/>
-              </w:rPr>
-              <w:t>3:mini</w:t>
-            </w:r>
-            <w:proofErr w:type="gramEnd"/>
-            <w:r>
-              <w:rPr>
-                <w:rFonts w:cstheme="minorHAnsi"/>
-                <w:sz w:val="24"/>
-                <w:szCs w:val="24"/>
-              </w:rPr>
-              <w:t xml:space="preserve"> </w:t>
+              <w:t xml:space="preserve">Phi3:mini </w:t>
             </w:r>
           </w:p>
         </w:tc>
@@ -15219,25 +13937,7 @@
           <w:sz w:val="24"/>
           <w:szCs w:val="24"/>
         </w:rPr>
-        <w:t>For RAG ideally 0.0-0.</w:t>
-      </w:r>
-      <w:proofErr w:type="gramStart"/>
-      <w:r>
-        <w:rPr>
-          <w:rFonts w:cstheme="minorHAnsi"/>
-          <w:sz w:val="24"/>
-          <w:szCs w:val="24"/>
-        </w:rPr>
-        <w:t>2 :</w:t>
-      </w:r>
-      <w:proofErr w:type="gramEnd"/>
-      <w:r>
-        <w:rPr>
-          <w:rFonts w:cstheme="minorHAnsi"/>
-          <w:sz w:val="24"/>
-          <w:szCs w:val="24"/>
-        </w:rPr>
-        <w:t xml:space="preserve"> to get hallucination free response</w:t>
+        <w:t>For RAG ideally 0.0-0.2 : to get hallucination free response</w:t>
       </w:r>
     </w:p>
     <w:p>
@@ -15439,7 +14139,6 @@
         </w:rPr>
         <w:t xml:space="preserve">3) </w:t>
       </w:r>
-      <w:proofErr w:type="spellStart"/>
       <w:r>
         <w:rPr>
           <w:rFonts w:cstheme="minorHAnsi"/>
@@ -15448,18 +14147,7 @@
           <w:sz w:val="24"/>
           <w:szCs w:val="24"/>
         </w:rPr>
-        <w:t>max_tokens</w:t>
-      </w:r>
-      <w:proofErr w:type="spellEnd"/>
-      <w:r>
-        <w:rPr>
-          <w:rFonts w:cstheme="minorHAnsi"/>
-          <w:b/>
-          <w:bCs/>
-          <w:sz w:val="24"/>
-          <w:szCs w:val="24"/>
-        </w:rPr>
-        <w:t xml:space="preserve"> — </w:t>
+        <w:t xml:space="preserve">max_tokens — </w:t>
       </w:r>
       <w:r>
         <w:rPr>
@@ -15604,7 +14292,6 @@
         </w:rPr>
         <w:t xml:space="preserve">4) </w:t>
       </w:r>
-      <w:proofErr w:type="spellStart"/>
       <w:r>
         <w:rPr>
           <w:rFonts w:cstheme="minorHAnsi"/>
@@ -15615,7 +14302,6 @@
         </w:rPr>
         <w:t>top_p</w:t>
       </w:r>
-      <w:proofErr w:type="spellEnd"/>
       <w:r>
         <w:rPr>
           <w:rFonts w:cstheme="minorHAnsi"/>
@@ -15670,23 +14356,13 @@
           <w:szCs w:val="24"/>
         </w:rPr>
       </w:pPr>
-      <w:proofErr w:type="spellStart"/>
-      <w:r>
-        <w:rPr>
-          <w:rFonts w:cstheme="minorHAnsi"/>
-          <w:sz w:val="24"/>
-          <w:szCs w:val="24"/>
-        </w:rPr>
-        <w:t>top_p</w:t>
-      </w:r>
-      <w:proofErr w:type="spellEnd"/>
-      <w:r>
-        <w:rPr>
-          <w:rFonts w:cstheme="minorHAnsi"/>
-          <w:sz w:val="24"/>
-          <w:szCs w:val="24"/>
-        </w:rPr>
-        <w:t xml:space="preserve"> tells the model:</w:t>
+      <w:r>
+        <w:rPr>
+          <w:rFonts w:cstheme="minorHAnsi"/>
+          <w:sz w:val="24"/>
+          <w:szCs w:val="24"/>
+        </w:rPr>
+        <w:t>top_p tells the model:</w:t>
       </w:r>
     </w:p>
     <w:p>
@@ -15792,96 +14468,24 @@
           <w:sz w:val="24"/>
           <w:szCs w:val="24"/>
         </w:rPr>
-        <w:t xml:space="preserve">If </w:t>
-      </w:r>
-      <w:proofErr w:type="spellStart"/>
-      <w:r>
-        <w:rPr>
-          <w:rFonts w:cstheme="minorHAnsi"/>
-          <w:sz w:val="24"/>
-          <w:szCs w:val="24"/>
-        </w:rPr>
-        <w:t>top_p</w:t>
-      </w:r>
-      <w:proofErr w:type="spellEnd"/>
-      <w:r>
-        <w:rPr>
-          <w:rFonts w:cstheme="minorHAnsi"/>
-          <w:sz w:val="24"/>
-          <w:szCs w:val="24"/>
-        </w:rPr>
-        <w:t xml:space="preserve"> &gt;= </w:t>
-      </w:r>
-      <w:proofErr w:type="gramStart"/>
-      <w:r>
-        <w:rPr>
-          <w:rFonts w:cstheme="minorHAnsi"/>
-          <w:sz w:val="24"/>
-          <w:szCs w:val="24"/>
-        </w:rPr>
-        <w:t>0.9 :</w:t>
-      </w:r>
-      <w:proofErr w:type="gramEnd"/>
-      <w:r>
-        <w:rPr>
-          <w:rFonts w:cstheme="minorHAnsi"/>
-          <w:sz w:val="24"/>
-          <w:szCs w:val="24"/>
-        </w:rPr>
-        <w:t xml:space="preserve"> all those words whose probability adds up to 0.9+ are considered. Many words who can add up to 0.9 therefore vast pool of choices for next tokens.</w:t>
-      </w:r>
-    </w:p>
-    <w:p>
-      <w:pPr>
-        <w:rPr>
-          <w:rFonts w:cstheme="minorHAnsi"/>
-          <w:sz w:val="24"/>
-          <w:szCs w:val="24"/>
-        </w:rPr>
-      </w:pPr>
-      <w:r>
-        <w:rPr>
-          <w:rFonts w:cstheme="minorHAnsi"/>
-          <w:sz w:val="24"/>
-          <w:szCs w:val="24"/>
-        </w:rPr>
-        <w:t xml:space="preserve">If </w:t>
-      </w:r>
-      <w:proofErr w:type="spellStart"/>
-      <w:r>
-        <w:rPr>
-          <w:rFonts w:cstheme="minorHAnsi"/>
-          <w:sz w:val="24"/>
-          <w:szCs w:val="24"/>
-        </w:rPr>
-        <w:t>top_p</w:t>
-      </w:r>
-      <w:proofErr w:type="spellEnd"/>
-      <w:r>
-        <w:rPr>
-          <w:rFonts w:cstheme="minorHAnsi"/>
-          <w:sz w:val="24"/>
-          <w:szCs w:val="24"/>
-        </w:rPr>
-        <w:t xml:space="preserve"> &gt;= </w:t>
-      </w:r>
-      <w:proofErr w:type="gramStart"/>
-      <w:r>
-        <w:rPr>
-          <w:rFonts w:cstheme="minorHAnsi"/>
-          <w:sz w:val="24"/>
-          <w:szCs w:val="24"/>
-        </w:rPr>
-        <w:t>0.1 :</w:t>
-      </w:r>
-      <w:proofErr w:type="gramEnd"/>
-      <w:r>
-        <w:rPr>
-          <w:rFonts w:cstheme="minorHAnsi"/>
-          <w:sz w:val="24"/>
-          <w:szCs w:val="24"/>
-        </w:rPr>
-        <w:t xml:space="preserve"> all those words whose probability adds up to 0.1+ are considered. Very less words who can add up to 0.1 therefore limited choice of words.</w:t>
+        <w:t>If top_p &gt;= 0.9 : all those words whose probability adds up to 0.9+ are considered. Many words who can add up to 0.9 therefore vast pool of choices for next tokens.</w:t>
+      </w:r>
+    </w:p>
+    <w:p>
+      <w:pPr>
+        <w:rPr>
+          <w:rFonts w:cstheme="minorHAnsi"/>
+          <w:sz w:val="24"/>
+          <w:szCs w:val="24"/>
+        </w:rPr>
+      </w:pPr>
+      <w:r>
+        <w:rPr>
+          <w:rFonts w:cstheme="minorHAnsi"/>
+          <w:sz w:val="24"/>
+          <w:szCs w:val="24"/>
+        </w:rPr>
+        <w:t>If top_p &gt;= 0.1 : all those words whose probability adds up to 0.1+ are considered. Very less words who can add up to 0.1 therefore limited choice of words.</w:t>
       </w:r>
     </w:p>
     <w:p>
@@ -15960,7 +14564,6 @@
                 <w:szCs w:val="24"/>
               </w:rPr>
             </w:pPr>
-            <w:proofErr w:type="spellStart"/>
             <w:r>
               <w:rPr>
                 <w:rFonts w:cstheme="minorHAnsi"/>
@@ -15969,18 +14572,7 @@
                 <w:sz w:val="24"/>
                 <w:szCs w:val="24"/>
               </w:rPr>
-              <w:t>top_p</w:t>
-            </w:r>
-            <w:proofErr w:type="spellEnd"/>
-            <w:r>
-              <w:rPr>
-                <w:rFonts w:cstheme="minorHAnsi"/>
-                <w:b/>
-                <w:bCs/>
-                <w:sz w:val="24"/>
-                <w:szCs w:val="24"/>
-              </w:rPr>
-              <w:t xml:space="preserve"> value</w:t>
+              <w:t>top_p value</w:t>
             </w:r>
           </w:p>
         </w:tc>
@@ -16000,7 +14592,6 @@
                 <w:szCs w:val="24"/>
               </w:rPr>
             </w:pPr>
-            <w:proofErr w:type="spellStart"/>
             <w:r>
               <w:rPr>
                 <w:rFonts w:cstheme="minorHAnsi"/>
@@ -16011,7 +14602,6 @@
               </w:rPr>
               <w:t>Behavior</w:t>
             </w:r>
-            <w:proofErr w:type="spellEnd"/>
           </w:p>
         </w:tc>
       </w:tr>
@@ -16241,6 +14831,384 @@
       <w:pPr>
         <w:rPr>
           <w:rFonts w:cstheme="minorHAnsi"/>
+          <w:b/>
+          <w:bCs/>
+          <w:sz w:val="24"/>
+          <w:szCs w:val="24"/>
+        </w:rPr>
+      </w:pPr>
+      <w:r>
+        <w:rPr>
+          <w:rFonts w:cstheme="minorHAnsi"/>
+          <w:b/>
+          <w:bCs/>
+          <w:sz w:val="24"/>
+          <w:szCs w:val="24"/>
+        </w:rPr>
+        <w:t>Strict prompt Vs Relaxed prompt:</w:t>
+      </w:r>
+    </w:p>
+    <w:p>
+      <w:pPr>
+        <w:rPr>
+          <w:rFonts w:cstheme="minorHAnsi"/>
+          <w:i/>
+          <w:iCs/>
+          <w:sz w:val="24"/>
+          <w:szCs w:val="24"/>
+          <w:u w:val="single"/>
+        </w:rPr>
+      </w:pPr>
+      <w:r>
+        <w:rPr>
+          <w:rFonts w:cstheme="minorHAnsi"/>
+          <w:i/>
+          <w:iCs/>
+          <w:sz w:val="24"/>
+          <w:szCs w:val="24"/>
+          <w:u w:val="single"/>
+        </w:rPr>
+        <w:t>Goal of relaxed mode</w:t>
+      </w:r>
+      <w:r>
+        <w:rPr>
+          <w:rFonts w:cstheme="minorHAnsi"/>
+          <w:i/>
+          <w:iCs/>
+          <w:sz w:val="24"/>
+          <w:szCs w:val="24"/>
+          <w:u w:val="single"/>
+        </w:rPr>
+        <w:t>:</w:t>
+      </w:r>
+    </w:p>
+    <w:p>
+      <w:pPr>
+        <w:rPr>
+          <w:rFonts w:cstheme="minorHAnsi"/>
+          <w:sz w:val="24"/>
+          <w:szCs w:val="24"/>
+        </w:rPr>
+      </w:pPr>
+      <w:r>
+        <w:rPr>
+          <w:rFonts w:cstheme="minorHAnsi"/>
+          <w:sz w:val="24"/>
+          <w:szCs w:val="24"/>
+        </w:rPr>
+        <w:t>- Higher answer rate</w:t>
+      </w:r>
+    </w:p>
+    <w:p>
+      <w:pPr>
+        <w:rPr>
+          <w:rFonts w:cstheme="minorHAnsi"/>
+          <w:sz w:val="24"/>
+          <w:szCs w:val="24"/>
+        </w:rPr>
+      </w:pPr>
+      <w:r>
+        <w:rPr>
+          <w:rFonts w:cstheme="minorHAnsi"/>
+          <w:sz w:val="24"/>
+          <w:szCs w:val="24"/>
+        </w:rPr>
+        <w:t>- Still grounded in context</w:t>
+      </w:r>
+    </w:p>
+    <w:p>
+      <w:pPr>
+        <w:rPr>
+          <w:rFonts w:cstheme="minorHAnsi"/>
+          <w:sz w:val="24"/>
+          <w:szCs w:val="24"/>
+        </w:rPr>
+      </w:pPr>
+      <w:r>
+        <w:rPr>
+          <w:rFonts w:cstheme="minorHAnsi"/>
+          <w:sz w:val="24"/>
+          <w:szCs w:val="24"/>
+        </w:rPr>
+        <w:t>- Allows light synthesis, but no hallucination</w:t>
+      </w:r>
+    </w:p>
+    <w:p>
+      <w:pPr>
+        <w:rPr>
+          <w:rFonts w:cstheme="minorHAnsi"/>
+          <w:sz w:val="24"/>
+          <w:szCs w:val="24"/>
+        </w:rPr>
+      </w:pPr>
+      <w:r>
+        <w:rPr>
+          <w:rFonts w:cstheme="minorHAnsi"/>
+          <w:sz w:val="24"/>
+          <w:szCs w:val="24"/>
+        </w:rPr>
+        <w:t>- Better UX for exploratory queries</w:t>
+      </w:r>
+    </w:p>
+    <w:p>
+      <w:pPr>
+        <w:rPr>
+          <w:rFonts w:cstheme="minorHAnsi"/>
+          <w:sz w:val="24"/>
+          <w:szCs w:val="24"/>
+        </w:rPr>
+      </w:pPr>
+      <w:r>
+        <w:rPr>
+          <w:rFonts w:cstheme="minorHAnsi"/>
+          <w:sz w:val="24"/>
+          <w:szCs w:val="24"/>
+        </w:rPr>
+        <w:t>- Think of it as “helpful librarian” instead of “court witness”.</w:t>
+      </w:r>
+    </w:p>
+    <w:p>
+      <w:pPr>
+        <w:rPr>
+          <w:rFonts w:cstheme="minorHAnsi"/>
+          <w:sz w:val="24"/>
+          <w:szCs w:val="24"/>
+        </w:rPr>
+      </w:pPr>
+      <w:r>
+        <w:rPr>
+          <w:rFonts w:cstheme="minorHAnsi"/>
+          <w:sz w:val="24"/>
+          <w:szCs w:val="24"/>
+        </w:rPr>
+        <w:t xml:space="preserve">- Better for questions like explain, summarize. </w:t>
+      </w:r>
+    </w:p>
+    <w:p>
+      <w:pPr>
+        <w:rPr>
+          <w:rFonts w:cstheme="minorHAnsi"/>
+          <w:sz w:val="24"/>
+          <w:szCs w:val="24"/>
+        </w:rPr>
+      </w:pPr>
+      <w:r>
+        <w:rPr>
+          <w:rFonts w:cstheme="minorHAnsi"/>
+          <w:sz w:val="24"/>
+          <w:szCs w:val="24"/>
+        </w:rPr>
+        <w:t xml:space="preserve">- Better for domains like Book exploration, </w:t>
+      </w:r>
+    </w:p>
+    <w:p>
+      <w:pPr>
+        <w:rPr>
+          <w:rFonts w:cstheme="minorHAnsi"/>
+          <w:sz w:val="24"/>
+          <w:szCs w:val="24"/>
+        </w:rPr>
+      </w:pPr>
+    </w:p>
+    <w:p>
+      <w:pPr>
+        <w:rPr>
+          <w:rFonts w:cstheme="minorHAnsi"/>
+          <w:i/>
+          <w:iCs/>
+          <w:sz w:val="24"/>
+          <w:szCs w:val="24"/>
+          <w:u w:val="single"/>
+        </w:rPr>
+      </w:pPr>
+      <w:r>
+        <w:rPr>
+          <w:rFonts w:cstheme="minorHAnsi"/>
+          <w:i/>
+          <w:iCs/>
+          <w:sz w:val="24"/>
+          <w:szCs w:val="24"/>
+          <w:u w:val="single"/>
+        </w:rPr>
+        <w:t xml:space="preserve">Goal of </w:t>
+      </w:r>
+      <w:r>
+        <w:rPr>
+          <w:rFonts w:cstheme="minorHAnsi"/>
+          <w:i/>
+          <w:iCs/>
+          <w:sz w:val="24"/>
+          <w:szCs w:val="24"/>
+          <w:u w:val="single"/>
+        </w:rPr>
+        <w:t>Strict</w:t>
+      </w:r>
+      <w:r>
+        <w:rPr>
+          <w:rFonts w:cstheme="minorHAnsi"/>
+          <w:i/>
+          <w:iCs/>
+          <w:sz w:val="24"/>
+          <w:szCs w:val="24"/>
+          <w:u w:val="single"/>
+        </w:rPr>
+        <w:t xml:space="preserve"> mode</w:t>
+      </w:r>
+      <w:r>
+        <w:rPr>
+          <w:rFonts w:cstheme="minorHAnsi"/>
+          <w:i/>
+          <w:iCs/>
+          <w:sz w:val="24"/>
+          <w:szCs w:val="24"/>
+          <w:u w:val="single"/>
+        </w:rPr>
+        <w:t>:</w:t>
+      </w:r>
+    </w:p>
+    <w:p>
+      <w:pPr>
+        <w:rPr>
+          <w:rFonts w:cstheme="minorHAnsi"/>
+          <w:sz w:val="24"/>
+          <w:szCs w:val="24"/>
+        </w:rPr>
+      </w:pPr>
+      <w:r>
+        <w:rPr>
+          <w:rFonts w:cstheme="minorHAnsi"/>
+          <w:sz w:val="24"/>
+          <w:szCs w:val="24"/>
+        </w:rPr>
+        <w:t>- For Fact based queries, where no paraphrasing should be employed.</w:t>
+      </w:r>
+    </w:p>
+    <w:p>
+      <w:pPr>
+        <w:rPr>
+          <w:rFonts w:cstheme="minorHAnsi"/>
+          <w:sz w:val="24"/>
+          <w:szCs w:val="24"/>
+        </w:rPr>
+      </w:pPr>
+      <w:r>
+        <w:rPr>
+          <w:rFonts w:cstheme="minorHAnsi"/>
+          <w:sz w:val="24"/>
+          <w:szCs w:val="24"/>
+        </w:rPr>
+        <w:t>- For critical domains like :</w:t>
+      </w:r>
+    </w:p>
+    <w:p>
+      <w:pPr>
+        <w:pStyle w:val="ListParagraph"/>
+        <w:numPr>
+          <w:ilvl w:val="0"/>
+          <w:numId w:val="57"/>
+        </w:numPr>
+        <w:rPr>
+          <w:rFonts w:cstheme="minorHAnsi"/>
+          <w:sz w:val="24"/>
+          <w:szCs w:val="24"/>
+        </w:rPr>
+      </w:pPr>
+      <w:r>
+        <w:rPr>
+          <w:rFonts w:cstheme="minorHAnsi"/>
+          <w:sz w:val="24"/>
+          <w:szCs w:val="24"/>
+        </w:rPr>
+        <w:t>Medical</w:t>
+      </w:r>
+    </w:p>
+    <w:p>
+      <w:pPr>
+        <w:pStyle w:val="ListParagraph"/>
+        <w:numPr>
+          <w:ilvl w:val="0"/>
+          <w:numId w:val="57"/>
+        </w:numPr>
+        <w:rPr>
+          <w:rFonts w:cstheme="minorHAnsi"/>
+          <w:sz w:val="24"/>
+          <w:szCs w:val="24"/>
+        </w:rPr>
+      </w:pPr>
+      <w:r>
+        <w:rPr>
+          <w:rFonts w:cstheme="minorHAnsi"/>
+          <w:sz w:val="24"/>
+          <w:szCs w:val="24"/>
+        </w:rPr>
+        <w:t xml:space="preserve">Compliance </w:t>
+      </w:r>
+    </w:p>
+    <w:p>
+      <w:pPr>
+        <w:pStyle w:val="ListParagraph"/>
+        <w:numPr>
+          <w:ilvl w:val="0"/>
+          <w:numId w:val="57"/>
+        </w:numPr>
+        <w:rPr>
+          <w:rFonts w:cstheme="minorHAnsi"/>
+          <w:sz w:val="24"/>
+          <w:szCs w:val="24"/>
+        </w:rPr>
+      </w:pPr>
+      <w:r>
+        <w:rPr>
+          <w:rFonts w:cstheme="minorHAnsi"/>
+          <w:sz w:val="24"/>
+          <w:szCs w:val="24"/>
+        </w:rPr>
+        <w:t>Legal</w:t>
+      </w:r>
+    </w:p>
+    <w:p>
+      <w:pPr>
+        <w:pStyle w:val="ListParagraph"/>
+        <w:numPr>
+          <w:ilvl w:val="0"/>
+          <w:numId w:val="57"/>
+        </w:numPr>
+        <w:rPr>
+          <w:rFonts w:cstheme="minorHAnsi"/>
+          <w:sz w:val="24"/>
+          <w:szCs w:val="24"/>
+        </w:rPr>
+      </w:pPr>
+      <w:r>
+        <w:rPr>
+          <w:rFonts w:cstheme="minorHAnsi"/>
+          <w:sz w:val="24"/>
+          <w:szCs w:val="24"/>
+        </w:rPr>
+        <w:t>Policy</w:t>
+      </w:r>
+    </w:p>
+    <w:p>
+      <w:pPr>
+        <w:rPr>
+          <w:rFonts w:cstheme="minorHAnsi"/>
+          <w:sz w:val="24"/>
+          <w:szCs w:val="24"/>
+        </w:rPr>
+      </w:pPr>
+      <w:r>
+        <w:rPr>
+          <w:rFonts w:cstheme="minorHAnsi"/>
+          <w:sz w:val="24"/>
+          <w:szCs w:val="24"/>
+        </w:rPr>
+        <w:t xml:space="preserve">- Strictly no hallucinations </w:t>
+      </w:r>
+    </w:p>
+    <w:p>
+      <w:pPr>
+        <w:rPr>
+          <w:rFonts w:cstheme="minorHAnsi"/>
           <w:sz w:val="24"/>
           <w:szCs w:val="24"/>
         </w:rPr>
@@ -16300,7 +15268,7 @@
           <w:szCs w:val="24"/>
         </w:rPr>
       </w:pPr>
-      <w:hyperlink r:id="rId18" w:history="1">
+      <w:hyperlink r:id="rId19" w:history="1">
         <w:r>
           <w:rPr>
             <w:rStyle w:val="Hyperlink"/>
@@ -16321,7 +15289,7 @@
           <w:szCs w:val="24"/>
         </w:rPr>
       </w:pPr>
-      <w:hyperlink r:id="rId19" w:history="1">
+      <w:hyperlink r:id="rId20" w:history="1">
         <w:r>
           <w:rPr>
             <w:rStyle w:val="Hyperlink"/>
@@ -16342,7 +15310,7 @@
           <w:szCs w:val="24"/>
         </w:rPr>
       </w:pPr>
-      <w:hyperlink r:id="rId20" w:history="1">
+      <w:hyperlink r:id="rId21" w:history="1">
         <w:r>
           <w:rPr>
             <w:rStyle w:val="Hyperlink"/>
@@ -16363,7 +15331,7 @@
           <w:szCs w:val="24"/>
         </w:rPr>
       </w:pPr>
-      <w:hyperlink r:id="rId21" w:history="1">
+      <w:hyperlink r:id="rId22" w:history="1">
         <w:r>
           <w:rPr>
             <w:rStyle w:val="Hyperlink"/>
@@ -16384,7 +15352,7 @@
           <w:szCs w:val="24"/>
         </w:rPr>
       </w:pPr>
-      <w:hyperlink r:id="rId22" w:history="1">
+      <w:hyperlink r:id="rId23" w:history="1">
         <w:r>
           <w:rPr>
             <w:rStyle w:val="Hyperlink"/>
@@ -16405,7 +15373,7 @@
           <w:szCs w:val="24"/>
         </w:rPr>
       </w:pPr>
-      <w:hyperlink r:id="rId23" w:history="1">
+      <w:hyperlink r:id="rId24" w:history="1">
         <w:r>
           <w:rPr>
             <w:rStyle w:val="Hyperlink"/>
@@ -16426,7 +15394,7 @@
           <w:szCs w:val="24"/>
         </w:rPr>
       </w:pPr>
-      <w:hyperlink r:id="rId24" w:history="1">
+      <w:hyperlink r:id="rId25" w:history="1">
         <w:r>
           <w:rPr>
             <w:rStyle w:val="Hyperlink"/>
@@ -16447,7 +15415,7 @@
           <w:szCs w:val="24"/>
         </w:rPr>
       </w:pPr>
-      <w:hyperlink r:id="rId25" w:history="1">
+      <w:hyperlink r:id="rId26" w:history="1">
         <w:r>
           <w:rPr>
             <w:rStyle w:val="Hyperlink"/>
@@ -16468,7 +15436,7 @@
           <w:szCs w:val="24"/>
         </w:rPr>
       </w:pPr>
-      <w:hyperlink r:id="rId26" w:history="1">
+      <w:hyperlink r:id="rId27" w:history="1">
         <w:r>
           <w:rPr>
             <w:rStyle w:val="Hyperlink"/>
@@ -16489,7 +15457,7 @@
           <w:szCs w:val="24"/>
         </w:rPr>
       </w:pPr>
-      <w:hyperlink r:id="rId27" w:history="1">
+      <w:hyperlink r:id="rId28" w:history="1">
         <w:r>
           <w:rPr>
             <w:rStyle w:val="Hyperlink"/>
@@ -16510,7 +15478,7 @@
           <w:szCs w:val="24"/>
         </w:rPr>
       </w:pPr>
-      <w:hyperlink r:id="rId28" w:history="1">
+      <w:hyperlink r:id="rId29" w:history="1">
         <w:r>
           <w:rPr>
             <w:rStyle w:val="Hyperlink"/>
@@ -19256,7 +18224,7 @@
   <w:abstractNum w:abstractNumId="19" w15:restartNumberingAfterBreak="0">
     <w:nsid w:val="2B8134A9"/>
     <w:multiLevelType w:val="multilevel"/>
-    <w:tmpl w:val="78468636"/>
+    <w:tmpl w:val="F1227036"/>
     <w:lvl w:ilvl="0">
       <w:start w:val="1"/>
       <w:numFmt w:val="bullet"/>
@@ -19313,20 +18281,16 @@
         <w:rFonts w:hint="default"/>
       </w:rPr>
     </w:lvl>
-    <w:lvl w:ilvl="4" w:tentative="1">
-      <w:start w:val="1"/>
-      <w:numFmt w:val="bullet"/>
-      <w:lvlText w:val=""/>
-      <w:lvlJc w:val="left"/>
-      <w:pPr>
-        <w:tabs>
-          <w:tab w:val="num" w:pos="3600"/>
-        </w:tabs>
+    <w:lvl w:ilvl="4">
+      <w:start w:val="4"/>
+      <w:numFmt w:val="bullet"/>
+      <w:lvlText w:val="-"/>
+      <w:lvlJc w:val="left"/>
+      <w:pPr>
         <w:ind w:left="3600" w:hanging="360"/>
       </w:pPr>
       <w:rPr>
-        <w:rFonts w:ascii="Wingdings" w:hAnsi="Wingdings" w:hint="default"/>
-        <w:sz w:val="20"/>
+        <w:rFonts w:ascii="Calibri" w:eastAsiaTheme="minorHAnsi" w:hAnsi="Calibri" w:cs="Calibri" w:hint="default"/>
       </w:rPr>
     </w:lvl>
     <w:lvl w:ilvl="5" w:tentative="1">
@@ -21385,6 +20349,119 @@
     </w:lvl>
   </w:abstractNum>
   <w:abstractNum w:abstractNumId="34" w15:restartNumberingAfterBreak="0">
+    <w:nsid w:val="4C06358E"/>
+    <w:multiLevelType w:val="hybridMultilevel"/>
+    <w:tmpl w:val="99164702"/>
+    <w:lvl w:ilvl="0" w:tplc="40090001">
+      <w:start w:val="1"/>
+      <w:numFmt w:val="bullet"/>
+      <w:lvlText w:val=""/>
+      <w:lvlJc w:val="left"/>
+      <w:pPr>
+        <w:ind w:left="720" w:hanging="360"/>
+      </w:pPr>
+      <w:rPr>
+        <w:rFonts w:ascii="Symbol" w:hAnsi="Symbol" w:hint="default"/>
+      </w:rPr>
+    </w:lvl>
+    <w:lvl w:ilvl="1" w:tplc="40090003" w:tentative="1">
+      <w:start w:val="1"/>
+      <w:numFmt w:val="bullet"/>
+      <w:lvlText w:val="o"/>
+      <w:lvlJc w:val="left"/>
+      <w:pPr>
+        <w:ind w:left="1440" w:hanging="360"/>
+      </w:pPr>
+      <w:rPr>
+        <w:rFonts w:ascii="Courier New" w:hAnsi="Courier New" w:cs="Courier New" w:hint="default"/>
+      </w:rPr>
+    </w:lvl>
+    <w:lvl w:ilvl="2" w:tplc="40090005" w:tentative="1">
+      <w:start w:val="1"/>
+      <w:numFmt w:val="bullet"/>
+      <w:lvlText w:val=""/>
+      <w:lvlJc w:val="left"/>
+      <w:pPr>
+        <w:ind w:left="2160" w:hanging="360"/>
+      </w:pPr>
+      <w:rPr>
+        <w:rFonts w:ascii="Wingdings" w:hAnsi="Wingdings" w:hint="default"/>
+      </w:rPr>
+    </w:lvl>
+    <w:lvl w:ilvl="3" w:tplc="40090001" w:tentative="1">
+      <w:start w:val="1"/>
+      <w:numFmt w:val="bullet"/>
+      <w:lvlText w:val=""/>
+      <w:lvlJc w:val="left"/>
+      <w:pPr>
+        <w:ind w:left="2880" w:hanging="360"/>
+      </w:pPr>
+      <w:rPr>
+        <w:rFonts w:ascii="Symbol" w:hAnsi="Symbol" w:hint="default"/>
+      </w:rPr>
+    </w:lvl>
+    <w:lvl w:ilvl="4" w:tplc="40090003" w:tentative="1">
+      <w:start w:val="1"/>
+      <w:numFmt w:val="bullet"/>
+      <w:lvlText w:val="o"/>
+      <w:lvlJc w:val="left"/>
+      <w:pPr>
+        <w:ind w:left="3600" w:hanging="360"/>
+      </w:pPr>
+      <w:rPr>
+        <w:rFonts w:ascii="Courier New" w:hAnsi="Courier New" w:cs="Courier New" w:hint="default"/>
+      </w:rPr>
+    </w:lvl>
+    <w:lvl w:ilvl="5" w:tplc="40090005" w:tentative="1">
+      <w:start w:val="1"/>
+      <w:numFmt w:val="bullet"/>
+      <w:lvlText w:val=""/>
+      <w:lvlJc w:val="left"/>
+      <w:pPr>
+        <w:ind w:left="4320" w:hanging="360"/>
+      </w:pPr>
+      <w:rPr>
+        <w:rFonts w:ascii="Wingdings" w:hAnsi="Wingdings" w:hint="default"/>
+      </w:rPr>
+    </w:lvl>
+    <w:lvl w:ilvl="6" w:tplc="40090001" w:tentative="1">
+      <w:start w:val="1"/>
+      <w:numFmt w:val="bullet"/>
+      <w:lvlText w:val=""/>
+      <w:lvlJc w:val="left"/>
+      <w:pPr>
+        <w:ind w:left="5040" w:hanging="360"/>
+      </w:pPr>
+      <w:rPr>
+        <w:rFonts w:ascii="Symbol" w:hAnsi="Symbol" w:hint="default"/>
+      </w:rPr>
+    </w:lvl>
+    <w:lvl w:ilvl="7" w:tplc="40090003" w:tentative="1">
+      <w:start w:val="1"/>
+      <w:numFmt w:val="bullet"/>
+      <w:lvlText w:val="o"/>
+      <w:lvlJc w:val="left"/>
+      <w:pPr>
+        <w:ind w:left="5760" w:hanging="360"/>
+      </w:pPr>
+      <w:rPr>
+        <w:rFonts w:ascii="Courier New" w:hAnsi="Courier New" w:cs="Courier New" w:hint="default"/>
+      </w:rPr>
+    </w:lvl>
+    <w:lvl w:ilvl="8" w:tplc="40090005" w:tentative="1">
+      <w:start w:val="1"/>
+      <w:numFmt w:val="bullet"/>
+      <w:lvlText w:val=""/>
+      <w:lvlJc w:val="left"/>
+      <w:pPr>
+        <w:ind w:left="6480" w:hanging="360"/>
+      </w:pPr>
+      <w:rPr>
+        <w:rFonts w:ascii="Wingdings" w:hAnsi="Wingdings" w:hint="default"/>
+      </w:rPr>
+    </w:lvl>
+  </w:abstractNum>
+  <w:abstractNum w:abstractNumId="35" w15:restartNumberingAfterBreak="0">
     <w:nsid w:val="4DA4437E"/>
     <w:multiLevelType w:val="multilevel"/>
     <w:tmpl w:val="F27E8A64"/>
@@ -21533,7 +20610,7 @@
       </w:rPr>
     </w:lvl>
   </w:abstractNum>
-  <w:abstractNum w:abstractNumId="35" w15:restartNumberingAfterBreak="0">
+  <w:abstractNum w:abstractNumId="36" w15:restartNumberingAfterBreak="0">
     <w:nsid w:val="500A4DB3"/>
     <w:multiLevelType w:val="multilevel"/>
     <w:tmpl w:val="1F28AEC2"/>
@@ -21682,7 +20759,7 @@
       </w:rPr>
     </w:lvl>
   </w:abstractNum>
-  <w:abstractNum w:abstractNumId="36" w15:restartNumberingAfterBreak="0">
+  <w:abstractNum w:abstractNumId="37" w15:restartNumberingAfterBreak="0">
     <w:nsid w:val="531E6C40"/>
     <w:multiLevelType w:val="multilevel"/>
     <w:tmpl w:val="3336F1FA"/>
@@ -21831,7 +20908,7 @@
       </w:rPr>
     </w:lvl>
   </w:abstractNum>
-  <w:abstractNum w:abstractNumId="37" w15:restartNumberingAfterBreak="0">
+  <w:abstractNum w:abstractNumId="38" w15:restartNumberingAfterBreak="0">
     <w:nsid w:val="54CA1A5C"/>
     <w:multiLevelType w:val="multilevel"/>
     <w:tmpl w:val="CC822682"/>
@@ -21980,7 +21057,7 @@
       </w:rPr>
     </w:lvl>
   </w:abstractNum>
-  <w:abstractNum w:abstractNumId="38" w15:restartNumberingAfterBreak="0">
+  <w:abstractNum w:abstractNumId="39" w15:restartNumberingAfterBreak="0">
     <w:nsid w:val="5548001E"/>
     <w:multiLevelType w:val="multilevel"/>
     <w:tmpl w:val="46187BF2"/>
@@ -22129,7 +21206,7 @@
       </w:rPr>
     </w:lvl>
   </w:abstractNum>
-  <w:abstractNum w:abstractNumId="39" w15:restartNumberingAfterBreak="0">
+  <w:abstractNum w:abstractNumId="40" w15:restartNumberingAfterBreak="0">
     <w:nsid w:val="58836DB3"/>
     <w:multiLevelType w:val="multilevel"/>
     <w:tmpl w:val="93D26B1C"/>
@@ -22278,7 +21355,7 @@
       </w:rPr>
     </w:lvl>
   </w:abstractNum>
-  <w:abstractNum w:abstractNumId="40" w15:restartNumberingAfterBreak="0">
+  <w:abstractNum w:abstractNumId="41" w15:restartNumberingAfterBreak="0">
     <w:nsid w:val="5A872C34"/>
     <w:multiLevelType w:val="multilevel"/>
     <w:tmpl w:val="0546B7A0"/>
@@ -22427,7 +21504,7 @@
       </w:rPr>
     </w:lvl>
   </w:abstractNum>
-  <w:abstractNum w:abstractNumId="41" w15:restartNumberingAfterBreak="0">
+  <w:abstractNum w:abstractNumId="42" w15:restartNumberingAfterBreak="0">
     <w:nsid w:val="5B9479F7"/>
     <w:multiLevelType w:val="hybridMultilevel"/>
     <w:tmpl w:val="E98C3082"/>
@@ -22516,7 +21593,7 @@
       </w:pPr>
     </w:lvl>
   </w:abstractNum>
-  <w:abstractNum w:abstractNumId="42" w15:restartNumberingAfterBreak="0">
+  <w:abstractNum w:abstractNumId="43" w15:restartNumberingAfterBreak="0">
     <w:nsid w:val="61E963C0"/>
     <w:multiLevelType w:val="multilevel"/>
     <w:tmpl w:val="000290C4"/>
@@ -22665,7 +21742,7 @@
       </w:rPr>
     </w:lvl>
   </w:abstractNum>
-  <w:abstractNum w:abstractNumId="43" w15:restartNumberingAfterBreak="0">
+  <w:abstractNum w:abstractNumId="44" w15:restartNumberingAfterBreak="0">
     <w:nsid w:val="65A70D3C"/>
     <w:multiLevelType w:val="hybridMultilevel"/>
     <w:tmpl w:val="C73E4A76"/>
@@ -22778,7 +21855,7 @@
       </w:rPr>
     </w:lvl>
   </w:abstractNum>
-  <w:abstractNum w:abstractNumId="44" w15:restartNumberingAfterBreak="0">
+  <w:abstractNum w:abstractNumId="45" w15:restartNumberingAfterBreak="0">
     <w:nsid w:val="676C655D"/>
     <w:multiLevelType w:val="multilevel"/>
     <w:tmpl w:val="D26C2404"/>
@@ -22927,7 +22004,7 @@
       </w:rPr>
     </w:lvl>
   </w:abstractNum>
-  <w:abstractNum w:abstractNumId="45" w15:restartNumberingAfterBreak="0">
+  <w:abstractNum w:abstractNumId="46" w15:restartNumberingAfterBreak="0">
     <w:nsid w:val="6877680C"/>
     <w:multiLevelType w:val="multilevel"/>
     <w:tmpl w:val="B1605224"/>
@@ -23040,7 +22117,7 @@
       </w:pPr>
     </w:lvl>
   </w:abstractNum>
-  <w:abstractNum w:abstractNumId="46" w15:restartNumberingAfterBreak="0">
+  <w:abstractNum w:abstractNumId="47" w15:restartNumberingAfterBreak="0">
     <w:nsid w:val="6A354DE7"/>
     <w:multiLevelType w:val="multilevel"/>
     <w:tmpl w:val="A7389F2A"/>
@@ -23189,7 +22266,7 @@
       </w:rPr>
     </w:lvl>
   </w:abstractNum>
-  <w:abstractNum w:abstractNumId="47" w15:restartNumberingAfterBreak="0">
+  <w:abstractNum w:abstractNumId="48" w15:restartNumberingAfterBreak="0">
     <w:nsid w:val="6A922DAB"/>
     <w:multiLevelType w:val="hybridMultilevel"/>
     <w:tmpl w:val="42F41DC2"/>
@@ -23278,7 +22355,7 @@
       </w:pPr>
     </w:lvl>
   </w:abstractNum>
-  <w:abstractNum w:abstractNumId="48" w15:restartNumberingAfterBreak="0">
+  <w:abstractNum w:abstractNumId="49" w15:restartNumberingAfterBreak="0">
     <w:nsid w:val="6E557C88"/>
     <w:multiLevelType w:val="multilevel"/>
     <w:tmpl w:val="7B46B6A2"/>
@@ -23427,7 +22504,7 @@
       </w:rPr>
     </w:lvl>
   </w:abstractNum>
-  <w:abstractNum w:abstractNumId="49" w15:restartNumberingAfterBreak="0">
+  <w:abstractNum w:abstractNumId="50" w15:restartNumberingAfterBreak="0">
     <w:nsid w:val="71FB6A03"/>
     <w:multiLevelType w:val="multilevel"/>
     <w:tmpl w:val="A1DCF412"/>
@@ -23540,7 +22617,7 @@
       </w:pPr>
     </w:lvl>
   </w:abstractNum>
-  <w:abstractNum w:abstractNumId="50" w15:restartNumberingAfterBreak="0">
+  <w:abstractNum w:abstractNumId="51" w15:restartNumberingAfterBreak="0">
     <w:nsid w:val="75E9503E"/>
     <w:multiLevelType w:val="multilevel"/>
     <w:tmpl w:val="23002BC4"/>
@@ -23689,7 +22766,7 @@
       </w:rPr>
     </w:lvl>
   </w:abstractNum>
-  <w:abstractNum w:abstractNumId="51" w15:restartNumberingAfterBreak="0">
+  <w:abstractNum w:abstractNumId="52" w15:restartNumberingAfterBreak="0">
     <w:nsid w:val="794C2919"/>
     <w:multiLevelType w:val="multilevel"/>
     <w:tmpl w:val="BF56CB9E"/>
@@ -23845,34 +22922,34 @@
     <w:abstractNumId w:val="24"/>
   </w:num>
   <w:num w:numId="3" w16cid:durableId="246157692">
-    <w:abstractNumId w:val="42"/>
+    <w:abstractNumId w:val="43"/>
   </w:num>
   <w:num w:numId="4" w16cid:durableId="311524092">
     <w:abstractNumId w:val="4"/>
   </w:num>
   <w:num w:numId="5" w16cid:durableId="131141850">
-    <w:abstractNumId w:val="48"/>
+    <w:abstractNumId w:val="49"/>
   </w:num>
   <w:num w:numId="6" w16cid:durableId="1478063093">
     <w:abstractNumId w:val="16"/>
   </w:num>
   <w:num w:numId="7" w16cid:durableId="1293056430">
-    <w:abstractNumId w:val="38"/>
+    <w:abstractNumId w:val="39"/>
   </w:num>
   <w:num w:numId="8" w16cid:durableId="373696748">
+    <w:abstractNumId w:val="45"/>
+  </w:num>
+  <w:num w:numId="9" w16cid:durableId="1357343489">
     <w:abstractNumId w:val="44"/>
   </w:num>
-  <w:num w:numId="9" w16cid:durableId="1357343489">
-    <w:abstractNumId w:val="43"/>
-  </w:num>
   <w:num w:numId="10" w16cid:durableId="208764285">
-    <w:abstractNumId w:val="41"/>
+    <w:abstractNumId w:val="42"/>
   </w:num>
   <w:num w:numId="11" w16cid:durableId="1608149067">
     <w:abstractNumId w:val="27"/>
   </w:num>
   <w:num w:numId="12" w16cid:durableId="1183401575">
-    <w:abstractNumId w:val="46"/>
+    <w:abstractNumId w:val="47"/>
   </w:num>
   <w:num w:numId="13" w16cid:durableId="54859608">
     <w:abstractNumId w:val="11"/>
@@ -23884,13 +22961,13 @@
     <w:abstractNumId w:val="33"/>
   </w:num>
   <w:num w:numId="16" w16cid:durableId="69233166">
-    <w:abstractNumId w:val="49"/>
+    <w:abstractNumId w:val="50"/>
   </w:num>
   <w:num w:numId="17" w16cid:durableId="1874995042">
     <w:abstractNumId w:val="0"/>
   </w:num>
   <w:num w:numId="18" w16cid:durableId="339544418">
-    <w:abstractNumId w:val="40"/>
+    <w:abstractNumId w:val="41"/>
   </w:num>
   <w:num w:numId="19" w16cid:durableId="1699159306">
     <w:abstractNumId w:val="22"/>
@@ -23905,16 +22982,16 @@
     <w:abstractNumId w:val="1"/>
   </w:num>
   <w:num w:numId="23" w16cid:durableId="2109619588">
-    <w:abstractNumId w:val="35"/>
+    <w:abstractNumId w:val="36"/>
   </w:num>
   <w:num w:numId="24" w16cid:durableId="1387417741">
-    <w:abstractNumId w:val="45"/>
+    <w:abstractNumId w:val="46"/>
   </w:num>
   <w:num w:numId="25" w16cid:durableId="701327538">
     <w:abstractNumId w:val="18"/>
   </w:num>
   <w:num w:numId="26" w16cid:durableId="1284074440">
-    <w:abstractNumId w:val="37"/>
+    <w:abstractNumId w:val="38"/>
   </w:num>
   <w:num w:numId="27" w16cid:durableId="1174689253">
     <w:abstractNumId w:val="12"/>
@@ -23935,13 +23012,13 @@
     <w:abstractNumId w:val="13"/>
   </w:num>
   <w:num w:numId="33" w16cid:durableId="1830170944">
-    <w:abstractNumId w:val="47"/>
+    <w:abstractNumId w:val="48"/>
   </w:num>
   <w:num w:numId="34" w16cid:durableId="1161388337">
     <w:abstractNumId w:val="21"/>
   </w:num>
   <w:num w:numId="35" w16cid:durableId="1174996305">
-    <w:abstractNumId w:val="36"/>
+    <w:abstractNumId w:val="37"/>
   </w:num>
   <w:num w:numId="36" w16cid:durableId="1147235827">
     <w:abstractNumId w:val="20"/>
@@ -23953,13 +23030,13 @@
     <w:abstractNumId w:val="9"/>
   </w:num>
   <w:num w:numId="39" w16cid:durableId="2015960442">
-    <w:abstractNumId w:val="51"/>
+    <w:abstractNumId w:val="52"/>
   </w:num>
   <w:num w:numId="40" w16cid:durableId="940381558">
     <w:abstractNumId w:val="2"/>
   </w:num>
   <w:num w:numId="41" w16cid:durableId="1122577806">
-    <w:abstractNumId w:val="50"/>
+    <w:abstractNumId w:val="51"/>
   </w:num>
   <w:num w:numId="42" w16cid:durableId="400490635">
     <w:abstractNumId w:val="19"/>
@@ -23977,31 +23054,31 @@
     <w:abstractNumId w:val="23"/>
   </w:num>
   <w:num w:numId="47" w16cid:durableId="1158958097">
-    <w:abstractNumId w:val="34"/>
+    <w:abstractNumId w:val="35"/>
     <w:lvlOverride w:ilvl="0">
       <w:startOverride w:val="1"/>
     </w:lvlOverride>
   </w:num>
   <w:num w:numId="48" w16cid:durableId="598098077">
-    <w:abstractNumId w:val="34"/>
+    <w:abstractNumId w:val="35"/>
     <w:lvlOverride w:ilvl="0">
       <w:startOverride w:val="2"/>
     </w:lvlOverride>
   </w:num>
   <w:num w:numId="49" w16cid:durableId="1560165727">
-    <w:abstractNumId w:val="34"/>
+    <w:abstractNumId w:val="35"/>
     <w:lvlOverride w:ilvl="0">
       <w:startOverride w:val="3"/>
     </w:lvlOverride>
   </w:num>
   <w:num w:numId="50" w16cid:durableId="377124950">
-    <w:abstractNumId w:val="34"/>
+    <w:abstractNumId w:val="35"/>
     <w:lvlOverride w:ilvl="0">
       <w:startOverride w:val="4"/>
     </w:lvlOverride>
   </w:num>
   <w:num w:numId="51" w16cid:durableId="607812016">
-    <w:abstractNumId w:val="34"/>
+    <w:abstractNumId w:val="35"/>
     <w:lvlOverride w:ilvl="0">
       <w:startOverride w:val="5"/>
     </w:lvlOverride>
@@ -24019,7 +23096,10 @@
     <w:abstractNumId w:val="7"/>
   </w:num>
   <w:num w:numId="56" w16cid:durableId="1164783749">
-    <w:abstractNumId w:val="39"/>
+    <w:abstractNumId w:val="40"/>
+  </w:num>
+  <w:num w:numId="57" w16cid:durableId="913005098">
+    <w:abstractNumId w:val="34"/>
   </w:num>
   <w:numIdMacAtCleanup w:val="51"/>
 </w:numbering>

</xml_diff>

<commit_message>
docker files for deployment
</commit_message>
<xml_diff>
--- a/Documentation_demo/Documentation.docx
+++ b/Documentation_demo/Documentation.docx
@@ -5748,13 +5748,7 @@
         <w:rPr>
           <w:rFonts w:asciiTheme="minorHAnsi" w:hAnsiTheme="minorHAnsi" w:cstheme="minorHAnsi"/>
         </w:rPr>
-        <w:t>Add the key to an environment variable</w:t>
-      </w:r>
-      <w:r>
-        <w:rPr>
-          <w:rFonts w:asciiTheme="minorHAnsi" w:hAnsiTheme="minorHAnsi" w:cstheme="minorHAnsi"/>
-        </w:rPr>
-        <w:t>, create a .env file in your folder and add the key in following format:</w:t>
+        <w:t>Add the key to an environment variable, create a .env file in your folder and add the key in following format:</w:t>
       </w:r>
     </w:p>
     <w:p>
@@ -16574,6 +16568,7 @@
       <w:r>
         <w:rPr>
           <w:rFonts w:cstheme="minorHAnsi"/>
+          <w:noProof/>
           <w:sz w:val="24"/>
           <w:szCs w:val="24"/>
         </w:rPr>
@@ -16658,6 +16653,7 @@
       <w:r>
         <w:rPr>
           <w:rFonts w:cstheme="minorHAnsi"/>
+          <w:noProof/>
           <w:sz w:val="24"/>
           <w:szCs w:val="24"/>
         </w:rPr>
@@ -16745,6 +16741,7 @@
       <w:r>
         <w:rPr>
           <w:rFonts w:cstheme="minorHAnsi"/>
+          <w:noProof/>
           <w:sz w:val="24"/>
           <w:szCs w:val="24"/>
         </w:rPr>
@@ -16829,6 +16826,7 @@
       <w:r>
         <w:rPr>
           <w:rFonts w:cstheme="minorHAnsi"/>
+          <w:noProof/>
           <w:sz w:val="24"/>
           <w:szCs w:val="24"/>
         </w:rPr>
@@ -16935,6 +16933,7 @@
       <w:r>
         <w:rPr>
           <w:rFonts w:cstheme="minorHAnsi"/>
+          <w:noProof/>
           <w:sz w:val="24"/>
           <w:szCs w:val="24"/>
         </w:rPr>
@@ -17019,6 +17018,7 @@
       <w:r>
         <w:rPr>
           <w:rFonts w:cstheme="minorHAnsi"/>
+          <w:noProof/>
           <w:sz w:val="24"/>
           <w:szCs w:val="24"/>
         </w:rPr>
@@ -17786,17 +17786,7 @@
           <w:szCs w:val="24"/>
         </w:rPr>
         <w:lastRenderedPageBreak/>
-        <w:t xml:space="preserve">Results with </w:t>
-      </w:r>
-      <w:r>
-        <w:rPr>
-          <w:rFonts w:cstheme="minorHAnsi"/>
-          <w:b/>
-          <w:bCs/>
-          <w:sz w:val="24"/>
-          <w:szCs w:val="24"/>
-        </w:rPr>
-        <w:t>Mistral inference API key:</w:t>
+        <w:t>Results with Mistral inference API key:</w:t>
       </w:r>
     </w:p>
     <w:tbl>
@@ -29223,6 +29213,2719 @@
     </w:p>
     <w:p>
       <w:pPr>
+        <w:pStyle w:val="ListParagraph"/>
+        <w:jc w:val="both"/>
+        <w:rPr>
+          <w:rFonts w:cstheme="minorHAnsi"/>
+          <w:i/>
+          <w:iCs/>
+          <w:sz w:val="24"/>
+          <w:szCs w:val="24"/>
+          <w:u w:val="single"/>
+        </w:rPr>
+      </w:pPr>
+      <w:r>
+        <w:rPr>
+          <w:rFonts w:cstheme="minorHAnsi"/>
+          <w:i/>
+          <w:iCs/>
+          <w:sz w:val="24"/>
+          <w:szCs w:val="24"/>
+          <w:u w:val="single"/>
+        </w:rPr>
+        <w:t>Deployment flow:</w:t>
+      </w:r>
+    </w:p>
+    <w:p>
+      <w:pPr>
+        <w:pStyle w:val="ListParagraph"/>
+        <w:jc w:val="both"/>
+        <w:rPr>
+          <w:rFonts w:cstheme="minorHAnsi"/>
+          <w:sz w:val="24"/>
+          <w:szCs w:val="24"/>
+        </w:rPr>
+      </w:pPr>
+    </w:p>
+    <w:p>
+      <w:pPr>
+        <w:pStyle w:val="ListParagraph"/>
+        <w:jc w:val="both"/>
+        <w:rPr>
+          <w:rFonts w:cstheme="minorHAnsi"/>
+          <w:sz w:val="24"/>
+          <w:szCs w:val="24"/>
+        </w:rPr>
+      </w:pPr>
+      <w:r>
+        <w:rPr>
+          <w:rFonts w:cstheme="minorHAnsi"/>
+          <w:sz w:val="24"/>
+          <w:szCs w:val="24"/>
+        </w:rPr>
+        <w:t xml:space="preserve">Project -&gt; </w:t>
+      </w:r>
+      <w:proofErr w:type="spellStart"/>
+      <w:r>
+        <w:rPr>
+          <w:rFonts w:cstheme="minorHAnsi"/>
+          <w:sz w:val="24"/>
+          <w:szCs w:val="24"/>
+        </w:rPr>
+        <w:t>Dockerfile</w:t>
+      </w:r>
+      <w:proofErr w:type="spellEnd"/>
+      <w:r>
+        <w:rPr>
+          <w:rFonts w:cstheme="minorHAnsi"/>
+          <w:sz w:val="24"/>
+          <w:szCs w:val="24"/>
+        </w:rPr>
+        <w:t xml:space="preserve"> -&gt; image -&gt; container -&gt; </w:t>
+      </w:r>
+      <w:proofErr w:type="spellStart"/>
+      <w:r>
+        <w:rPr>
+          <w:rFonts w:cstheme="minorHAnsi"/>
+          <w:sz w:val="24"/>
+          <w:szCs w:val="24"/>
+        </w:rPr>
+        <w:t>huggingface</w:t>
+      </w:r>
+      <w:proofErr w:type="spellEnd"/>
+      <w:r>
+        <w:rPr>
+          <w:rFonts w:cstheme="minorHAnsi"/>
+          <w:sz w:val="24"/>
+          <w:szCs w:val="24"/>
+        </w:rPr>
+        <w:t xml:space="preserve"> spaces</w:t>
+      </w:r>
+    </w:p>
+    <w:p>
+      <w:pPr>
+        <w:pStyle w:val="ListParagraph"/>
+        <w:jc w:val="both"/>
+        <w:rPr>
+          <w:rFonts w:cstheme="minorHAnsi"/>
+          <w:sz w:val="24"/>
+          <w:szCs w:val="24"/>
+        </w:rPr>
+      </w:pPr>
+    </w:p>
+    <w:p>
+      <w:pPr>
+        <w:pStyle w:val="ListParagraph"/>
+        <w:jc w:val="both"/>
+        <w:rPr>
+          <w:rFonts w:cstheme="minorHAnsi"/>
+          <w:i/>
+          <w:iCs/>
+          <w:sz w:val="24"/>
+          <w:szCs w:val="24"/>
+          <w:u w:val="single"/>
+        </w:rPr>
+      </w:pPr>
+      <w:r>
+        <w:rPr>
+          <w:rFonts w:cstheme="minorHAnsi"/>
+          <w:i/>
+          <w:iCs/>
+          <w:sz w:val="24"/>
+          <w:szCs w:val="24"/>
+          <w:u w:val="single"/>
+        </w:rPr>
+        <w:t>Testing locally:</w:t>
+      </w:r>
+    </w:p>
+    <w:p>
+      <w:pPr>
+        <w:pStyle w:val="ListParagraph"/>
+        <w:jc w:val="both"/>
+        <w:rPr>
+          <w:rFonts w:cstheme="minorHAnsi"/>
+          <w:sz w:val="24"/>
+          <w:szCs w:val="24"/>
+        </w:rPr>
+      </w:pPr>
+      <w:r>
+        <w:rPr>
+          <w:rFonts w:cstheme="minorHAnsi"/>
+          <w:sz w:val="24"/>
+          <w:szCs w:val="24"/>
+        </w:rPr>
+        <w:t>First check if project works in local system before creating docker container.</w:t>
+      </w:r>
+    </w:p>
+    <w:p>
+      <w:pPr>
+        <w:pStyle w:val="ListParagraph"/>
+        <w:jc w:val="both"/>
+        <w:rPr>
+          <w:rFonts w:cstheme="minorHAnsi"/>
+          <w:sz w:val="24"/>
+          <w:szCs w:val="24"/>
+        </w:rPr>
+      </w:pPr>
+    </w:p>
+    <w:p>
+      <w:pPr>
+        <w:pStyle w:val="ListParagraph"/>
+        <w:jc w:val="both"/>
+        <w:rPr>
+          <w:rFonts w:cstheme="minorHAnsi"/>
+          <w:sz w:val="24"/>
+          <w:szCs w:val="24"/>
+        </w:rPr>
+      </w:pPr>
+      <w:r>
+        <w:rPr>
+          <w:rFonts w:cstheme="minorHAnsi"/>
+          <w:sz w:val="24"/>
+          <w:szCs w:val="24"/>
+        </w:rPr>
+        <w:t>O</w:t>
+      </w:r>
+      <w:r>
+        <w:rPr>
+          <w:rFonts w:cstheme="minorHAnsi"/>
+          <w:sz w:val="24"/>
+          <w:szCs w:val="24"/>
+        </w:rPr>
+        <w:t xml:space="preserve">pen the </w:t>
+      </w:r>
+      <w:proofErr w:type="spellStart"/>
+      <w:r>
+        <w:rPr>
+          <w:rFonts w:cstheme="minorHAnsi"/>
+          <w:sz w:val="24"/>
+          <w:szCs w:val="24"/>
+        </w:rPr>
+        <w:t>git</w:t>
+      </w:r>
+      <w:proofErr w:type="spellEnd"/>
+      <w:r>
+        <w:rPr>
+          <w:rFonts w:cstheme="minorHAnsi"/>
+          <w:sz w:val="24"/>
+          <w:szCs w:val="24"/>
+        </w:rPr>
+        <w:t xml:space="preserve"> repo in which the main project code is present.</w:t>
+      </w:r>
+    </w:p>
+    <w:p>
+      <w:pPr>
+        <w:pStyle w:val="ListParagraph"/>
+        <w:jc w:val="both"/>
+        <w:rPr>
+          <w:rFonts w:cstheme="minorHAnsi"/>
+          <w:sz w:val="24"/>
+          <w:szCs w:val="24"/>
+        </w:rPr>
+      </w:pPr>
+      <w:proofErr w:type="spellStart"/>
+      <w:r>
+        <w:rPr>
+          <w:rFonts w:cstheme="minorHAnsi"/>
+          <w:sz w:val="24"/>
+          <w:szCs w:val="24"/>
+        </w:rPr>
+        <w:t>Eg.</w:t>
+      </w:r>
+      <w:proofErr w:type="spellEnd"/>
+      <w:r>
+        <w:rPr>
+          <w:rFonts w:cstheme="minorHAnsi"/>
+          <w:sz w:val="24"/>
+          <w:szCs w:val="24"/>
+        </w:rPr>
+        <w:t xml:space="preserve"> </w:t>
+      </w:r>
+    </w:p>
+    <w:p>
+      <w:pPr>
+        <w:pStyle w:val="ListParagraph"/>
+        <w:jc w:val="both"/>
+        <w:rPr>
+          <w:rFonts w:cstheme="minorHAnsi"/>
+          <w:sz w:val="24"/>
+          <w:szCs w:val="24"/>
+        </w:rPr>
+      </w:pPr>
+      <w:r>
+        <w:rPr>
+          <w:rFonts w:cstheme="minorHAnsi"/>
+          <w:sz w:val="24"/>
+          <w:szCs w:val="24"/>
+        </w:rPr>
+        <w:t xml:space="preserve">$ cd </w:t>
+      </w:r>
+      <w:proofErr w:type="spellStart"/>
+      <w:r>
+        <w:rPr>
+          <w:rFonts w:cstheme="minorHAnsi"/>
+          <w:sz w:val="24"/>
+          <w:szCs w:val="24"/>
+        </w:rPr>
+        <w:t>your_git_repo_path</w:t>
+      </w:r>
+      <w:proofErr w:type="spellEnd"/>
+      <w:r>
+        <w:rPr>
+          <w:rFonts w:cstheme="minorHAnsi"/>
+          <w:sz w:val="24"/>
+          <w:szCs w:val="24"/>
+        </w:rPr>
+        <w:t>/</w:t>
+      </w:r>
+    </w:p>
+    <w:p>
+      <w:pPr>
+        <w:pStyle w:val="ListParagraph"/>
+        <w:jc w:val="both"/>
+        <w:rPr>
+          <w:rFonts w:cstheme="minorHAnsi"/>
+          <w:sz w:val="24"/>
+          <w:szCs w:val="24"/>
+        </w:rPr>
+      </w:pPr>
+      <w:r>
+        <w:rPr>
+          <w:rFonts w:cstheme="minorHAnsi"/>
+          <w:sz w:val="24"/>
+          <w:szCs w:val="24"/>
+        </w:rPr>
+        <w:t xml:space="preserve">Check if </w:t>
+      </w:r>
+      <w:proofErr w:type="gramStart"/>
+      <w:r>
+        <w:rPr>
+          <w:rFonts w:cstheme="minorHAnsi"/>
+          <w:sz w:val="24"/>
+          <w:szCs w:val="24"/>
+        </w:rPr>
+        <w:t>following  files</w:t>
+      </w:r>
+      <w:proofErr w:type="gramEnd"/>
+      <w:r>
+        <w:rPr>
+          <w:rFonts w:cstheme="minorHAnsi"/>
+          <w:sz w:val="24"/>
+          <w:szCs w:val="24"/>
+        </w:rPr>
+        <w:t xml:space="preserve"> </w:t>
+      </w:r>
+      <w:proofErr w:type="gramStart"/>
+      <w:r>
+        <w:rPr>
+          <w:rFonts w:cstheme="minorHAnsi"/>
+          <w:sz w:val="24"/>
+          <w:szCs w:val="24"/>
+        </w:rPr>
+        <w:t>and .git</w:t>
+      </w:r>
+      <w:proofErr w:type="gramEnd"/>
+      <w:r>
+        <w:rPr>
+          <w:rFonts w:cstheme="minorHAnsi"/>
+          <w:sz w:val="24"/>
+          <w:szCs w:val="24"/>
+        </w:rPr>
+        <w:t xml:space="preserve"> is present inside the folder.</w:t>
+      </w:r>
+    </w:p>
+    <w:p>
+      <w:pPr>
+        <w:pStyle w:val="ListParagraph"/>
+        <w:jc w:val="both"/>
+        <w:rPr>
+          <w:rFonts w:cstheme="minorHAnsi"/>
+          <w:sz w:val="24"/>
+          <w:szCs w:val="24"/>
+        </w:rPr>
+      </w:pPr>
+    </w:p>
+    <w:p>
+      <w:pPr>
+        <w:pStyle w:val="ListParagraph"/>
+        <w:jc w:val="both"/>
+        <w:rPr>
+          <w:rFonts w:cstheme="minorHAnsi"/>
+          <w:sz w:val="24"/>
+          <w:szCs w:val="24"/>
+        </w:rPr>
+      </w:pPr>
+      <w:r>
+        <w:rPr>
+          <w:rFonts w:cstheme="minorHAnsi"/>
+          <w:sz w:val="24"/>
+          <w:szCs w:val="24"/>
+        </w:rPr>
+        <w:drawing>
+          <wp:inline distT="0" distB="0" distL="0" distR="0" wp14:anchorId="4CA7C85B" wp14:editId="5BBE1BAE">
+            <wp:extent cx="5953760" cy="380003"/>
+            <wp:effectExtent l="0" t="0" r="0" b="1270"/>
+            <wp:docPr id="1652486900" name="Picture 1"/>
+            <wp:cNvGraphicFramePr>
+              <a:graphicFrameLocks xmlns:a="http://schemas.openxmlformats.org/drawingml/2006/main" noChangeAspect="1"/>
+            </wp:cNvGraphicFramePr>
+            <a:graphic xmlns:a="http://schemas.openxmlformats.org/drawingml/2006/main">
+              <a:graphicData uri="http://schemas.openxmlformats.org/drawingml/2006/picture">
+                <pic:pic xmlns:pic="http://schemas.openxmlformats.org/drawingml/2006/picture">
+                  <pic:nvPicPr>
+                    <pic:cNvPr id="911586434" name=""/>
+                    <pic:cNvPicPr/>
+                  </pic:nvPicPr>
+                  <pic:blipFill>
+                    <a:blip r:embed="rId27"/>
+                    <a:stretch>
+                      <a:fillRect/>
+                    </a:stretch>
+                  </pic:blipFill>
+                  <pic:spPr>
+                    <a:xfrm>
+                      <a:off x="0" y="0"/>
+                      <a:ext cx="5965974" cy="380783"/>
+                    </a:xfrm>
+                    <a:prstGeom prst="rect">
+                      <a:avLst/>
+                    </a:prstGeom>
+                  </pic:spPr>
+                </pic:pic>
+              </a:graphicData>
+            </a:graphic>
+          </wp:inline>
+        </w:drawing>
+      </w:r>
+    </w:p>
+    <w:p>
+      <w:pPr>
+        <w:pStyle w:val="ListParagraph"/>
+        <w:jc w:val="both"/>
+        <w:rPr>
+          <w:rFonts w:cstheme="minorHAnsi"/>
+          <w:sz w:val="24"/>
+          <w:szCs w:val="24"/>
+        </w:rPr>
+      </w:pPr>
+    </w:p>
+    <w:p>
+      <w:pPr>
+        <w:pStyle w:val="ListParagraph"/>
+        <w:jc w:val="both"/>
+        <w:rPr>
+          <w:rFonts w:cstheme="minorHAnsi"/>
+          <w:sz w:val="24"/>
+          <w:szCs w:val="24"/>
+        </w:rPr>
+      </w:pPr>
+      <w:r>
+        <w:rPr>
+          <w:rFonts w:cstheme="minorHAnsi"/>
+          <w:sz w:val="24"/>
+          <w:szCs w:val="24"/>
+        </w:rPr>
+        <w:t>Activate the virtual environment:</w:t>
+      </w:r>
+    </w:p>
+    <w:p>
+      <w:pPr>
+        <w:pStyle w:val="ListParagraph"/>
+        <w:jc w:val="both"/>
+        <w:rPr>
+          <w:rFonts w:cstheme="minorHAnsi"/>
+          <w:i/>
+          <w:iCs/>
+          <w:sz w:val="24"/>
+          <w:szCs w:val="24"/>
+        </w:rPr>
+      </w:pPr>
+      <w:r>
+        <w:rPr>
+          <w:rFonts w:cstheme="minorHAnsi"/>
+          <w:sz w:val="24"/>
+          <w:szCs w:val="24"/>
+        </w:rPr>
+        <w:t xml:space="preserve">$ </w:t>
+      </w:r>
+      <w:r>
+        <w:rPr>
+          <w:rFonts w:cstheme="minorHAnsi"/>
+          <w:i/>
+          <w:iCs/>
+          <w:sz w:val="24"/>
+          <w:szCs w:val="24"/>
+        </w:rPr>
+        <w:t xml:space="preserve">source </w:t>
+      </w:r>
+      <w:proofErr w:type="spellStart"/>
+      <w:r>
+        <w:rPr>
+          <w:rFonts w:cstheme="minorHAnsi"/>
+          <w:i/>
+          <w:iCs/>
+          <w:sz w:val="24"/>
+          <w:szCs w:val="24"/>
+        </w:rPr>
+        <w:t>RAG_venv</w:t>
+      </w:r>
+      <w:proofErr w:type="spellEnd"/>
+      <w:r>
+        <w:rPr>
+          <w:rFonts w:cstheme="minorHAnsi"/>
+          <w:i/>
+          <w:iCs/>
+          <w:sz w:val="24"/>
+          <w:szCs w:val="24"/>
+        </w:rPr>
+        <w:t>/Scripts/activate</w:t>
+      </w:r>
+    </w:p>
+    <w:p>
+      <w:pPr>
+        <w:pStyle w:val="ListParagraph"/>
+        <w:jc w:val="both"/>
+        <w:rPr>
+          <w:rFonts w:cstheme="minorHAnsi"/>
+          <w:sz w:val="24"/>
+          <w:szCs w:val="24"/>
+        </w:rPr>
+      </w:pPr>
+    </w:p>
+    <w:p>
+      <w:pPr>
+        <w:pStyle w:val="ListParagraph"/>
+        <w:jc w:val="both"/>
+        <w:rPr>
+          <w:rFonts w:cstheme="minorHAnsi"/>
+          <w:sz w:val="24"/>
+          <w:szCs w:val="24"/>
+        </w:rPr>
+      </w:pPr>
+      <w:r>
+        <w:rPr>
+          <w:rFonts w:cstheme="minorHAnsi"/>
+          <w:sz w:val="24"/>
+          <w:szCs w:val="24"/>
+        </w:rPr>
+        <w:t>Run following command to start the application:</w:t>
+      </w:r>
+    </w:p>
+    <w:p>
+      <w:pPr>
+        <w:pStyle w:val="ListParagraph"/>
+        <w:jc w:val="both"/>
+        <w:rPr>
+          <w:rFonts w:cstheme="minorHAnsi"/>
+          <w:sz w:val="24"/>
+          <w:szCs w:val="24"/>
+        </w:rPr>
+      </w:pPr>
+      <w:r>
+        <w:rPr>
+          <w:rFonts w:cstheme="minorHAnsi"/>
+          <w:sz w:val="24"/>
+          <w:szCs w:val="24"/>
+        </w:rPr>
+        <w:t xml:space="preserve">$ </w:t>
+      </w:r>
+      <w:proofErr w:type="spellStart"/>
+      <w:r>
+        <w:rPr>
+          <w:rFonts w:cstheme="minorHAnsi"/>
+          <w:i/>
+          <w:iCs/>
+          <w:sz w:val="24"/>
+          <w:szCs w:val="24"/>
+        </w:rPr>
+        <w:t>streamlit</w:t>
+      </w:r>
+      <w:proofErr w:type="spellEnd"/>
+      <w:r>
+        <w:rPr>
+          <w:rFonts w:cstheme="minorHAnsi"/>
+          <w:i/>
+          <w:iCs/>
+          <w:sz w:val="24"/>
+          <w:szCs w:val="24"/>
+        </w:rPr>
+        <w:t xml:space="preserve"> run src/app.py</w:t>
+      </w:r>
+    </w:p>
+    <w:p>
+      <w:pPr>
+        <w:pStyle w:val="ListParagraph"/>
+        <w:jc w:val="both"/>
+        <w:rPr>
+          <w:rFonts w:cstheme="minorHAnsi"/>
+          <w:sz w:val="24"/>
+          <w:szCs w:val="24"/>
+        </w:rPr>
+      </w:pPr>
+    </w:p>
+    <w:p>
+      <w:pPr>
+        <w:pStyle w:val="ListParagraph"/>
+        <w:jc w:val="both"/>
+        <w:rPr>
+          <w:rFonts w:cstheme="minorHAnsi"/>
+          <w:sz w:val="24"/>
+          <w:szCs w:val="24"/>
+        </w:rPr>
+      </w:pPr>
+      <w:r>
+        <w:rPr>
+          <w:rFonts w:cstheme="minorHAnsi"/>
+          <w:sz w:val="24"/>
+          <w:szCs w:val="24"/>
+        </w:rPr>
+        <w:t xml:space="preserve">Open </w:t>
+      </w:r>
+      <w:hyperlink r:id="rId28" w:history="1">
+        <w:r>
+          <w:rPr>
+            <w:rStyle w:val="Hyperlink"/>
+            <w:rFonts w:cstheme="minorHAnsi"/>
+            <w:sz w:val="24"/>
+            <w:szCs w:val="24"/>
+          </w:rPr>
+          <w:t>http://localhost:8501</w:t>
+        </w:r>
+      </w:hyperlink>
+      <w:r>
+        <w:rPr>
+          <w:rFonts w:cstheme="minorHAnsi"/>
+          <w:sz w:val="24"/>
+          <w:szCs w:val="24"/>
+        </w:rPr>
+        <w:t xml:space="preserve"> in browser and test the project.</w:t>
+      </w:r>
+    </w:p>
+    <w:p>
+      <w:pPr>
+        <w:pStyle w:val="ListParagraph"/>
+        <w:jc w:val="both"/>
+        <w:rPr>
+          <w:rFonts w:cstheme="minorHAnsi"/>
+          <w:sz w:val="24"/>
+          <w:szCs w:val="24"/>
+        </w:rPr>
+      </w:pPr>
+    </w:p>
+    <w:p>
+      <w:pPr>
+        <w:pStyle w:val="ListParagraph"/>
+        <w:jc w:val="both"/>
+        <w:rPr>
+          <w:rFonts w:cstheme="minorHAnsi"/>
+          <w:i/>
+          <w:iCs/>
+          <w:sz w:val="24"/>
+          <w:szCs w:val="24"/>
+          <w:u w:val="single"/>
+        </w:rPr>
+      </w:pPr>
+      <w:r>
+        <w:rPr>
+          <w:rFonts w:cstheme="minorHAnsi"/>
+          <w:i/>
+          <w:iCs/>
+          <w:sz w:val="24"/>
+          <w:szCs w:val="24"/>
+          <w:u w:val="single"/>
+        </w:rPr>
+        <w:t>Deployment steps:</w:t>
+      </w:r>
+    </w:p>
+    <w:p>
+      <w:pPr>
+        <w:pStyle w:val="ListParagraph"/>
+        <w:jc w:val="both"/>
+        <w:rPr>
+          <w:rFonts w:cstheme="minorHAnsi"/>
+          <w:sz w:val="24"/>
+          <w:szCs w:val="24"/>
+        </w:rPr>
+      </w:pPr>
+    </w:p>
+    <w:p>
+      <w:pPr>
+        <w:pStyle w:val="ListParagraph"/>
+        <w:jc w:val="both"/>
+        <w:rPr>
+          <w:rFonts w:cstheme="minorHAnsi"/>
+          <w:sz w:val="24"/>
+          <w:szCs w:val="24"/>
+        </w:rPr>
+      </w:pPr>
+      <w:r>
+        <w:rPr>
+          <w:rFonts w:cstheme="minorHAnsi"/>
+          <w:sz w:val="24"/>
+          <w:szCs w:val="24"/>
+        </w:rPr>
+        <w:t>Install docker for your system from following website:</w:t>
+      </w:r>
+    </w:p>
+    <w:p>
+      <w:pPr>
+        <w:pStyle w:val="ListParagraph"/>
+        <w:jc w:val="both"/>
+        <w:rPr>
+          <w:rFonts w:cstheme="minorHAnsi"/>
+          <w:sz w:val="24"/>
+          <w:szCs w:val="24"/>
+        </w:rPr>
+      </w:pPr>
+      <w:hyperlink r:id="rId29" w:history="1">
+        <w:r>
+          <w:rPr>
+            <w:rStyle w:val="Hyperlink"/>
+            <w:rFonts w:cstheme="minorHAnsi"/>
+            <w:sz w:val="24"/>
+            <w:szCs w:val="24"/>
+          </w:rPr>
+          <w:t>https://www.docker.com/</w:t>
+        </w:r>
+      </w:hyperlink>
+    </w:p>
+    <w:p>
+      <w:pPr>
+        <w:pStyle w:val="ListParagraph"/>
+        <w:jc w:val="both"/>
+        <w:rPr>
+          <w:rFonts w:cstheme="minorHAnsi"/>
+          <w:sz w:val="24"/>
+          <w:szCs w:val="24"/>
+        </w:rPr>
+      </w:pPr>
+    </w:p>
+    <w:p>
+      <w:pPr>
+        <w:pStyle w:val="ListParagraph"/>
+        <w:jc w:val="both"/>
+        <w:rPr>
+          <w:rFonts w:cstheme="minorHAnsi"/>
+          <w:sz w:val="24"/>
+          <w:szCs w:val="24"/>
+        </w:rPr>
+      </w:pPr>
+      <w:r>
+        <w:rPr>
+          <w:rFonts w:cstheme="minorHAnsi"/>
+          <w:b/>
+          <w:bCs/>
+          <w:sz w:val="24"/>
+          <w:szCs w:val="24"/>
+        </w:rPr>
+        <w:t>Note</w:t>
+      </w:r>
+      <w:r>
+        <w:rPr>
+          <w:rFonts w:cstheme="minorHAnsi"/>
+          <w:sz w:val="24"/>
+          <w:szCs w:val="24"/>
+        </w:rPr>
+        <w:t>: Don’t push .env files in deployment/</w:t>
+      </w:r>
+      <w:proofErr w:type="spellStart"/>
+      <w:r>
+        <w:rPr>
+          <w:rFonts w:cstheme="minorHAnsi"/>
+          <w:sz w:val="24"/>
+          <w:szCs w:val="24"/>
+        </w:rPr>
+        <w:t>github</w:t>
+      </w:r>
+      <w:proofErr w:type="spellEnd"/>
+      <w:r>
+        <w:rPr>
+          <w:rFonts w:cstheme="minorHAnsi"/>
+          <w:sz w:val="24"/>
+          <w:szCs w:val="24"/>
+        </w:rPr>
+        <w:t>. Keep them secret.</w:t>
+      </w:r>
+    </w:p>
+    <w:p>
+      <w:pPr>
+        <w:pStyle w:val="ListParagraph"/>
+        <w:jc w:val="both"/>
+        <w:rPr>
+          <w:rFonts w:cstheme="minorHAnsi"/>
+          <w:sz w:val="24"/>
+          <w:szCs w:val="24"/>
+        </w:rPr>
+      </w:pPr>
+      <w:r>
+        <w:rPr>
+          <w:rFonts w:cstheme="minorHAnsi"/>
+          <w:b/>
+          <w:bCs/>
+          <w:sz w:val="24"/>
+          <w:szCs w:val="24"/>
+        </w:rPr>
+        <w:t>Note</w:t>
+      </w:r>
+      <w:r>
+        <w:rPr>
+          <w:rFonts w:cstheme="minorHAnsi"/>
+          <w:sz w:val="24"/>
+          <w:szCs w:val="24"/>
+        </w:rPr>
+        <w:t>: Keep requirements.txt file updated with all dependencies required.</w:t>
+      </w:r>
+    </w:p>
+    <w:p>
+      <w:pPr>
+        <w:pStyle w:val="ListParagraph"/>
+        <w:jc w:val="both"/>
+        <w:rPr>
+          <w:rFonts w:cstheme="minorHAnsi"/>
+          <w:sz w:val="24"/>
+          <w:szCs w:val="24"/>
+        </w:rPr>
+      </w:pPr>
+    </w:p>
+    <w:p>
+      <w:pPr>
+        <w:pStyle w:val="ListParagraph"/>
+        <w:jc w:val="both"/>
+        <w:rPr>
+          <w:rFonts w:cstheme="minorHAnsi"/>
+          <w:sz w:val="24"/>
+          <w:szCs w:val="24"/>
+        </w:rPr>
+      </w:pPr>
+      <w:r>
+        <w:rPr>
+          <w:rFonts w:cstheme="minorHAnsi"/>
+          <w:sz w:val="24"/>
+          <w:szCs w:val="24"/>
+        </w:rPr>
+        <w:t xml:space="preserve">Make sure to have </w:t>
+      </w:r>
+      <w:proofErr w:type="spellStart"/>
+      <w:r>
+        <w:rPr>
+          <w:rFonts w:cstheme="minorHAnsi"/>
+          <w:sz w:val="24"/>
+          <w:szCs w:val="24"/>
+        </w:rPr>
+        <w:t>Dockerfile</w:t>
+      </w:r>
+      <w:proofErr w:type="spellEnd"/>
+      <w:r>
+        <w:rPr>
+          <w:rFonts w:cstheme="minorHAnsi"/>
+          <w:sz w:val="24"/>
+          <w:szCs w:val="24"/>
+        </w:rPr>
+        <w:t xml:space="preserve"> </w:t>
+      </w:r>
+      <w:proofErr w:type="gramStart"/>
+      <w:r>
+        <w:rPr>
+          <w:rFonts w:cstheme="minorHAnsi"/>
+          <w:sz w:val="24"/>
+          <w:szCs w:val="24"/>
+        </w:rPr>
+        <w:t>and .</w:t>
+      </w:r>
+      <w:proofErr w:type="spellStart"/>
+      <w:r>
+        <w:rPr>
+          <w:rFonts w:cstheme="minorHAnsi"/>
+          <w:sz w:val="24"/>
+          <w:szCs w:val="24"/>
+        </w:rPr>
+        <w:t>dockerignore</w:t>
+      </w:r>
+      <w:proofErr w:type="spellEnd"/>
+      <w:proofErr w:type="gramEnd"/>
+      <w:r>
+        <w:rPr>
+          <w:rFonts w:cstheme="minorHAnsi"/>
+          <w:sz w:val="24"/>
+          <w:szCs w:val="24"/>
+        </w:rPr>
+        <w:t xml:space="preserve"> </w:t>
+      </w:r>
+      <w:r>
+        <w:rPr>
+          <w:rFonts w:cstheme="minorHAnsi"/>
+          <w:sz w:val="24"/>
+          <w:szCs w:val="24"/>
+        </w:rPr>
+        <w:t>in main project directory.</w:t>
+      </w:r>
+    </w:p>
+    <w:p>
+      <w:pPr>
+        <w:pStyle w:val="ListParagraph"/>
+        <w:jc w:val="both"/>
+        <w:rPr>
+          <w:rFonts w:cstheme="minorHAnsi"/>
+          <w:sz w:val="24"/>
+          <w:szCs w:val="24"/>
+        </w:rPr>
+      </w:pPr>
+    </w:p>
+    <w:p>
+      <w:pPr>
+        <w:pStyle w:val="ListParagraph"/>
+        <w:jc w:val="both"/>
+        <w:rPr>
+          <w:rFonts w:cstheme="minorHAnsi"/>
+          <w:sz w:val="24"/>
+          <w:szCs w:val="24"/>
+        </w:rPr>
+      </w:pPr>
+      <w:r>
+        <w:rPr>
+          <w:rFonts w:cstheme="minorHAnsi"/>
+          <w:sz w:val="24"/>
+          <w:szCs w:val="24"/>
+        </w:rPr>
+        <w:t xml:space="preserve"># </w:t>
+      </w:r>
+      <w:proofErr w:type="gramStart"/>
+      <w:r>
+        <w:rPr>
+          <w:rFonts w:cstheme="minorHAnsi"/>
+          <w:sz w:val="24"/>
+          <w:szCs w:val="24"/>
+        </w:rPr>
+        <w:t>build</w:t>
+      </w:r>
+      <w:proofErr w:type="gramEnd"/>
+      <w:r>
+        <w:rPr>
+          <w:rFonts w:cstheme="minorHAnsi"/>
+          <w:sz w:val="24"/>
+          <w:szCs w:val="24"/>
+        </w:rPr>
+        <w:t xml:space="preserve"> docker container named “</w:t>
+      </w:r>
+      <w:proofErr w:type="spellStart"/>
+      <w:r>
+        <w:rPr>
+          <w:rFonts w:cstheme="minorHAnsi"/>
+          <w:sz w:val="24"/>
+          <w:szCs w:val="24"/>
+        </w:rPr>
+        <w:t>documind</w:t>
+      </w:r>
+      <w:proofErr w:type="spellEnd"/>
+      <w:r>
+        <w:rPr>
+          <w:rFonts w:cstheme="minorHAnsi"/>
+          <w:sz w:val="24"/>
+          <w:szCs w:val="24"/>
+        </w:rPr>
+        <w:t>-rag-app”</w:t>
+      </w:r>
+      <w:r>
+        <w:rPr>
+          <w:rFonts w:cstheme="minorHAnsi"/>
+          <w:sz w:val="24"/>
+          <w:szCs w:val="24"/>
+        </w:rPr>
+        <w:t xml:space="preserve"> for local testing before deployment on </w:t>
+      </w:r>
+      <w:proofErr w:type="spellStart"/>
+      <w:r>
+        <w:rPr>
+          <w:rFonts w:cstheme="minorHAnsi"/>
+          <w:sz w:val="24"/>
+          <w:szCs w:val="24"/>
+        </w:rPr>
+        <w:t>huggingface</w:t>
+      </w:r>
+      <w:proofErr w:type="spellEnd"/>
+      <w:r>
+        <w:rPr>
+          <w:rFonts w:cstheme="minorHAnsi"/>
+          <w:sz w:val="24"/>
+          <w:szCs w:val="24"/>
+        </w:rPr>
+        <w:t xml:space="preserve">  </w:t>
+      </w:r>
+    </w:p>
+    <w:p>
+      <w:pPr>
+        <w:pStyle w:val="ListParagraph"/>
+        <w:jc w:val="both"/>
+        <w:rPr>
+          <w:rFonts w:cstheme="minorHAnsi"/>
+          <w:sz w:val="24"/>
+          <w:szCs w:val="24"/>
+        </w:rPr>
+      </w:pPr>
+      <w:r>
+        <w:rPr>
+          <w:rFonts w:cstheme="minorHAnsi"/>
+          <w:sz w:val="24"/>
+          <w:szCs w:val="24"/>
+        </w:rPr>
+        <w:t xml:space="preserve">$ </w:t>
+      </w:r>
+      <w:r>
+        <w:rPr>
+          <w:rFonts w:cstheme="minorHAnsi"/>
+          <w:sz w:val="24"/>
+          <w:szCs w:val="24"/>
+        </w:rPr>
+        <w:t xml:space="preserve">docker build -t </w:t>
+      </w:r>
+      <w:proofErr w:type="spellStart"/>
+      <w:r>
+        <w:rPr>
+          <w:rFonts w:cstheme="minorHAnsi"/>
+          <w:sz w:val="24"/>
+          <w:szCs w:val="24"/>
+        </w:rPr>
+        <w:t>documind</w:t>
+      </w:r>
+      <w:proofErr w:type="spellEnd"/>
+      <w:r>
+        <w:rPr>
+          <w:rFonts w:cstheme="minorHAnsi"/>
+          <w:sz w:val="24"/>
+          <w:szCs w:val="24"/>
+        </w:rPr>
+        <w:t>-rag-</w:t>
+      </w:r>
+      <w:proofErr w:type="gramStart"/>
+      <w:r>
+        <w:rPr>
+          <w:rFonts w:cstheme="minorHAnsi"/>
+          <w:sz w:val="24"/>
+          <w:szCs w:val="24"/>
+        </w:rPr>
+        <w:t>app .</w:t>
+      </w:r>
+      <w:proofErr w:type="gramEnd"/>
+    </w:p>
+    <w:p>
+      <w:pPr>
+        <w:pStyle w:val="ListParagraph"/>
+        <w:jc w:val="both"/>
+        <w:rPr>
+          <w:rFonts w:cstheme="minorHAnsi"/>
+          <w:sz w:val="24"/>
+          <w:szCs w:val="24"/>
+        </w:rPr>
+      </w:pPr>
+      <w:r>
+        <w:rPr>
+          <w:rFonts w:cstheme="minorHAnsi"/>
+          <w:sz w:val="24"/>
+          <w:szCs w:val="24"/>
+        </w:rPr>
+        <w:t xml:space="preserve">$ docker run -p 8501:7860 </w:t>
+      </w:r>
+      <w:proofErr w:type="spellStart"/>
+      <w:r>
+        <w:rPr>
+          <w:rFonts w:cstheme="minorHAnsi"/>
+          <w:sz w:val="24"/>
+          <w:szCs w:val="24"/>
+        </w:rPr>
+        <w:t>documind</w:t>
+      </w:r>
+      <w:proofErr w:type="spellEnd"/>
+      <w:r>
+        <w:rPr>
+          <w:rFonts w:cstheme="minorHAnsi"/>
+          <w:sz w:val="24"/>
+          <w:szCs w:val="24"/>
+        </w:rPr>
+        <w:t>-rag-app</w:t>
+      </w:r>
+    </w:p>
+    <w:p>
+      <w:pPr>
+        <w:pStyle w:val="ListParagraph"/>
+        <w:jc w:val="both"/>
+        <w:rPr>
+          <w:rFonts w:cstheme="minorHAnsi"/>
+          <w:sz w:val="24"/>
+          <w:szCs w:val="24"/>
+        </w:rPr>
+      </w:pPr>
+    </w:p>
+    <w:p>
+      <w:pPr>
+        <w:pStyle w:val="ListParagraph"/>
+        <w:jc w:val="both"/>
+        <w:rPr>
+          <w:rFonts w:cstheme="minorHAnsi"/>
+          <w:sz w:val="24"/>
+          <w:szCs w:val="24"/>
+        </w:rPr>
+      </w:pPr>
+      <w:r>
+        <w:rPr>
+          <w:rFonts w:cstheme="minorHAnsi"/>
+          <w:sz w:val="24"/>
+          <w:szCs w:val="24"/>
+        </w:rPr>
+        <w:t xml:space="preserve">Now, open </w:t>
+      </w:r>
+      <w:hyperlink r:id="rId30" w:history="1">
+        <w:r>
+          <w:rPr>
+            <w:rStyle w:val="Hyperlink"/>
+            <w:rFonts w:cstheme="minorHAnsi"/>
+            <w:sz w:val="24"/>
+            <w:szCs w:val="24"/>
+          </w:rPr>
+          <w:t>http://localhost:8501</w:t>
+        </w:r>
+      </w:hyperlink>
+      <w:r>
+        <w:rPr>
+          <w:rFonts w:cstheme="minorHAnsi"/>
+          <w:sz w:val="24"/>
+          <w:szCs w:val="24"/>
+        </w:rPr>
+        <w:t xml:space="preserve"> in browser and test the project.</w:t>
+      </w:r>
+    </w:p>
+    <w:p>
+      <w:pPr>
+        <w:pStyle w:val="ListParagraph"/>
+        <w:jc w:val="both"/>
+        <w:rPr>
+          <w:rFonts w:cstheme="minorHAnsi"/>
+          <w:sz w:val="24"/>
+          <w:szCs w:val="24"/>
+        </w:rPr>
+      </w:pPr>
+    </w:p>
+    <w:p>
+      <w:pPr>
+        <w:pStyle w:val="ListParagraph"/>
+        <w:jc w:val="both"/>
+        <w:rPr>
+          <w:rFonts w:cstheme="minorHAnsi"/>
+          <w:sz w:val="24"/>
+          <w:szCs w:val="24"/>
+        </w:rPr>
+      </w:pPr>
+      <w:r>
+        <w:rPr>
+          <w:rFonts w:cstheme="minorHAnsi"/>
+          <w:sz w:val="24"/>
+          <w:szCs w:val="24"/>
+        </w:rPr>
+        <w:t xml:space="preserve">If it works, follow given steps to deploy it on </w:t>
+      </w:r>
+      <w:proofErr w:type="spellStart"/>
+      <w:r>
+        <w:rPr>
+          <w:rFonts w:cstheme="minorHAnsi"/>
+          <w:sz w:val="24"/>
+          <w:szCs w:val="24"/>
+        </w:rPr>
+        <w:t>huggingface</w:t>
+      </w:r>
+      <w:proofErr w:type="spellEnd"/>
+      <w:r>
+        <w:rPr>
+          <w:rFonts w:cstheme="minorHAnsi"/>
+          <w:sz w:val="24"/>
+          <w:szCs w:val="24"/>
+        </w:rPr>
+        <w:t xml:space="preserve"> spaces:</w:t>
+      </w:r>
+    </w:p>
+    <w:p>
+      <w:pPr>
+        <w:pStyle w:val="ListParagraph"/>
+        <w:jc w:val="both"/>
+        <w:rPr>
+          <w:rFonts w:cstheme="minorHAnsi"/>
+          <w:sz w:val="24"/>
+          <w:szCs w:val="24"/>
+        </w:rPr>
+      </w:pPr>
+    </w:p>
+    <w:p>
+      <w:pPr>
+        <w:pStyle w:val="ListParagraph"/>
+        <w:jc w:val="both"/>
+        <w:rPr>
+          <w:rFonts w:cstheme="minorHAnsi"/>
+          <w:sz w:val="24"/>
+          <w:szCs w:val="24"/>
+        </w:rPr>
+      </w:pPr>
+      <w:r>
+        <w:rPr>
+          <w:rFonts w:cstheme="minorHAnsi"/>
+          <w:sz w:val="24"/>
+          <w:szCs w:val="24"/>
+        </w:rPr>
+        <w:t>Stop any running container:</w:t>
+      </w:r>
+    </w:p>
+    <w:p>
+      <w:pPr>
+        <w:pStyle w:val="ListParagraph"/>
+        <w:jc w:val="both"/>
+        <w:rPr>
+          <w:rFonts w:cstheme="minorHAnsi"/>
+          <w:sz w:val="24"/>
+          <w:szCs w:val="24"/>
+        </w:rPr>
+      </w:pPr>
+      <w:r>
+        <w:rPr>
+          <w:rFonts w:cstheme="minorHAnsi"/>
+          <w:sz w:val="24"/>
+          <w:szCs w:val="24"/>
+        </w:rPr>
+        <w:t>$ d</w:t>
+      </w:r>
+      <w:r>
+        <w:rPr>
+          <w:rFonts w:cstheme="minorHAnsi"/>
+          <w:sz w:val="24"/>
+          <w:szCs w:val="24"/>
+        </w:rPr>
+        <w:t xml:space="preserve">ocker </w:t>
+      </w:r>
+      <w:proofErr w:type="spellStart"/>
+      <w:r>
+        <w:rPr>
+          <w:rFonts w:cstheme="minorHAnsi"/>
+          <w:sz w:val="24"/>
+          <w:szCs w:val="24"/>
+        </w:rPr>
+        <w:t>ps</w:t>
+      </w:r>
+      <w:proofErr w:type="spellEnd"/>
+    </w:p>
+    <w:p>
+      <w:pPr>
+        <w:pStyle w:val="ListParagraph"/>
+        <w:jc w:val="both"/>
+        <w:rPr>
+          <w:rFonts w:cstheme="minorHAnsi"/>
+          <w:sz w:val="24"/>
+          <w:szCs w:val="24"/>
+        </w:rPr>
+      </w:pPr>
+      <w:r>
+        <w:rPr>
+          <w:rFonts w:cstheme="minorHAnsi"/>
+          <w:sz w:val="24"/>
+          <w:szCs w:val="24"/>
+        </w:rPr>
+        <w:t xml:space="preserve">Note: container ID </w:t>
+      </w:r>
+    </w:p>
+    <w:p>
+      <w:pPr>
+        <w:pStyle w:val="ListParagraph"/>
+        <w:jc w:val="both"/>
+        <w:rPr>
+          <w:rFonts w:cstheme="minorHAnsi"/>
+          <w:sz w:val="24"/>
+          <w:szCs w:val="24"/>
+        </w:rPr>
+      </w:pPr>
+      <w:r>
+        <w:rPr>
+          <w:rFonts w:cstheme="minorHAnsi"/>
+          <w:sz w:val="24"/>
+          <w:szCs w:val="24"/>
+        </w:rPr>
+        <w:t xml:space="preserve">$ docker stop </w:t>
+      </w:r>
+      <w:proofErr w:type="spellStart"/>
+      <w:r>
+        <w:rPr>
+          <w:rFonts w:cstheme="minorHAnsi"/>
+          <w:sz w:val="24"/>
+          <w:szCs w:val="24"/>
+        </w:rPr>
+        <w:t>container_ID</w:t>
+      </w:r>
+      <w:proofErr w:type="spellEnd"/>
+    </w:p>
+    <w:p>
+      <w:pPr>
+        <w:pStyle w:val="ListParagraph"/>
+        <w:jc w:val="both"/>
+        <w:rPr>
+          <w:rFonts w:cstheme="minorHAnsi"/>
+          <w:sz w:val="24"/>
+          <w:szCs w:val="24"/>
+        </w:rPr>
+      </w:pPr>
+    </w:p>
+    <w:p>
+      <w:pPr>
+        <w:pStyle w:val="ListParagraph"/>
+        <w:numPr>
+          <w:ilvl w:val="1"/>
+          <w:numId w:val="42"/>
+        </w:numPr>
+        <w:jc w:val="both"/>
+        <w:rPr>
+          <w:rFonts w:cstheme="minorHAnsi"/>
+          <w:sz w:val="24"/>
+          <w:szCs w:val="24"/>
+        </w:rPr>
+      </w:pPr>
+      <w:r>
+        <w:rPr>
+          <w:rFonts w:cstheme="minorHAnsi"/>
+          <w:sz w:val="24"/>
+          <w:szCs w:val="24"/>
+        </w:rPr>
+        <w:t xml:space="preserve">Create </w:t>
+      </w:r>
+      <w:proofErr w:type="spellStart"/>
+      <w:r>
+        <w:rPr>
+          <w:rFonts w:cstheme="minorHAnsi"/>
+          <w:sz w:val="24"/>
+          <w:szCs w:val="24"/>
+        </w:rPr>
+        <w:t>huggingface</w:t>
+      </w:r>
+      <w:proofErr w:type="spellEnd"/>
+      <w:r>
+        <w:rPr>
+          <w:rFonts w:cstheme="minorHAnsi"/>
+          <w:sz w:val="24"/>
+          <w:szCs w:val="24"/>
+        </w:rPr>
+        <w:t xml:space="preserve"> account:</w:t>
+      </w:r>
+    </w:p>
+    <w:p>
+      <w:pPr>
+        <w:pStyle w:val="ListParagraph"/>
+        <w:ind w:left="1440"/>
+        <w:jc w:val="both"/>
+        <w:rPr>
+          <w:rFonts w:cstheme="minorHAnsi"/>
+          <w:sz w:val="24"/>
+          <w:szCs w:val="24"/>
+        </w:rPr>
+      </w:pPr>
+      <w:hyperlink r:id="rId31" w:history="1">
+        <w:r>
+          <w:rPr>
+            <w:rStyle w:val="Hyperlink"/>
+            <w:rFonts w:cstheme="minorHAnsi"/>
+            <w:sz w:val="24"/>
+            <w:szCs w:val="24"/>
+          </w:rPr>
+          <w:t>https://huggingface.co/</w:t>
+        </w:r>
+      </w:hyperlink>
+    </w:p>
+    <w:p>
+      <w:pPr>
+        <w:pStyle w:val="ListParagraph"/>
+        <w:numPr>
+          <w:ilvl w:val="1"/>
+          <w:numId w:val="42"/>
+        </w:numPr>
+        <w:jc w:val="both"/>
+        <w:rPr>
+          <w:rFonts w:cstheme="minorHAnsi"/>
+          <w:sz w:val="24"/>
+          <w:szCs w:val="24"/>
+        </w:rPr>
+      </w:pPr>
+      <w:r>
+        <w:rPr>
+          <w:rFonts w:cstheme="minorHAnsi"/>
+          <w:sz w:val="24"/>
+          <w:szCs w:val="24"/>
+        </w:rPr>
+        <w:t>Create new space:</w:t>
+      </w:r>
+    </w:p>
+    <w:p>
+      <w:pPr>
+        <w:pStyle w:val="ListParagraph"/>
+        <w:ind w:left="1440"/>
+        <w:jc w:val="both"/>
+        <w:rPr>
+          <w:rFonts w:cstheme="minorHAnsi"/>
+          <w:sz w:val="24"/>
+          <w:szCs w:val="24"/>
+        </w:rPr>
+      </w:pPr>
+      <w:r>
+        <w:rPr>
+          <w:rFonts w:cstheme="minorHAnsi"/>
+          <w:sz w:val="24"/>
+          <w:szCs w:val="24"/>
+        </w:rPr>
+        <w:t>Move to spaces tab -&gt; click on “new space”.</w:t>
+      </w:r>
+    </w:p>
+    <w:p>
+      <w:pPr>
+        <w:pStyle w:val="ListParagraph"/>
+        <w:ind w:left="1440"/>
+        <w:jc w:val="both"/>
+        <w:rPr>
+          <w:rFonts w:cstheme="minorHAnsi"/>
+          <w:sz w:val="24"/>
+          <w:szCs w:val="24"/>
+        </w:rPr>
+      </w:pPr>
+      <w:r>
+        <w:rPr>
+          <w:rFonts w:cstheme="minorHAnsi"/>
+          <w:sz w:val="24"/>
+          <w:szCs w:val="24"/>
+        </w:rPr>
+        <w:t>Give name to space</w:t>
+      </w:r>
+    </w:p>
+    <w:p>
+      <w:pPr>
+        <w:pStyle w:val="ListParagraph"/>
+        <w:ind w:left="1440"/>
+        <w:jc w:val="both"/>
+        <w:rPr>
+          <w:rFonts w:cstheme="minorHAnsi"/>
+          <w:sz w:val="24"/>
+          <w:szCs w:val="24"/>
+        </w:rPr>
+      </w:pPr>
+      <w:r>
+        <w:rPr>
+          <w:rFonts w:cstheme="minorHAnsi"/>
+          <w:sz w:val="24"/>
+          <w:szCs w:val="24"/>
+        </w:rPr>
+        <w:t xml:space="preserve">Select </w:t>
+      </w:r>
+      <w:proofErr w:type="gramStart"/>
+      <w:r>
+        <w:rPr>
+          <w:rFonts w:cstheme="minorHAnsi"/>
+          <w:sz w:val="24"/>
+          <w:szCs w:val="24"/>
+        </w:rPr>
+        <w:t>SDK :</w:t>
+      </w:r>
+      <w:proofErr w:type="gramEnd"/>
+      <w:r>
+        <w:rPr>
+          <w:rFonts w:cstheme="minorHAnsi"/>
+          <w:sz w:val="24"/>
+          <w:szCs w:val="24"/>
+        </w:rPr>
+        <w:t xml:space="preserve"> Docker</w:t>
+      </w:r>
+    </w:p>
+    <w:p>
+      <w:pPr>
+        <w:pStyle w:val="ListParagraph"/>
+        <w:ind w:left="1440"/>
+        <w:jc w:val="both"/>
+        <w:rPr>
+          <w:rFonts w:cstheme="minorHAnsi"/>
+          <w:sz w:val="24"/>
+          <w:szCs w:val="24"/>
+        </w:rPr>
+      </w:pPr>
+      <w:r>
+        <w:rPr>
+          <w:rFonts w:cstheme="minorHAnsi"/>
+          <w:sz w:val="24"/>
+          <w:szCs w:val="24"/>
+        </w:rPr>
+        <w:t xml:space="preserve">Docker </w:t>
+      </w:r>
+      <w:proofErr w:type="gramStart"/>
+      <w:r>
+        <w:rPr>
+          <w:rFonts w:cstheme="minorHAnsi"/>
+          <w:sz w:val="24"/>
+          <w:szCs w:val="24"/>
+        </w:rPr>
+        <w:t>template :</w:t>
+      </w:r>
+      <w:proofErr w:type="gramEnd"/>
+      <w:r>
+        <w:rPr>
+          <w:rFonts w:cstheme="minorHAnsi"/>
+          <w:sz w:val="24"/>
+          <w:szCs w:val="24"/>
+        </w:rPr>
+        <w:t xml:space="preserve"> blank</w:t>
+      </w:r>
+    </w:p>
+    <w:p>
+      <w:pPr>
+        <w:pStyle w:val="ListParagraph"/>
+        <w:ind w:left="1440"/>
+        <w:jc w:val="both"/>
+        <w:rPr>
+          <w:rFonts w:cstheme="minorHAnsi"/>
+          <w:sz w:val="24"/>
+          <w:szCs w:val="24"/>
+        </w:rPr>
+      </w:pPr>
+      <w:r>
+        <w:rPr>
+          <w:rFonts w:cstheme="minorHAnsi"/>
+          <w:sz w:val="24"/>
+          <w:szCs w:val="24"/>
+        </w:rPr>
+        <w:t xml:space="preserve">Space </w:t>
+      </w:r>
+      <w:proofErr w:type="gramStart"/>
+      <w:r>
+        <w:rPr>
+          <w:rFonts w:cstheme="minorHAnsi"/>
+          <w:sz w:val="24"/>
+          <w:szCs w:val="24"/>
+        </w:rPr>
+        <w:t>hardware :</w:t>
+      </w:r>
+      <w:proofErr w:type="gramEnd"/>
+      <w:r>
+        <w:rPr>
+          <w:rFonts w:cstheme="minorHAnsi"/>
+          <w:sz w:val="24"/>
+          <w:szCs w:val="24"/>
+        </w:rPr>
+        <w:t xml:space="preserve"> CPU basic</w:t>
+      </w:r>
+    </w:p>
+    <w:p>
+      <w:pPr>
+        <w:pStyle w:val="ListParagraph"/>
+        <w:ind w:left="1440"/>
+        <w:jc w:val="both"/>
+        <w:rPr>
+          <w:rFonts w:cstheme="minorHAnsi"/>
+          <w:sz w:val="24"/>
+          <w:szCs w:val="24"/>
+        </w:rPr>
+      </w:pPr>
+      <w:proofErr w:type="gramStart"/>
+      <w:r>
+        <w:rPr>
+          <w:rFonts w:cstheme="minorHAnsi"/>
+          <w:sz w:val="24"/>
+          <w:szCs w:val="24"/>
+        </w:rPr>
+        <w:t>Visibility :</w:t>
+      </w:r>
+      <w:proofErr w:type="gramEnd"/>
+      <w:r>
+        <w:rPr>
+          <w:rFonts w:cstheme="minorHAnsi"/>
+          <w:sz w:val="24"/>
+          <w:szCs w:val="24"/>
+        </w:rPr>
+        <w:t xml:space="preserve"> public </w:t>
+      </w:r>
+    </w:p>
+    <w:p>
+      <w:pPr>
+        <w:pStyle w:val="ListParagraph"/>
+        <w:ind w:left="1440"/>
+        <w:jc w:val="both"/>
+        <w:rPr>
+          <w:rFonts w:cstheme="minorHAnsi"/>
+          <w:sz w:val="24"/>
+          <w:szCs w:val="24"/>
+        </w:rPr>
+      </w:pPr>
+    </w:p>
+    <w:p>
+      <w:pPr>
+        <w:pStyle w:val="ListParagraph"/>
+        <w:numPr>
+          <w:ilvl w:val="1"/>
+          <w:numId w:val="42"/>
+        </w:numPr>
+        <w:jc w:val="both"/>
+        <w:rPr>
+          <w:rFonts w:cstheme="minorHAnsi"/>
+          <w:sz w:val="24"/>
+          <w:szCs w:val="24"/>
+        </w:rPr>
+      </w:pPr>
+      <w:r>
+        <w:rPr>
+          <w:rFonts w:cstheme="minorHAnsi"/>
+          <w:sz w:val="24"/>
+          <w:szCs w:val="24"/>
+        </w:rPr>
+        <w:t>Add secrets to spaces (environment variables, secret API key):</w:t>
+      </w:r>
+    </w:p>
+    <w:p>
+      <w:pPr>
+        <w:pStyle w:val="ListParagraph"/>
+        <w:ind w:left="1440"/>
+        <w:jc w:val="both"/>
+        <w:rPr>
+          <w:rFonts w:cstheme="minorHAnsi"/>
+          <w:sz w:val="24"/>
+          <w:szCs w:val="24"/>
+        </w:rPr>
+      </w:pPr>
+      <w:r>
+        <w:rPr>
+          <w:rFonts w:cstheme="minorHAnsi"/>
+          <w:sz w:val="24"/>
+          <w:szCs w:val="24"/>
+        </w:rPr>
+        <w:t>Open the newly created space -&gt; settings -&gt; variables and secrets section -&gt; New secret -&gt; Add secret key information:</w:t>
+      </w:r>
+    </w:p>
+    <w:p>
+      <w:pPr>
+        <w:pStyle w:val="ListParagraph"/>
+        <w:ind w:left="1440"/>
+        <w:jc w:val="both"/>
+        <w:rPr>
+          <w:rFonts w:cstheme="minorHAnsi"/>
+          <w:sz w:val="24"/>
+          <w:szCs w:val="24"/>
+        </w:rPr>
+      </w:pPr>
+      <w:proofErr w:type="gramStart"/>
+      <w:r>
+        <w:rPr>
+          <w:rFonts w:cstheme="minorHAnsi"/>
+          <w:sz w:val="24"/>
+          <w:szCs w:val="24"/>
+        </w:rPr>
+        <w:t>Name :</w:t>
+      </w:r>
+      <w:proofErr w:type="gramEnd"/>
+      <w:r>
+        <w:rPr>
+          <w:rFonts w:cstheme="minorHAnsi"/>
+          <w:sz w:val="24"/>
+          <w:szCs w:val="24"/>
+        </w:rPr>
+        <w:t xml:space="preserve"> </w:t>
+      </w:r>
+      <w:proofErr w:type="spellStart"/>
+      <w:r>
+        <w:rPr>
+          <w:rFonts w:cstheme="minorHAnsi"/>
+          <w:sz w:val="24"/>
+          <w:szCs w:val="24"/>
+        </w:rPr>
+        <w:t>Mistral_API</w:t>
+      </w:r>
+      <w:proofErr w:type="spellEnd"/>
+    </w:p>
+    <w:p>
+      <w:pPr>
+        <w:pStyle w:val="ListParagraph"/>
+        <w:ind w:left="1440"/>
+        <w:jc w:val="both"/>
+        <w:rPr>
+          <w:rFonts w:cstheme="minorHAnsi"/>
+          <w:sz w:val="24"/>
+          <w:szCs w:val="24"/>
+        </w:rPr>
+      </w:pPr>
+      <w:r>
+        <w:rPr>
+          <w:rFonts w:cstheme="minorHAnsi"/>
+          <w:sz w:val="24"/>
+          <w:szCs w:val="24"/>
+        </w:rPr>
+        <w:t>Value: your mistral API key</w:t>
+      </w:r>
+    </w:p>
+    <w:p>
+      <w:pPr>
+        <w:pStyle w:val="ListParagraph"/>
+        <w:ind w:left="1440"/>
+        <w:jc w:val="both"/>
+        <w:rPr>
+          <w:rFonts w:cstheme="minorHAnsi"/>
+          <w:sz w:val="24"/>
+          <w:szCs w:val="24"/>
+        </w:rPr>
+      </w:pPr>
+    </w:p>
+    <w:p>
+      <w:pPr>
+        <w:pStyle w:val="ListParagraph"/>
+        <w:numPr>
+          <w:ilvl w:val="1"/>
+          <w:numId w:val="42"/>
+        </w:numPr>
+        <w:jc w:val="both"/>
+        <w:rPr>
+          <w:rFonts w:cstheme="minorHAnsi"/>
+          <w:sz w:val="24"/>
+          <w:szCs w:val="24"/>
+        </w:rPr>
+      </w:pPr>
+      <w:r>
+        <w:rPr>
+          <w:rFonts w:cstheme="minorHAnsi"/>
+          <w:sz w:val="24"/>
+          <w:szCs w:val="24"/>
+        </w:rPr>
+        <w:t xml:space="preserve">Deploying to </w:t>
+      </w:r>
+      <w:proofErr w:type="spellStart"/>
+      <w:r>
+        <w:rPr>
+          <w:rFonts w:cstheme="minorHAnsi"/>
+          <w:sz w:val="24"/>
+          <w:szCs w:val="24"/>
+        </w:rPr>
+        <w:t>huggingface</w:t>
+      </w:r>
+      <w:proofErr w:type="spellEnd"/>
+      <w:r>
+        <w:rPr>
+          <w:rFonts w:cstheme="minorHAnsi"/>
+          <w:sz w:val="24"/>
+          <w:szCs w:val="24"/>
+        </w:rPr>
+        <w:t>:</w:t>
+      </w:r>
+    </w:p>
+    <w:p>
+      <w:pPr>
+        <w:pStyle w:val="ListParagraph"/>
+        <w:ind w:left="1440"/>
+        <w:jc w:val="both"/>
+        <w:rPr>
+          <w:rFonts w:cstheme="minorHAnsi"/>
+          <w:sz w:val="24"/>
+          <w:szCs w:val="24"/>
+        </w:rPr>
+      </w:pPr>
+      <w:r>
+        <w:rPr>
+          <w:rFonts w:cstheme="minorHAnsi"/>
+          <w:sz w:val="24"/>
+          <w:szCs w:val="24"/>
+        </w:rPr>
+        <w:t>First open the git repo in which the main project code is present.</w:t>
+      </w:r>
+    </w:p>
+    <w:p>
+      <w:pPr>
+        <w:pStyle w:val="ListParagraph"/>
+        <w:ind w:left="1440"/>
+        <w:jc w:val="both"/>
+        <w:rPr>
+          <w:rFonts w:cstheme="minorHAnsi"/>
+          <w:sz w:val="24"/>
+          <w:szCs w:val="24"/>
+        </w:rPr>
+      </w:pPr>
+      <w:proofErr w:type="spellStart"/>
+      <w:r>
+        <w:rPr>
+          <w:rFonts w:cstheme="minorHAnsi"/>
+          <w:sz w:val="24"/>
+          <w:szCs w:val="24"/>
+        </w:rPr>
+        <w:t>Eg.</w:t>
+      </w:r>
+      <w:proofErr w:type="spellEnd"/>
+      <w:r>
+        <w:rPr>
+          <w:rFonts w:cstheme="minorHAnsi"/>
+          <w:sz w:val="24"/>
+          <w:szCs w:val="24"/>
+        </w:rPr>
+        <w:t xml:space="preserve"> </w:t>
+      </w:r>
+    </w:p>
+    <w:p>
+      <w:pPr>
+        <w:pStyle w:val="ListParagraph"/>
+        <w:ind w:left="1440"/>
+        <w:jc w:val="both"/>
+        <w:rPr>
+          <w:rFonts w:cstheme="minorHAnsi"/>
+          <w:i/>
+          <w:iCs/>
+          <w:sz w:val="24"/>
+          <w:szCs w:val="24"/>
+        </w:rPr>
+      </w:pPr>
+      <w:r>
+        <w:rPr>
+          <w:rFonts w:cstheme="minorHAnsi"/>
+          <w:i/>
+          <w:iCs/>
+          <w:sz w:val="24"/>
+          <w:szCs w:val="24"/>
+        </w:rPr>
+        <w:t xml:space="preserve">$ cd </w:t>
+      </w:r>
+      <w:proofErr w:type="spellStart"/>
+      <w:r>
+        <w:rPr>
+          <w:rFonts w:cstheme="minorHAnsi"/>
+          <w:i/>
+          <w:iCs/>
+          <w:sz w:val="24"/>
+          <w:szCs w:val="24"/>
+        </w:rPr>
+        <w:t>your_git_repo_path</w:t>
+      </w:r>
+      <w:proofErr w:type="spellEnd"/>
+      <w:r>
+        <w:rPr>
+          <w:rFonts w:cstheme="minorHAnsi"/>
+          <w:i/>
+          <w:iCs/>
+          <w:sz w:val="24"/>
+          <w:szCs w:val="24"/>
+        </w:rPr>
+        <w:t>/</w:t>
+      </w:r>
+    </w:p>
+    <w:p>
+      <w:pPr>
+        <w:pStyle w:val="ListParagraph"/>
+        <w:ind w:left="1440"/>
+        <w:jc w:val="both"/>
+        <w:rPr>
+          <w:rFonts w:cstheme="minorHAnsi"/>
+          <w:sz w:val="24"/>
+          <w:szCs w:val="24"/>
+        </w:rPr>
+      </w:pPr>
+      <w:r>
+        <w:rPr>
+          <w:rFonts w:cstheme="minorHAnsi"/>
+          <w:sz w:val="24"/>
+          <w:szCs w:val="24"/>
+        </w:rPr>
+        <w:t xml:space="preserve">Check if </w:t>
+      </w:r>
+      <w:proofErr w:type="gramStart"/>
+      <w:r>
+        <w:rPr>
+          <w:rFonts w:cstheme="minorHAnsi"/>
+          <w:sz w:val="24"/>
+          <w:szCs w:val="24"/>
+        </w:rPr>
+        <w:t>following  files</w:t>
+      </w:r>
+      <w:proofErr w:type="gramEnd"/>
+      <w:r>
+        <w:rPr>
+          <w:rFonts w:cstheme="minorHAnsi"/>
+          <w:sz w:val="24"/>
+          <w:szCs w:val="24"/>
+        </w:rPr>
+        <w:t xml:space="preserve"> </w:t>
+      </w:r>
+      <w:proofErr w:type="gramStart"/>
+      <w:r>
+        <w:rPr>
+          <w:rFonts w:cstheme="minorHAnsi"/>
+          <w:sz w:val="24"/>
+          <w:szCs w:val="24"/>
+        </w:rPr>
+        <w:t>and .git</w:t>
+      </w:r>
+      <w:proofErr w:type="gramEnd"/>
+      <w:r>
+        <w:rPr>
+          <w:rFonts w:cstheme="minorHAnsi"/>
+          <w:sz w:val="24"/>
+          <w:szCs w:val="24"/>
+        </w:rPr>
+        <w:t xml:space="preserve"> is present inside the folder.</w:t>
+      </w:r>
+    </w:p>
+    <w:p>
+      <w:pPr>
+        <w:pStyle w:val="ListParagraph"/>
+        <w:ind w:left="1440"/>
+        <w:jc w:val="both"/>
+        <w:rPr>
+          <w:rFonts w:cstheme="minorHAnsi"/>
+          <w:sz w:val="24"/>
+          <w:szCs w:val="24"/>
+        </w:rPr>
+      </w:pPr>
+    </w:p>
+    <w:p>
+      <w:pPr>
+        <w:pStyle w:val="ListParagraph"/>
+        <w:ind w:left="1440"/>
+        <w:jc w:val="both"/>
+        <w:rPr>
+          <w:rFonts w:cstheme="minorHAnsi"/>
+          <w:sz w:val="24"/>
+          <w:szCs w:val="24"/>
+        </w:rPr>
+      </w:pPr>
+      <w:r>
+        <w:rPr>
+          <w:rFonts w:cstheme="minorHAnsi"/>
+          <w:sz w:val="24"/>
+          <w:szCs w:val="24"/>
+        </w:rPr>
+        <w:drawing>
+          <wp:inline distT="0" distB="0" distL="0" distR="0" wp14:anchorId="3A89189B" wp14:editId="236D9438">
+            <wp:extent cx="5953760" cy="380003"/>
+            <wp:effectExtent l="0" t="0" r="0" b="1270"/>
+            <wp:docPr id="911586434" name="Picture 1"/>
+            <wp:cNvGraphicFramePr>
+              <a:graphicFrameLocks xmlns:a="http://schemas.openxmlformats.org/drawingml/2006/main" noChangeAspect="1"/>
+            </wp:cNvGraphicFramePr>
+            <a:graphic xmlns:a="http://schemas.openxmlformats.org/drawingml/2006/main">
+              <a:graphicData uri="http://schemas.openxmlformats.org/drawingml/2006/picture">
+                <pic:pic xmlns:pic="http://schemas.openxmlformats.org/drawingml/2006/picture">
+                  <pic:nvPicPr>
+                    <pic:cNvPr id="911586434" name=""/>
+                    <pic:cNvPicPr/>
+                  </pic:nvPicPr>
+                  <pic:blipFill>
+                    <a:blip r:embed="rId27"/>
+                    <a:stretch>
+                      <a:fillRect/>
+                    </a:stretch>
+                  </pic:blipFill>
+                  <pic:spPr>
+                    <a:xfrm>
+                      <a:off x="0" y="0"/>
+                      <a:ext cx="5965974" cy="380783"/>
+                    </a:xfrm>
+                    <a:prstGeom prst="rect">
+                      <a:avLst/>
+                    </a:prstGeom>
+                  </pic:spPr>
+                </pic:pic>
+              </a:graphicData>
+            </a:graphic>
+          </wp:inline>
+        </w:drawing>
+      </w:r>
+    </w:p>
+    <w:p>
+      <w:pPr>
+        <w:pStyle w:val="ListParagraph"/>
+        <w:ind w:left="1440"/>
+        <w:jc w:val="both"/>
+        <w:rPr>
+          <w:rFonts w:cstheme="minorHAnsi"/>
+          <w:sz w:val="24"/>
+          <w:szCs w:val="24"/>
+        </w:rPr>
+      </w:pPr>
+    </w:p>
+    <w:p>
+      <w:pPr>
+        <w:pStyle w:val="ListParagraph"/>
+        <w:ind w:left="1440"/>
+        <w:jc w:val="both"/>
+        <w:rPr>
+          <w:rFonts w:cstheme="minorHAnsi"/>
+          <w:sz w:val="24"/>
+          <w:szCs w:val="24"/>
+        </w:rPr>
+      </w:pPr>
+      <w:r>
+        <w:rPr>
+          <w:rFonts w:cstheme="minorHAnsi"/>
+          <w:sz w:val="24"/>
+          <w:szCs w:val="24"/>
+        </w:rPr>
+        <w:t>Activate the virtual environment:</w:t>
+      </w:r>
+    </w:p>
+    <w:p>
+      <w:pPr>
+        <w:pStyle w:val="ListParagraph"/>
+        <w:ind w:left="1440"/>
+        <w:jc w:val="both"/>
+        <w:rPr>
+          <w:rFonts w:cstheme="minorHAnsi"/>
+          <w:i/>
+          <w:iCs/>
+          <w:sz w:val="24"/>
+          <w:szCs w:val="24"/>
+        </w:rPr>
+      </w:pPr>
+      <w:r>
+        <w:rPr>
+          <w:rFonts w:cstheme="minorHAnsi"/>
+          <w:sz w:val="24"/>
+          <w:szCs w:val="24"/>
+        </w:rPr>
+        <w:t xml:space="preserve">$ </w:t>
+      </w:r>
+      <w:r>
+        <w:rPr>
+          <w:rFonts w:cstheme="minorHAnsi"/>
+          <w:i/>
+          <w:iCs/>
+          <w:sz w:val="24"/>
+          <w:szCs w:val="24"/>
+        </w:rPr>
+        <w:t xml:space="preserve">source </w:t>
+      </w:r>
+      <w:proofErr w:type="spellStart"/>
+      <w:r>
+        <w:rPr>
+          <w:rFonts w:cstheme="minorHAnsi"/>
+          <w:i/>
+          <w:iCs/>
+          <w:sz w:val="24"/>
+          <w:szCs w:val="24"/>
+        </w:rPr>
+        <w:t>RAG_venv</w:t>
+      </w:r>
+      <w:proofErr w:type="spellEnd"/>
+      <w:r>
+        <w:rPr>
+          <w:rFonts w:cstheme="minorHAnsi"/>
+          <w:i/>
+          <w:iCs/>
+          <w:sz w:val="24"/>
+          <w:szCs w:val="24"/>
+        </w:rPr>
+        <w:t>/Scripts/activate</w:t>
+      </w:r>
+    </w:p>
+    <w:p>
+      <w:pPr>
+        <w:pStyle w:val="ListParagraph"/>
+        <w:ind w:left="1440"/>
+        <w:jc w:val="both"/>
+        <w:rPr>
+          <w:rFonts w:cstheme="minorHAnsi"/>
+          <w:sz w:val="24"/>
+          <w:szCs w:val="24"/>
+        </w:rPr>
+      </w:pPr>
+    </w:p>
+    <w:p>
+      <w:pPr>
+        <w:pStyle w:val="ListParagraph"/>
+        <w:ind w:left="1440"/>
+        <w:jc w:val="both"/>
+        <w:rPr>
+          <w:rFonts w:cstheme="minorHAnsi"/>
+          <w:sz w:val="24"/>
+          <w:szCs w:val="24"/>
+        </w:rPr>
+      </w:pPr>
+      <w:r>
+        <w:rPr>
+          <w:rFonts w:cstheme="minorHAnsi"/>
+          <w:sz w:val="24"/>
+          <w:szCs w:val="24"/>
+        </w:rPr>
+        <w:t>This repo is connected to git.</w:t>
+      </w:r>
+    </w:p>
+    <w:p>
+      <w:pPr>
+        <w:pStyle w:val="ListParagraph"/>
+        <w:ind w:left="1440"/>
+        <w:jc w:val="both"/>
+        <w:rPr>
+          <w:rFonts w:cstheme="minorHAnsi"/>
+          <w:sz w:val="24"/>
+          <w:szCs w:val="24"/>
+        </w:rPr>
+      </w:pPr>
+    </w:p>
+    <w:p>
+      <w:pPr>
+        <w:pStyle w:val="ListParagraph"/>
+        <w:ind w:left="1440"/>
+        <w:jc w:val="both"/>
+        <w:rPr>
+          <w:rFonts w:cstheme="minorHAnsi"/>
+          <w:sz w:val="24"/>
+          <w:szCs w:val="24"/>
+        </w:rPr>
+      </w:pPr>
+      <w:r>
+        <w:rPr>
+          <w:rFonts w:cstheme="minorHAnsi"/>
+          <w:sz w:val="24"/>
+          <w:szCs w:val="24"/>
+        </w:rPr>
+        <w:t xml:space="preserve">Add </w:t>
+      </w:r>
+      <w:proofErr w:type="spellStart"/>
+      <w:r>
+        <w:rPr>
+          <w:rFonts w:cstheme="minorHAnsi"/>
+          <w:sz w:val="24"/>
+          <w:szCs w:val="24"/>
+        </w:rPr>
+        <w:t>huggingface</w:t>
+      </w:r>
+      <w:proofErr w:type="spellEnd"/>
+      <w:r>
+        <w:rPr>
+          <w:rFonts w:cstheme="minorHAnsi"/>
+          <w:sz w:val="24"/>
+          <w:szCs w:val="24"/>
+        </w:rPr>
+        <w:t xml:space="preserve"> space repository remote for pushing this code to </w:t>
+      </w:r>
+      <w:proofErr w:type="spellStart"/>
+      <w:r>
+        <w:rPr>
+          <w:rFonts w:cstheme="minorHAnsi"/>
+          <w:sz w:val="24"/>
+          <w:szCs w:val="24"/>
+        </w:rPr>
+        <w:t>huggingface</w:t>
+      </w:r>
+      <w:proofErr w:type="spellEnd"/>
+      <w:r>
+        <w:rPr>
+          <w:rFonts w:cstheme="minorHAnsi"/>
+          <w:sz w:val="24"/>
+          <w:szCs w:val="24"/>
+        </w:rPr>
+        <w:t xml:space="preserve"> spaces. Once code is pushed, </w:t>
+      </w:r>
+      <w:proofErr w:type="spellStart"/>
+      <w:r>
+        <w:rPr>
+          <w:rFonts w:cstheme="minorHAnsi"/>
+          <w:sz w:val="24"/>
+          <w:szCs w:val="24"/>
+        </w:rPr>
+        <w:t>huggingface</w:t>
+      </w:r>
+      <w:proofErr w:type="spellEnd"/>
+      <w:r>
+        <w:rPr>
+          <w:rFonts w:cstheme="minorHAnsi"/>
+          <w:sz w:val="24"/>
+          <w:szCs w:val="24"/>
+        </w:rPr>
+        <w:t xml:space="preserve"> creates docker container from </w:t>
+      </w:r>
+      <w:proofErr w:type="spellStart"/>
+      <w:r>
+        <w:rPr>
+          <w:rFonts w:cstheme="minorHAnsi"/>
+          <w:sz w:val="24"/>
+          <w:szCs w:val="24"/>
+        </w:rPr>
+        <w:t>Dockerfile</w:t>
+      </w:r>
+      <w:proofErr w:type="spellEnd"/>
+      <w:r>
+        <w:rPr>
+          <w:rFonts w:cstheme="minorHAnsi"/>
+          <w:sz w:val="24"/>
+          <w:szCs w:val="24"/>
+        </w:rPr>
+        <w:t xml:space="preserve"> and starts running the container in the space.</w:t>
+      </w:r>
+    </w:p>
+    <w:p>
+      <w:pPr>
+        <w:pStyle w:val="ListParagraph"/>
+        <w:ind w:left="1440"/>
+        <w:jc w:val="both"/>
+        <w:rPr>
+          <w:rFonts w:cstheme="minorHAnsi"/>
+          <w:sz w:val="24"/>
+          <w:szCs w:val="24"/>
+        </w:rPr>
+      </w:pPr>
+    </w:p>
+    <w:p>
+      <w:pPr>
+        <w:pStyle w:val="ListParagraph"/>
+        <w:ind w:left="1440"/>
+        <w:jc w:val="both"/>
+        <w:rPr>
+          <w:rFonts w:cstheme="minorHAnsi"/>
+          <w:i/>
+          <w:iCs/>
+          <w:sz w:val="24"/>
+          <w:szCs w:val="24"/>
+        </w:rPr>
+      </w:pPr>
+      <w:r>
+        <w:rPr>
+          <w:rFonts w:cstheme="minorHAnsi"/>
+          <w:i/>
+          <w:iCs/>
+          <w:sz w:val="24"/>
+          <w:szCs w:val="24"/>
+        </w:rPr>
+        <w:t xml:space="preserve">$ </w:t>
+      </w:r>
+      <w:r>
+        <w:rPr>
+          <w:rFonts w:cstheme="minorHAnsi"/>
+          <w:i/>
+          <w:iCs/>
+          <w:sz w:val="24"/>
+          <w:szCs w:val="24"/>
+        </w:rPr>
+        <w:t xml:space="preserve">git remote add hf </w:t>
+      </w:r>
+      <w:hyperlink r:id="rId32" w:history="1">
+        <w:r>
+          <w:rPr>
+            <w:rStyle w:val="Hyperlink"/>
+            <w:rFonts w:cstheme="minorHAnsi"/>
+            <w:i/>
+            <w:iCs/>
+            <w:sz w:val="24"/>
+            <w:szCs w:val="24"/>
+          </w:rPr>
+          <w:t>https://huggingface.co/spaces/&lt;username&gt;/&lt;space-name</w:t>
+        </w:r>
+      </w:hyperlink>
+      <w:r>
+        <w:rPr>
+          <w:rFonts w:cstheme="minorHAnsi"/>
+          <w:i/>
+          <w:iCs/>
+          <w:sz w:val="24"/>
+          <w:szCs w:val="24"/>
+        </w:rPr>
+        <w:t>&gt;</w:t>
+      </w:r>
+    </w:p>
+    <w:p>
+      <w:pPr>
+        <w:pStyle w:val="ListParagraph"/>
+        <w:ind w:left="1440"/>
+        <w:jc w:val="both"/>
+        <w:rPr>
+          <w:rFonts w:cstheme="minorHAnsi"/>
+          <w:sz w:val="24"/>
+          <w:szCs w:val="24"/>
+        </w:rPr>
+      </w:pPr>
+    </w:p>
+    <w:p>
+      <w:pPr>
+        <w:pStyle w:val="ListParagraph"/>
+        <w:ind w:left="1440"/>
+        <w:jc w:val="both"/>
+        <w:rPr>
+          <w:rFonts w:cstheme="minorHAnsi"/>
+          <w:sz w:val="24"/>
+          <w:szCs w:val="24"/>
+        </w:rPr>
+      </w:pPr>
+      <w:r>
+        <w:rPr>
+          <w:rFonts w:cstheme="minorHAnsi"/>
+          <w:sz w:val="24"/>
+          <w:szCs w:val="24"/>
+        </w:rPr>
+        <w:t>Now check:</w:t>
+      </w:r>
+    </w:p>
+    <w:p>
+      <w:pPr>
+        <w:pStyle w:val="ListParagraph"/>
+        <w:ind w:left="1440"/>
+        <w:jc w:val="both"/>
+        <w:rPr>
+          <w:rFonts w:cstheme="minorHAnsi"/>
+          <w:i/>
+          <w:iCs/>
+          <w:sz w:val="24"/>
+          <w:szCs w:val="24"/>
+        </w:rPr>
+      </w:pPr>
+      <w:r>
+        <w:rPr>
+          <w:rFonts w:cstheme="minorHAnsi"/>
+          <w:i/>
+          <w:iCs/>
+          <w:sz w:val="24"/>
+          <w:szCs w:val="24"/>
+        </w:rPr>
+        <w:t xml:space="preserve">$ </w:t>
+      </w:r>
+      <w:r>
+        <w:rPr>
+          <w:rFonts w:cstheme="minorHAnsi"/>
+          <w:i/>
+          <w:iCs/>
+          <w:sz w:val="24"/>
+          <w:szCs w:val="24"/>
+        </w:rPr>
+        <w:t>git remote -v</w:t>
+      </w:r>
+    </w:p>
+    <w:p>
+      <w:pPr>
+        <w:pStyle w:val="ListParagraph"/>
+        <w:ind w:left="1440"/>
+        <w:jc w:val="both"/>
+        <w:rPr>
+          <w:rFonts w:cstheme="minorHAnsi"/>
+          <w:sz w:val="24"/>
+          <w:szCs w:val="24"/>
+        </w:rPr>
+      </w:pPr>
+    </w:p>
+    <w:p>
+      <w:pPr>
+        <w:pStyle w:val="ListParagraph"/>
+        <w:ind w:left="1440"/>
+        <w:jc w:val="both"/>
+        <w:rPr>
+          <w:rFonts w:cstheme="minorHAnsi"/>
+          <w:sz w:val="24"/>
+          <w:szCs w:val="24"/>
+        </w:rPr>
+      </w:pPr>
+      <w:r>
+        <w:rPr>
+          <w:rFonts w:cstheme="minorHAnsi"/>
+          <w:sz w:val="24"/>
+          <w:szCs w:val="24"/>
+        </w:rPr>
+        <w:t>This repository will have two remotes:</w:t>
+      </w:r>
+    </w:p>
+    <w:p>
+      <w:pPr>
+        <w:pStyle w:val="ListParagraph"/>
+        <w:ind w:left="1440"/>
+        <w:jc w:val="both"/>
+        <w:rPr>
+          <w:rFonts w:cstheme="minorHAnsi"/>
+          <w:sz w:val="24"/>
+          <w:szCs w:val="24"/>
+        </w:rPr>
+      </w:pPr>
+      <w:r>
+        <w:rPr>
+          <w:rFonts w:cstheme="minorHAnsi"/>
+          <w:sz w:val="24"/>
+          <w:szCs w:val="24"/>
+        </w:rPr>
+        <w:t>Origin -&gt; original git repository</w:t>
+      </w:r>
+    </w:p>
+    <w:p>
+      <w:pPr>
+        <w:pStyle w:val="ListParagraph"/>
+        <w:ind w:left="1440"/>
+        <w:jc w:val="both"/>
+        <w:rPr>
+          <w:rFonts w:cstheme="minorHAnsi"/>
+          <w:sz w:val="24"/>
+          <w:szCs w:val="24"/>
+        </w:rPr>
+      </w:pPr>
+      <w:r>
+        <w:rPr>
+          <w:rFonts w:cstheme="minorHAnsi"/>
+          <w:sz w:val="24"/>
+          <w:szCs w:val="24"/>
+        </w:rPr>
+        <w:t xml:space="preserve">hf -&gt; </w:t>
+      </w:r>
+      <w:proofErr w:type="spellStart"/>
+      <w:r>
+        <w:rPr>
+          <w:rFonts w:cstheme="minorHAnsi"/>
+          <w:sz w:val="24"/>
+          <w:szCs w:val="24"/>
+        </w:rPr>
+        <w:t>huggingface</w:t>
+      </w:r>
+      <w:proofErr w:type="spellEnd"/>
+      <w:r>
+        <w:rPr>
+          <w:rFonts w:cstheme="minorHAnsi"/>
+          <w:sz w:val="24"/>
+          <w:szCs w:val="24"/>
+        </w:rPr>
+        <w:t xml:space="preserve"> space repository</w:t>
+      </w:r>
+    </w:p>
+    <w:p>
+      <w:pPr>
+        <w:pStyle w:val="ListParagraph"/>
+        <w:ind w:left="1440"/>
+        <w:jc w:val="both"/>
+        <w:rPr>
+          <w:rFonts w:cstheme="minorHAnsi"/>
+          <w:sz w:val="24"/>
+          <w:szCs w:val="24"/>
+        </w:rPr>
+      </w:pPr>
+    </w:p>
+    <w:p>
+      <w:pPr>
+        <w:pStyle w:val="ListParagraph"/>
+        <w:ind w:left="1440"/>
+        <w:jc w:val="both"/>
+        <w:rPr>
+          <w:rFonts w:cstheme="minorHAnsi"/>
+          <w:sz w:val="24"/>
+          <w:szCs w:val="24"/>
+        </w:rPr>
+      </w:pPr>
+      <w:r>
+        <w:rPr>
+          <w:rFonts w:cstheme="minorHAnsi"/>
+          <w:sz w:val="24"/>
+          <w:szCs w:val="24"/>
+        </w:rPr>
+        <w:drawing>
+          <wp:inline distT="0" distB="0" distL="0" distR="0" wp14:anchorId="4265385C" wp14:editId="49A8262F">
+            <wp:extent cx="5648960" cy="731893"/>
+            <wp:effectExtent l="0" t="0" r="0" b="0"/>
+            <wp:docPr id="1941102007" name="Picture 1"/>
+            <wp:cNvGraphicFramePr>
+              <a:graphicFrameLocks xmlns:a="http://schemas.openxmlformats.org/drawingml/2006/main" noChangeAspect="1"/>
+            </wp:cNvGraphicFramePr>
+            <a:graphic xmlns:a="http://schemas.openxmlformats.org/drawingml/2006/main">
+              <a:graphicData uri="http://schemas.openxmlformats.org/drawingml/2006/picture">
+                <pic:pic xmlns:pic="http://schemas.openxmlformats.org/drawingml/2006/picture">
+                  <pic:nvPicPr>
+                    <pic:cNvPr id="1941102007" name=""/>
+                    <pic:cNvPicPr/>
+                  </pic:nvPicPr>
+                  <pic:blipFill>
+                    <a:blip r:embed="rId33"/>
+                    <a:stretch>
+                      <a:fillRect/>
+                    </a:stretch>
+                  </pic:blipFill>
+                  <pic:spPr>
+                    <a:xfrm>
+                      <a:off x="0" y="0"/>
+                      <a:ext cx="5691540" cy="737410"/>
+                    </a:xfrm>
+                    <a:prstGeom prst="rect">
+                      <a:avLst/>
+                    </a:prstGeom>
+                  </pic:spPr>
+                </pic:pic>
+              </a:graphicData>
+            </a:graphic>
+          </wp:inline>
+        </w:drawing>
+      </w:r>
+    </w:p>
+    <w:p>
+      <w:pPr>
+        <w:pStyle w:val="ListParagraph"/>
+        <w:ind w:left="1440"/>
+        <w:jc w:val="both"/>
+        <w:rPr>
+          <w:rFonts w:cstheme="minorHAnsi"/>
+          <w:sz w:val="24"/>
+          <w:szCs w:val="24"/>
+        </w:rPr>
+      </w:pPr>
+    </w:p>
+    <w:p>
+      <w:pPr>
+        <w:pStyle w:val="ListParagraph"/>
+        <w:ind w:left="1440"/>
+        <w:jc w:val="both"/>
+        <w:rPr>
+          <w:rFonts w:cstheme="minorHAnsi"/>
+          <w:sz w:val="24"/>
+          <w:szCs w:val="24"/>
+        </w:rPr>
+      </w:pPr>
+      <w:r>
+        <w:rPr>
+          <w:rFonts w:cstheme="minorHAnsi"/>
+          <w:sz w:val="24"/>
+          <w:szCs w:val="24"/>
+        </w:rPr>
+        <w:lastRenderedPageBreak/>
+        <w:t xml:space="preserve">Push directly to </w:t>
+      </w:r>
+      <w:proofErr w:type="spellStart"/>
+      <w:r>
+        <w:rPr>
+          <w:rFonts w:cstheme="minorHAnsi"/>
+          <w:sz w:val="24"/>
+          <w:szCs w:val="24"/>
+        </w:rPr>
+        <w:t>huggingface</w:t>
+      </w:r>
+      <w:proofErr w:type="spellEnd"/>
+      <w:r>
+        <w:rPr>
+          <w:rFonts w:cstheme="minorHAnsi"/>
+          <w:sz w:val="24"/>
+          <w:szCs w:val="24"/>
+        </w:rPr>
+        <w:t>:</w:t>
+      </w:r>
+    </w:p>
+    <w:p>
+      <w:pPr>
+        <w:pStyle w:val="ListParagraph"/>
+        <w:ind w:left="1440"/>
+        <w:jc w:val="both"/>
+        <w:rPr>
+          <w:rFonts w:cstheme="minorHAnsi"/>
+          <w:i/>
+          <w:iCs/>
+          <w:sz w:val="24"/>
+          <w:szCs w:val="24"/>
+        </w:rPr>
+      </w:pPr>
+      <w:r>
+        <w:rPr>
+          <w:rFonts w:cstheme="minorHAnsi"/>
+          <w:i/>
+          <w:iCs/>
+          <w:sz w:val="24"/>
+          <w:szCs w:val="24"/>
+        </w:rPr>
+        <w:t xml:space="preserve">$ </w:t>
+      </w:r>
+      <w:r>
+        <w:rPr>
+          <w:rFonts w:cstheme="minorHAnsi"/>
+          <w:i/>
+          <w:iCs/>
+          <w:sz w:val="24"/>
+          <w:szCs w:val="24"/>
+        </w:rPr>
+        <w:t>git push hf main</w:t>
+      </w:r>
+    </w:p>
+    <w:p>
+      <w:pPr>
+        <w:pStyle w:val="ListParagraph"/>
+        <w:ind w:left="1440"/>
+        <w:jc w:val="both"/>
+        <w:rPr>
+          <w:rFonts w:cstheme="minorHAnsi"/>
+          <w:i/>
+          <w:iCs/>
+          <w:sz w:val="24"/>
+          <w:szCs w:val="24"/>
+        </w:rPr>
+      </w:pPr>
+    </w:p>
+    <w:p>
+      <w:pPr>
+        <w:pStyle w:val="ListParagraph"/>
+        <w:ind w:left="1440"/>
+        <w:jc w:val="both"/>
+        <w:rPr>
+          <w:rFonts w:cstheme="minorHAnsi"/>
+          <w:sz w:val="24"/>
+          <w:szCs w:val="24"/>
+        </w:rPr>
+      </w:pPr>
+      <w:proofErr w:type="spellStart"/>
+      <w:r>
+        <w:rPr>
+          <w:rFonts w:cstheme="minorHAnsi"/>
+          <w:sz w:val="24"/>
+          <w:szCs w:val="24"/>
+        </w:rPr>
+        <w:t>HuggingFace</w:t>
+      </w:r>
+      <w:proofErr w:type="spellEnd"/>
+      <w:r>
+        <w:rPr>
+          <w:rFonts w:cstheme="minorHAnsi"/>
+          <w:sz w:val="24"/>
+          <w:szCs w:val="24"/>
+        </w:rPr>
+        <w:t xml:space="preserve"> will now:</w:t>
+      </w:r>
+    </w:p>
+    <w:p>
+      <w:pPr>
+        <w:pStyle w:val="ListParagraph"/>
+        <w:numPr>
+          <w:ilvl w:val="0"/>
+          <w:numId w:val="105"/>
+        </w:numPr>
+        <w:jc w:val="both"/>
+        <w:rPr>
+          <w:rFonts w:cstheme="minorHAnsi"/>
+          <w:sz w:val="24"/>
+          <w:szCs w:val="24"/>
+        </w:rPr>
+      </w:pPr>
+      <w:r>
+        <w:rPr>
+          <w:rFonts w:cstheme="minorHAnsi"/>
+          <w:sz w:val="24"/>
+          <w:szCs w:val="24"/>
+        </w:rPr>
+        <w:t>clone your repo</w:t>
+      </w:r>
+    </w:p>
+    <w:p>
+      <w:pPr>
+        <w:pStyle w:val="ListParagraph"/>
+        <w:numPr>
+          <w:ilvl w:val="0"/>
+          <w:numId w:val="105"/>
+        </w:numPr>
+        <w:jc w:val="both"/>
+        <w:rPr>
+          <w:rFonts w:cstheme="minorHAnsi"/>
+          <w:sz w:val="24"/>
+          <w:szCs w:val="24"/>
+        </w:rPr>
+      </w:pPr>
+      <w:r>
+        <w:rPr>
+          <w:rFonts w:cstheme="minorHAnsi"/>
+          <w:sz w:val="24"/>
+          <w:szCs w:val="24"/>
+        </w:rPr>
+        <w:t>build Docker</w:t>
+      </w:r>
+    </w:p>
+    <w:p>
+      <w:pPr>
+        <w:pStyle w:val="ListParagraph"/>
+        <w:numPr>
+          <w:ilvl w:val="0"/>
+          <w:numId w:val="105"/>
+        </w:numPr>
+        <w:jc w:val="both"/>
+        <w:rPr>
+          <w:rFonts w:cstheme="minorHAnsi"/>
+          <w:sz w:val="24"/>
+          <w:szCs w:val="24"/>
+        </w:rPr>
+      </w:pPr>
+      <w:r>
+        <w:rPr>
+          <w:rFonts w:cstheme="minorHAnsi"/>
+          <w:sz w:val="24"/>
+          <w:szCs w:val="24"/>
+        </w:rPr>
+        <w:t>start container</w:t>
+      </w:r>
+    </w:p>
+    <w:p>
+      <w:pPr>
+        <w:pStyle w:val="ListParagraph"/>
+        <w:numPr>
+          <w:ilvl w:val="0"/>
+          <w:numId w:val="105"/>
+        </w:numPr>
+        <w:jc w:val="both"/>
+        <w:rPr>
+          <w:rFonts w:cstheme="minorHAnsi"/>
+          <w:sz w:val="24"/>
+          <w:szCs w:val="24"/>
+        </w:rPr>
+      </w:pPr>
+      <w:r>
+        <w:rPr>
+          <w:rFonts w:cstheme="minorHAnsi"/>
+          <w:sz w:val="24"/>
+          <w:szCs w:val="24"/>
+        </w:rPr>
+        <w:t xml:space="preserve">launch </w:t>
+      </w:r>
+      <w:proofErr w:type="spellStart"/>
+      <w:r>
+        <w:rPr>
+          <w:rFonts w:cstheme="minorHAnsi"/>
+          <w:sz w:val="24"/>
+          <w:szCs w:val="24"/>
+        </w:rPr>
+        <w:t>Streamlit</w:t>
+      </w:r>
+      <w:proofErr w:type="spellEnd"/>
+    </w:p>
+    <w:p>
+      <w:pPr>
+        <w:pStyle w:val="ListParagraph"/>
+        <w:ind w:left="1440"/>
+        <w:jc w:val="both"/>
+        <w:rPr>
+          <w:rFonts w:cstheme="minorHAnsi"/>
+          <w:sz w:val="24"/>
+          <w:szCs w:val="24"/>
+        </w:rPr>
+      </w:pPr>
+    </w:p>
+    <w:p>
+      <w:pPr>
+        <w:pStyle w:val="ListParagraph"/>
+        <w:jc w:val="both"/>
+        <w:rPr>
+          <w:rFonts w:cstheme="minorHAnsi"/>
+          <w:sz w:val="24"/>
+          <w:szCs w:val="24"/>
+        </w:rPr>
+      </w:pPr>
+    </w:p>
+    <w:p>
+      <w:pPr>
+        <w:pStyle w:val="ListParagraph"/>
+        <w:jc w:val="both"/>
+        <w:rPr>
+          <w:rFonts w:cstheme="minorHAnsi"/>
+          <w:sz w:val="24"/>
+          <w:szCs w:val="24"/>
+        </w:rPr>
+      </w:pPr>
+    </w:p>
+    <w:p>
+      <w:pPr>
+        <w:pStyle w:val="ListParagraph"/>
+        <w:jc w:val="both"/>
+        <w:rPr>
+          <w:rFonts w:cstheme="minorHAnsi"/>
+          <w:sz w:val="24"/>
+          <w:szCs w:val="24"/>
+        </w:rPr>
+      </w:pPr>
+    </w:p>
+    <w:p>
+      <w:pPr>
+        <w:pStyle w:val="ListParagraph"/>
+        <w:jc w:val="both"/>
+        <w:rPr>
+          <w:rFonts w:cstheme="minorHAnsi"/>
+          <w:sz w:val="24"/>
+          <w:szCs w:val="24"/>
+        </w:rPr>
+      </w:pPr>
+    </w:p>
+    <w:p>
+      <w:pPr>
         <w:jc w:val="both"/>
         <w:rPr>
           <w:rFonts w:cstheme="minorHAnsi"/>
@@ -29279,7 +31982,7 @@
           <w:szCs w:val="24"/>
         </w:rPr>
       </w:pPr>
-      <w:hyperlink r:id="rId27" w:history="1">
+      <w:hyperlink r:id="rId34" w:history="1">
         <w:r>
           <w:rPr>
             <w:rStyle w:val="Hyperlink"/>
@@ -29301,7 +32004,7 @@
           <w:szCs w:val="24"/>
         </w:rPr>
       </w:pPr>
-      <w:hyperlink r:id="rId28" w:history="1">
+      <w:hyperlink r:id="rId35" w:history="1">
         <w:r>
           <w:rPr>
             <w:rStyle w:val="Hyperlink"/>
@@ -29323,7 +32026,7 @@
           <w:szCs w:val="24"/>
         </w:rPr>
       </w:pPr>
-      <w:hyperlink r:id="rId29" w:history="1">
+      <w:hyperlink r:id="rId36" w:history="1">
         <w:r>
           <w:rPr>
             <w:rStyle w:val="Hyperlink"/>
@@ -29345,7 +32048,7 @@
           <w:szCs w:val="24"/>
         </w:rPr>
       </w:pPr>
-      <w:hyperlink r:id="rId30" w:history="1">
+      <w:hyperlink r:id="rId37" w:history="1">
         <w:r>
           <w:rPr>
             <w:rStyle w:val="Hyperlink"/>
@@ -29367,7 +32070,7 @@
           <w:szCs w:val="24"/>
         </w:rPr>
       </w:pPr>
-      <w:hyperlink r:id="rId31" w:history="1">
+      <w:hyperlink r:id="rId38" w:history="1">
         <w:r>
           <w:rPr>
             <w:rStyle w:val="Hyperlink"/>
@@ -29389,7 +32092,7 @@
           <w:szCs w:val="24"/>
         </w:rPr>
       </w:pPr>
-      <w:hyperlink r:id="rId32" w:history="1">
+      <w:hyperlink r:id="rId39" w:history="1">
         <w:r>
           <w:rPr>
             <w:rStyle w:val="Hyperlink"/>
@@ -29411,7 +32114,7 @@
           <w:szCs w:val="24"/>
         </w:rPr>
       </w:pPr>
-      <w:hyperlink r:id="rId33" w:history="1">
+      <w:hyperlink r:id="rId40" w:history="1">
         <w:r>
           <w:rPr>
             <w:rStyle w:val="Hyperlink"/>
@@ -29433,7 +32136,7 @@
           <w:szCs w:val="24"/>
         </w:rPr>
       </w:pPr>
-      <w:hyperlink r:id="rId34" w:history="1">
+      <w:hyperlink r:id="rId41" w:history="1">
         <w:r>
           <w:rPr>
             <w:rStyle w:val="Hyperlink"/>
@@ -29455,7 +32158,7 @@
           <w:szCs w:val="24"/>
         </w:rPr>
       </w:pPr>
-      <w:hyperlink r:id="rId35" w:history="1">
+      <w:hyperlink r:id="rId42" w:history="1">
         <w:r>
           <w:rPr>
             <w:rStyle w:val="Hyperlink"/>
@@ -29475,7 +32178,7 @@
           <w:rFonts w:cstheme="minorHAnsi"/>
         </w:rPr>
       </w:pPr>
-      <w:hyperlink r:id="rId36" w:history="1">
+      <w:hyperlink r:id="rId43" w:history="1">
         <w:r>
           <w:rPr>
             <w:rStyle w:val="Hyperlink"/>
@@ -29497,7 +32200,7 @@
           <w:szCs w:val="24"/>
         </w:rPr>
       </w:pPr>
-      <w:hyperlink r:id="rId37" w:history="1">
+      <w:hyperlink r:id="rId44" w:history="1">
         <w:r>
           <w:rPr>
             <w:rStyle w:val="Hyperlink"/>
@@ -29519,7 +32222,7 @@
           <w:szCs w:val="24"/>
         </w:rPr>
       </w:pPr>
-      <w:hyperlink r:id="rId38" w:history="1">
+      <w:hyperlink r:id="rId45" w:history="1">
         <w:r>
           <w:rPr>
             <w:rStyle w:val="Hyperlink"/>
@@ -29539,7 +32242,7 @@
           <w:rFonts w:cstheme="minorHAnsi"/>
         </w:rPr>
       </w:pPr>
-      <w:hyperlink r:id="rId39" w:history="1">
+      <w:hyperlink r:id="rId46" w:history="1">
         <w:r>
           <w:rPr>
             <w:rStyle w:val="Hyperlink"/>
@@ -29561,7 +32264,7 @@
           <w:szCs w:val="24"/>
         </w:rPr>
       </w:pPr>
-      <w:hyperlink r:id="rId40" w:history="1">
+      <w:hyperlink r:id="rId47" w:history="1">
         <w:r>
           <w:rPr>
             <w:rStyle w:val="Hyperlink"/>
@@ -29583,7 +32286,7 @@
           <w:szCs w:val="24"/>
         </w:rPr>
       </w:pPr>
-      <w:hyperlink r:id="rId41" w:history="1">
+      <w:hyperlink r:id="rId48" w:history="1">
         <w:r>
           <w:rPr>
             <w:rStyle w:val="Hyperlink"/>
@@ -37239,6 +39942,119 @@
     </w:lvl>
   </w:abstractNum>
   <w:abstractNum w:abstractNumId="56" w15:restartNumberingAfterBreak="0">
+    <w:nsid w:val="43747418"/>
+    <w:multiLevelType w:val="multilevel"/>
+    <w:tmpl w:val="310E6890"/>
+    <w:lvl w:ilvl="0">
+      <w:start w:val="1"/>
+      <w:numFmt w:val="decimal"/>
+      <w:lvlText w:val="%1."/>
+      <w:lvlJc w:val="left"/>
+      <w:pPr>
+        <w:tabs>
+          <w:tab w:val="num" w:pos="1800"/>
+        </w:tabs>
+        <w:ind w:left="1800" w:hanging="360"/>
+      </w:pPr>
+    </w:lvl>
+    <w:lvl w:ilvl="1" w:tentative="1">
+      <w:start w:val="1"/>
+      <w:numFmt w:val="decimal"/>
+      <w:lvlText w:val="%2."/>
+      <w:lvlJc w:val="left"/>
+      <w:pPr>
+        <w:tabs>
+          <w:tab w:val="num" w:pos="2520"/>
+        </w:tabs>
+        <w:ind w:left="2520" w:hanging="360"/>
+      </w:pPr>
+    </w:lvl>
+    <w:lvl w:ilvl="2" w:tentative="1">
+      <w:start w:val="1"/>
+      <w:numFmt w:val="decimal"/>
+      <w:lvlText w:val="%3."/>
+      <w:lvlJc w:val="left"/>
+      <w:pPr>
+        <w:tabs>
+          <w:tab w:val="num" w:pos="3240"/>
+        </w:tabs>
+        <w:ind w:left="3240" w:hanging="360"/>
+      </w:pPr>
+    </w:lvl>
+    <w:lvl w:ilvl="3" w:tentative="1">
+      <w:start w:val="1"/>
+      <w:numFmt w:val="decimal"/>
+      <w:lvlText w:val="%4."/>
+      <w:lvlJc w:val="left"/>
+      <w:pPr>
+        <w:tabs>
+          <w:tab w:val="num" w:pos="3960"/>
+        </w:tabs>
+        <w:ind w:left="3960" w:hanging="360"/>
+      </w:pPr>
+    </w:lvl>
+    <w:lvl w:ilvl="4" w:tentative="1">
+      <w:start w:val="1"/>
+      <w:numFmt w:val="decimal"/>
+      <w:lvlText w:val="%5."/>
+      <w:lvlJc w:val="left"/>
+      <w:pPr>
+        <w:tabs>
+          <w:tab w:val="num" w:pos="4680"/>
+        </w:tabs>
+        <w:ind w:left="4680" w:hanging="360"/>
+      </w:pPr>
+    </w:lvl>
+    <w:lvl w:ilvl="5" w:tentative="1">
+      <w:start w:val="1"/>
+      <w:numFmt w:val="decimal"/>
+      <w:lvlText w:val="%6."/>
+      <w:lvlJc w:val="left"/>
+      <w:pPr>
+        <w:tabs>
+          <w:tab w:val="num" w:pos="5400"/>
+        </w:tabs>
+        <w:ind w:left="5400" w:hanging="360"/>
+      </w:pPr>
+    </w:lvl>
+    <w:lvl w:ilvl="6" w:tentative="1">
+      <w:start w:val="1"/>
+      <w:numFmt w:val="decimal"/>
+      <w:lvlText w:val="%7."/>
+      <w:lvlJc w:val="left"/>
+      <w:pPr>
+        <w:tabs>
+          <w:tab w:val="num" w:pos="6120"/>
+        </w:tabs>
+        <w:ind w:left="6120" w:hanging="360"/>
+      </w:pPr>
+    </w:lvl>
+    <w:lvl w:ilvl="7" w:tentative="1">
+      <w:start w:val="1"/>
+      <w:numFmt w:val="decimal"/>
+      <w:lvlText w:val="%8."/>
+      <w:lvlJc w:val="left"/>
+      <w:pPr>
+        <w:tabs>
+          <w:tab w:val="num" w:pos="6840"/>
+        </w:tabs>
+        <w:ind w:left="6840" w:hanging="360"/>
+      </w:pPr>
+    </w:lvl>
+    <w:lvl w:ilvl="8" w:tentative="1">
+      <w:start w:val="1"/>
+      <w:numFmt w:val="decimal"/>
+      <w:lvlText w:val="%9."/>
+      <w:lvlJc w:val="left"/>
+      <w:pPr>
+        <w:tabs>
+          <w:tab w:val="num" w:pos="7560"/>
+        </w:tabs>
+        <w:ind w:left="7560" w:hanging="360"/>
+      </w:pPr>
+    </w:lvl>
+  </w:abstractNum>
+  <w:abstractNum w:abstractNumId="57" w15:restartNumberingAfterBreak="0">
     <w:nsid w:val="453A1684"/>
     <w:multiLevelType w:val="multilevel"/>
     <w:tmpl w:val="0DFE2DBC"/>
@@ -37387,7 +40203,7 @@
       </w:rPr>
     </w:lvl>
   </w:abstractNum>
-  <w:abstractNum w:abstractNumId="57" w15:restartNumberingAfterBreak="0">
+  <w:abstractNum w:abstractNumId="58" w15:restartNumberingAfterBreak="0">
     <w:nsid w:val="480D5D51"/>
     <w:multiLevelType w:val="multilevel"/>
     <w:tmpl w:val="8ED88954"/>
@@ -37536,7 +40352,7 @@
       </w:rPr>
     </w:lvl>
   </w:abstractNum>
-  <w:abstractNum w:abstractNumId="58" w15:restartNumberingAfterBreak="0">
+  <w:abstractNum w:abstractNumId="59" w15:restartNumberingAfterBreak="0">
     <w:nsid w:val="494F32F0"/>
     <w:multiLevelType w:val="multilevel"/>
     <w:tmpl w:val="9D544A74"/>
@@ -37685,7 +40501,7 @@
       </w:rPr>
     </w:lvl>
   </w:abstractNum>
-  <w:abstractNum w:abstractNumId="59" w15:restartNumberingAfterBreak="0">
+  <w:abstractNum w:abstractNumId="60" w15:restartNumberingAfterBreak="0">
     <w:nsid w:val="4AE57817"/>
     <w:multiLevelType w:val="multilevel"/>
     <w:tmpl w:val="C772D770"/>
@@ -37798,7 +40614,7 @@
       </w:pPr>
     </w:lvl>
   </w:abstractNum>
-  <w:abstractNum w:abstractNumId="60" w15:restartNumberingAfterBreak="0">
+  <w:abstractNum w:abstractNumId="61" w15:restartNumberingAfterBreak="0">
     <w:nsid w:val="4C06358E"/>
     <w:multiLevelType w:val="hybridMultilevel"/>
     <w:tmpl w:val="99164702"/>
@@ -37911,7 +40727,7 @@
       </w:rPr>
     </w:lvl>
   </w:abstractNum>
-  <w:abstractNum w:abstractNumId="61" w15:restartNumberingAfterBreak="0">
+  <w:abstractNum w:abstractNumId="62" w15:restartNumberingAfterBreak="0">
     <w:nsid w:val="4DA4437E"/>
     <w:multiLevelType w:val="multilevel"/>
     <w:tmpl w:val="F27E8A64"/>
@@ -38060,7 +40876,7 @@
       </w:rPr>
     </w:lvl>
   </w:abstractNum>
-  <w:abstractNum w:abstractNumId="62" w15:restartNumberingAfterBreak="0">
+  <w:abstractNum w:abstractNumId="63" w15:restartNumberingAfterBreak="0">
     <w:nsid w:val="500A4DB3"/>
     <w:multiLevelType w:val="multilevel"/>
     <w:tmpl w:val="1F28AEC2"/>
@@ -38209,7 +41025,7 @@
       </w:rPr>
     </w:lvl>
   </w:abstractNum>
-  <w:abstractNum w:abstractNumId="63" w15:restartNumberingAfterBreak="0">
+  <w:abstractNum w:abstractNumId="64" w15:restartNumberingAfterBreak="0">
     <w:nsid w:val="531E6C40"/>
     <w:multiLevelType w:val="multilevel"/>
     <w:tmpl w:val="3336F1FA"/>
@@ -38358,7 +41174,7 @@
       </w:rPr>
     </w:lvl>
   </w:abstractNum>
-  <w:abstractNum w:abstractNumId="64" w15:restartNumberingAfterBreak="0">
+  <w:abstractNum w:abstractNumId="65" w15:restartNumberingAfterBreak="0">
     <w:nsid w:val="54CA1A5C"/>
     <w:multiLevelType w:val="multilevel"/>
     <w:tmpl w:val="CC822682"/>
@@ -38507,7 +41323,7 @@
       </w:rPr>
     </w:lvl>
   </w:abstractNum>
-  <w:abstractNum w:abstractNumId="65" w15:restartNumberingAfterBreak="0">
+  <w:abstractNum w:abstractNumId="66" w15:restartNumberingAfterBreak="0">
     <w:nsid w:val="5548001E"/>
     <w:multiLevelType w:val="multilevel"/>
     <w:tmpl w:val="46187BF2"/>
@@ -38656,7 +41472,7 @@
       </w:rPr>
     </w:lvl>
   </w:abstractNum>
-  <w:abstractNum w:abstractNumId="66" w15:restartNumberingAfterBreak="0">
+  <w:abstractNum w:abstractNumId="67" w15:restartNumberingAfterBreak="0">
     <w:nsid w:val="5658295B"/>
     <w:multiLevelType w:val="multilevel"/>
     <w:tmpl w:val="9DEE2138"/>
@@ -38805,7 +41621,7 @@
       </w:rPr>
     </w:lvl>
   </w:abstractNum>
-  <w:abstractNum w:abstractNumId="67" w15:restartNumberingAfterBreak="0">
+  <w:abstractNum w:abstractNumId="68" w15:restartNumberingAfterBreak="0">
     <w:nsid w:val="582A1163"/>
     <w:multiLevelType w:val="multilevel"/>
     <w:tmpl w:val="895AE1F0"/>
@@ -38918,7 +41734,7 @@
       </w:pPr>
     </w:lvl>
   </w:abstractNum>
-  <w:abstractNum w:abstractNumId="68" w15:restartNumberingAfterBreak="0">
+  <w:abstractNum w:abstractNumId="69" w15:restartNumberingAfterBreak="0">
     <w:nsid w:val="58836DB3"/>
     <w:multiLevelType w:val="multilevel"/>
     <w:tmpl w:val="93D26B1C"/>
@@ -39067,7 +41883,7 @@
       </w:rPr>
     </w:lvl>
   </w:abstractNum>
-  <w:abstractNum w:abstractNumId="69" w15:restartNumberingAfterBreak="0">
+  <w:abstractNum w:abstractNumId="70" w15:restartNumberingAfterBreak="0">
     <w:nsid w:val="5A872C34"/>
     <w:multiLevelType w:val="multilevel"/>
     <w:tmpl w:val="0546B7A0"/>
@@ -39216,7 +42032,7 @@
       </w:rPr>
     </w:lvl>
   </w:abstractNum>
-  <w:abstractNum w:abstractNumId="70" w15:restartNumberingAfterBreak="0">
+  <w:abstractNum w:abstractNumId="71" w15:restartNumberingAfterBreak="0">
     <w:nsid w:val="5B3973A7"/>
     <w:multiLevelType w:val="multilevel"/>
     <w:tmpl w:val="4EC67E6E"/>
@@ -39365,7 +42181,7 @@
       </w:rPr>
     </w:lvl>
   </w:abstractNum>
-  <w:abstractNum w:abstractNumId="71" w15:restartNumberingAfterBreak="0">
+  <w:abstractNum w:abstractNumId="72" w15:restartNumberingAfterBreak="0">
     <w:nsid w:val="5B9479F7"/>
     <w:multiLevelType w:val="hybridMultilevel"/>
     <w:tmpl w:val="E98C3082"/>
@@ -39454,7 +42270,7 @@
       </w:pPr>
     </w:lvl>
   </w:abstractNum>
-  <w:abstractNum w:abstractNumId="72" w15:restartNumberingAfterBreak="0">
+  <w:abstractNum w:abstractNumId="73" w15:restartNumberingAfterBreak="0">
     <w:nsid w:val="5CC65568"/>
     <w:multiLevelType w:val="multilevel"/>
     <w:tmpl w:val="733E77A4"/>
@@ -39603,7 +42419,7 @@
       </w:rPr>
     </w:lvl>
   </w:abstractNum>
-  <w:abstractNum w:abstractNumId="73" w15:restartNumberingAfterBreak="0">
+  <w:abstractNum w:abstractNumId="74" w15:restartNumberingAfterBreak="0">
     <w:nsid w:val="5E04059F"/>
     <w:multiLevelType w:val="multilevel"/>
     <w:tmpl w:val="B2421596"/>
@@ -39752,7 +42568,7 @@
       </w:rPr>
     </w:lvl>
   </w:abstractNum>
-  <w:abstractNum w:abstractNumId="74" w15:restartNumberingAfterBreak="0">
+  <w:abstractNum w:abstractNumId="75" w15:restartNumberingAfterBreak="0">
     <w:nsid w:val="5E0539A7"/>
     <w:multiLevelType w:val="hybridMultilevel"/>
     <w:tmpl w:val="0E9E03B0"/>
@@ -39865,7 +42681,7 @@
       </w:rPr>
     </w:lvl>
   </w:abstractNum>
-  <w:abstractNum w:abstractNumId="75" w15:restartNumberingAfterBreak="0">
+  <w:abstractNum w:abstractNumId="76" w15:restartNumberingAfterBreak="0">
     <w:nsid w:val="5E84497D"/>
     <w:multiLevelType w:val="hybridMultilevel"/>
     <w:tmpl w:val="F95E0EEA"/>
@@ -39978,7 +42794,7 @@
       </w:rPr>
     </w:lvl>
   </w:abstractNum>
-  <w:abstractNum w:abstractNumId="76" w15:restartNumberingAfterBreak="0">
+  <w:abstractNum w:abstractNumId="77" w15:restartNumberingAfterBreak="0">
     <w:nsid w:val="5F2D03EB"/>
     <w:multiLevelType w:val="multilevel"/>
     <w:tmpl w:val="12803E18"/>
@@ -40091,7 +42907,7 @@
       </w:pPr>
     </w:lvl>
   </w:abstractNum>
-  <w:abstractNum w:abstractNumId="77" w15:restartNumberingAfterBreak="0">
+  <w:abstractNum w:abstractNumId="78" w15:restartNumberingAfterBreak="0">
     <w:nsid w:val="61814B21"/>
     <w:multiLevelType w:val="multilevel"/>
     <w:tmpl w:val="CFB26562"/>
@@ -40240,7 +43056,7 @@
       </w:rPr>
     </w:lvl>
   </w:abstractNum>
-  <w:abstractNum w:abstractNumId="78" w15:restartNumberingAfterBreak="0">
+  <w:abstractNum w:abstractNumId="79" w15:restartNumberingAfterBreak="0">
     <w:nsid w:val="61E963C0"/>
     <w:multiLevelType w:val="multilevel"/>
     <w:tmpl w:val="000290C4"/>
@@ -40389,7 +43205,7 @@
       </w:rPr>
     </w:lvl>
   </w:abstractNum>
-  <w:abstractNum w:abstractNumId="79" w15:restartNumberingAfterBreak="0">
+  <w:abstractNum w:abstractNumId="80" w15:restartNumberingAfterBreak="0">
     <w:nsid w:val="634B6D35"/>
     <w:multiLevelType w:val="multilevel"/>
     <w:tmpl w:val="949804A0"/>
@@ -40538,7 +43354,7 @@
       </w:rPr>
     </w:lvl>
   </w:abstractNum>
-  <w:abstractNum w:abstractNumId="80" w15:restartNumberingAfterBreak="0">
+  <w:abstractNum w:abstractNumId="81" w15:restartNumberingAfterBreak="0">
     <w:nsid w:val="63A321F7"/>
     <w:multiLevelType w:val="multilevel"/>
     <w:tmpl w:val="803E53F8"/>
@@ -40687,7 +43503,7 @@
       </w:rPr>
     </w:lvl>
   </w:abstractNum>
-  <w:abstractNum w:abstractNumId="81" w15:restartNumberingAfterBreak="0">
+  <w:abstractNum w:abstractNumId="82" w15:restartNumberingAfterBreak="0">
     <w:nsid w:val="63F16591"/>
     <w:multiLevelType w:val="multilevel"/>
     <w:tmpl w:val="786E803A"/>
@@ -40836,7 +43652,7 @@
       </w:rPr>
     </w:lvl>
   </w:abstractNum>
-  <w:abstractNum w:abstractNumId="82" w15:restartNumberingAfterBreak="0">
+  <w:abstractNum w:abstractNumId="83" w15:restartNumberingAfterBreak="0">
     <w:nsid w:val="65A70D3C"/>
     <w:multiLevelType w:val="hybridMultilevel"/>
     <w:tmpl w:val="C73E4A76"/>
@@ -40949,7 +43765,7 @@
       </w:rPr>
     </w:lvl>
   </w:abstractNum>
-  <w:abstractNum w:abstractNumId="83" w15:restartNumberingAfterBreak="0">
+  <w:abstractNum w:abstractNumId="84" w15:restartNumberingAfterBreak="0">
     <w:nsid w:val="66272F98"/>
     <w:multiLevelType w:val="multilevel"/>
     <w:tmpl w:val="27B6FB3E"/>
@@ -41098,7 +43914,7 @@
       </w:rPr>
     </w:lvl>
   </w:abstractNum>
-  <w:abstractNum w:abstractNumId="84" w15:restartNumberingAfterBreak="0">
+  <w:abstractNum w:abstractNumId="85" w15:restartNumberingAfterBreak="0">
     <w:nsid w:val="67340BF8"/>
     <w:multiLevelType w:val="multilevel"/>
     <w:tmpl w:val="ABD45758"/>
@@ -41247,7 +44063,7 @@
       </w:rPr>
     </w:lvl>
   </w:abstractNum>
-  <w:abstractNum w:abstractNumId="85" w15:restartNumberingAfterBreak="0">
+  <w:abstractNum w:abstractNumId="86" w15:restartNumberingAfterBreak="0">
     <w:nsid w:val="676C655D"/>
     <w:multiLevelType w:val="multilevel"/>
     <w:tmpl w:val="D26C2404"/>
@@ -41396,7 +44212,7 @@
       </w:rPr>
     </w:lvl>
   </w:abstractNum>
-  <w:abstractNum w:abstractNumId="86" w15:restartNumberingAfterBreak="0">
+  <w:abstractNum w:abstractNumId="87" w15:restartNumberingAfterBreak="0">
     <w:nsid w:val="6877680C"/>
     <w:multiLevelType w:val="multilevel"/>
     <w:tmpl w:val="B1605224"/>
@@ -41509,7 +44325,7 @@
       </w:pPr>
     </w:lvl>
   </w:abstractNum>
-  <w:abstractNum w:abstractNumId="87" w15:restartNumberingAfterBreak="0">
+  <w:abstractNum w:abstractNumId="88" w15:restartNumberingAfterBreak="0">
     <w:nsid w:val="6A354DE7"/>
     <w:multiLevelType w:val="multilevel"/>
     <w:tmpl w:val="A7389F2A"/>
@@ -41658,7 +44474,7 @@
       </w:rPr>
     </w:lvl>
   </w:abstractNum>
-  <w:abstractNum w:abstractNumId="88" w15:restartNumberingAfterBreak="0">
+  <w:abstractNum w:abstractNumId="89" w15:restartNumberingAfterBreak="0">
     <w:nsid w:val="6A922DAB"/>
     <w:multiLevelType w:val="hybridMultilevel"/>
     <w:tmpl w:val="42F41DC2"/>
@@ -41747,7 +44563,7 @@
       </w:pPr>
     </w:lvl>
   </w:abstractNum>
-  <w:abstractNum w:abstractNumId="89" w15:restartNumberingAfterBreak="0">
+  <w:abstractNum w:abstractNumId="90" w15:restartNumberingAfterBreak="0">
     <w:nsid w:val="6ACF5993"/>
     <w:multiLevelType w:val="multilevel"/>
     <w:tmpl w:val="28767A2A"/>
@@ -41896,7 +44712,7 @@
       </w:rPr>
     </w:lvl>
   </w:abstractNum>
-  <w:abstractNum w:abstractNumId="90" w15:restartNumberingAfterBreak="0">
+  <w:abstractNum w:abstractNumId="91" w15:restartNumberingAfterBreak="0">
     <w:nsid w:val="6E557C88"/>
     <w:multiLevelType w:val="multilevel"/>
     <w:tmpl w:val="7B46B6A2"/>
@@ -42045,7 +44861,7 @@
       </w:rPr>
     </w:lvl>
   </w:abstractNum>
-  <w:abstractNum w:abstractNumId="91" w15:restartNumberingAfterBreak="0">
+  <w:abstractNum w:abstractNumId="92" w15:restartNumberingAfterBreak="0">
     <w:nsid w:val="6EAC7B84"/>
     <w:multiLevelType w:val="multilevel"/>
     <w:tmpl w:val="A2CAA1A8"/>
@@ -42194,7 +45010,7 @@
       </w:rPr>
     </w:lvl>
   </w:abstractNum>
-  <w:abstractNum w:abstractNumId="92" w15:restartNumberingAfterBreak="0">
+  <w:abstractNum w:abstractNumId="93" w15:restartNumberingAfterBreak="0">
     <w:nsid w:val="7008233F"/>
     <w:multiLevelType w:val="hybridMultilevel"/>
     <w:tmpl w:val="A268DF0E"/>
@@ -42307,7 +45123,7 @@
       </w:rPr>
     </w:lvl>
   </w:abstractNum>
-  <w:abstractNum w:abstractNumId="93" w15:restartNumberingAfterBreak="0">
+  <w:abstractNum w:abstractNumId="94" w15:restartNumberingAfterBreak="0">
     <w:nsid w:val="71FB6A03"/>
     <w:multiLevelType w:val="multilevel"/>
     <w:tmpl w:val="A1DCF412"/>
@@ -42420,7 +45236,7 @@
       </w:pPr>
     </w:lvl>
   </w:abstractNum>
-  <w:abstractNum w:abstractNumId="94" w15:restartNumberingAfterBreak="0">
+  <w:abstractNum w:abstractNumId="95" w15:restartNumberingAfterBreak="0">
     <w:nsid w:val="73F66B17"/>
     <w:multiLevelType w:val="multilevel"/>
     <w:tmpl w:val="5CC2F900"/>
@@ -42569,7 +45385,7 @@
       </w:rPr>
     </w:lvl>
   </w:abstractNum>
-  <w:abstractNum w:abstractNumId="95" w15:restartNumberingAfterBreak="0">
+  <w:abstractNum w:abstractNumId="96" w15:restartNumberingAfterBreak="0">
     <w:nsid w:val="75CB4497"/>
     <w:multiLevelType w:val="multilevel"/>
     <w:tmpl w:val="09E26C82"/>
@@ -42718,7 +45534,7 @@
       </w:rPr>
     </w:lvl>
   </w:abstractNum>
-  <w:abstractNum w:abstractNumId="96" w15:restartNumberingAfterBreak="0">
+  <w:abstractNum w:abstractNumId="97" w15:restartNumberingAfterBreak="0">
     <w:nsid w:val="75E9503E"/>
     <w:multiLevelType w:val="multilevel"/>
     <w:tmpl w:val="23002BC4"/>
@@ -42867,7 +45683,7 @@
       </w:rPr>
     </w:lvl>
   </w:abstractNum>
-  <w:abstractNum w:abstractNumId="97" w15:restartNumberingAfterBreak="0">
+  <w:abstractNum w:abstractNumId="98" w15:restartNumberingAfterBreak="0">
     <w:nsid w:val="794C2919"/>
     <w:multiLevelType w:val="multilevel"/>
     <w:tmpl w:val="BF56CB9E"/>
@@ -43016,7 +45832,7 @@
       </w:rPr>
     </w:lvl>
   </w:abstractNum>
-  <w:abstractNum w:abstractNumId="98" w15:restartNumberingAfterBreak="0">
+  <w:abstractNum w:abstractNumId="99" w15:restartNumberingAfterBreak="0">
     <w:nsid w:val="7D7825CE"/>
     <w:multiLevelType w:val="multilevel"/>
     <w:tmpl w:val="0EF67296"/>
@@ -43165,7 +45981,7 @@
       </w:rPr>
     </w:lvl>
   </w:abstractNum>
-  <w:abstractNum w:abstractNumId="99" w15:restartNumberingAfterBreak="0">
+  <w:abstractNum w:abstractNumId="100" w15:restartNumberingAfterBreak="0">
     <w:nsid w:val="7E4034AB"/>
     <w:multiLevelType w:val="multilevel"/>
     <w:tmpl w:val="8C6A5A46"/>
@@ -43285,34 +46101,34 @@
     <w:abstractNumId w:val="45"/>
   </w:num>
   <w:num w:numId="3" w16cid:durableId="246157692">
-    <w:abstractNumId w:val="78"/>
+    <w:abstractNumId w:val="79"/>
   </w:num>
   <w:num w:numId="4" w16cid:durableId="311524092">
     <w:abstractNumId w:val="6"/>
   </w:num>
   <w:num w:numId="5" w16cid:durableId="131141850">
-    <w:abstractNumId w:val="90"/>
+    <w:abstractNumId w:val="91"/>
   </w:num>
   <w:num w:numId="6" w16cid:durableId="1478063093">
     <w:abstractNumId w:val="30"/>
   </w:num>
   <w:num w:numId="7" w16cid:durableId="1293056430">
-    <w:abstractNumId w:val="65"/>
+    <w:abstractNumId w:val="66"/>
   </w:num>
   <w:num w:numId="8" w16cid:durableId="373696748">
-    <w:abstractNumId w:val="85"/>
+    <w:abstractNumId w:val="86"/>
   </w:num>
   <w:num w:numId="9" w16cid:durableId="1357343489">
-    <w:abstractNumId w:val="82"/>
+    <w:abstractNumId w:val="83"/>
   </w:num>
   <w:num w:numId="10" w16cid:durableId="208764285">
-    <w:abstractNumId w:val="71"/>
+    <w:abstractNumId w:val="72"/>
   </w:num>
   <w:num w:numId="11" w16cid:durableId="1608149067">
     <w:abstractNumId w:val="49"/>
   </w:num>
   <w:num w:numId="12" w16cid:durableId="1183401575">
-    <w:abstractNumId w:val="87"/>
+    <w:abstractNumId w:val="88"/>
   </w:num>
   <w:num w:numId="13" w16cid:durableId="54859608">
     <w:abstractNumId w:val="18"/>
@@ -43321,16 +46137,16 @@
     <w:abstractNumId w:val="27"/>
   </w:num>
   <w:num w:numId="15" w16cid:durableId="1324432310">
-    <w:abstractNumId w:val="58"/>
+    <w:abstractNumId w:val="59"/>
   </w:num>
   <w:num w:numId="16" w16cid:durableId="69233166">
-    <w:abstractNumId w:val="93"/>
+    <w:abstractNumId w:val="94"/>
   </w:num>
   <w:num w:numId="17" w16cid:durableId="1874995042">
     <w:abstractNumId w:val="1"/>
   </w:num>
   <w:num w:numId="18" w16cid:durableId="339544418">
-    <w:abstractNumId w:val="69"/>
+    <w:abstractNumId w:val="70"/>
   </w:num>
   <w:num w:numId="19" w16cid:durableId="1699159306">
     <w:abstractNumId w:val="42"/>
@@ -43345,16 +46161,16 @@
     <w:abstractNumId w:val="2"/>
   </w:num>
   <w:num w:numId="23" w16cid:durableId="2109619588">
-    <w:abstractNumId w:val="62"/>
+    <w:abstractNumId w:val="63"/>
   </w:num>
   <w:num w:numId="24" w16cid:durableId="1387417741">
-    <w:abstractNumId w:val="86"/>
+    <w:abstractNumId w:val="87"/>
   </w:num>
   <w:num w:numId="25" w16cid:durableId="701327538">
     <w:abstractNumId w:val="34"/>
   </w:num>
   <w:num w:numId="26" w16cid:durableId="1284074440">
-    <w:abstractNumId w:val="64"/>
+    <w:abstractNumId w:val="65"/>
   </w:num>
   <w:num w:numId="27" w16cid:durableId="1174689253">
     <w:abstractNumId w:val="20"/>
@@ -43363,7 +46179,7 @@
     <w:abstractNumId w:val="47"/>
   </w:num>
   <w:num w:numId="29" w16cid:durableId="13074353">
-    <w:abstractNumId w:val="56"/>
+    <w:abstractNumId w:val="57"/>
   </w:num>
   <w:num w:numId="30" w16cid:durableId="1380665182">
     <w:abstractNumId w:val="9"/>
@@ -43375,13 +46191,13 @@
     <w:abstractNumId w:val="23"/>
   </w:num>
   <w:num w:numId="33" w16cid:durableId="1830170944">
-    <w:abstractNumId w:val="88"/>
+    <w:abstractNumId w:val="89"/>
   </w:num>
   <w:num w:numId="34" w16cid:durableId="1161388337">
     <w:abstractNumId w:val="39"/>
   </w:num>
   <w:num w:numId="35" w16cid:durableId="1174996305">
-    <w:abstractNumId w:val="63"/>
+    <w:abstractNumId w:val="64"/>
   </w:num>
   <w:num w:numId="36" w16cid:durableId="1147235827">
     <w:abstractNumId w:val="36"/>
@@ -43393,13 +46209,13 @@
     <w:abstractNumId w:val="15"/>
   </w:num>
   <w:num w:numId="39" w16cid:durableId="2015960442">
-    <w:abstractNumId w:val="97"/>
+    <w:abstractNumId w:val="98"/>
   </w:num>
   <w:num w:numId="40" w16cid:durableId="940381558">
     <w:abstractNumId w:val="3"/>
   </w:num>
   <w:num w:numId="41" w16cid:durableId="1122577806">
-    <w:abstractNumId w:val="96"/>
+    <w:abstractNumId w:val="97"/>
   </w:num>
   <w:num w:numId="42" w16cid:durableId="400490635">
     <w:abstractNumId w:val="35"/>
@@ -43417,31 +46233,31 @@
     <w:abstractNumId w:val="44"/>
   </w:num>
   <w:num w:numId="47" w16cid:durableId="1158958097">
-    <w:abstractNumId w:val="61"/>
+    <w:abstractNumId w:val="62"/>
     <w:lvlOverride w:ilvl="0">
       <w:startOverride w:val="1"/>
     </w:lvlOverride>
   </w:num>
   <w:num w:numId="48" w16cid:durableId="598098077">
-    <w:abstractNumId w:val="61"/>
+    <w:abstractNumId w:val="62"/>
     <w:lvlOverride w:ilvl="0">
       <w:startOverride w:val="2"/>
     </w:lvlOverride>
   </w:num>
   <w:num w:numId="49" w16cid:durableId="1560165727">
-    <w:abstractNumId w:val="61"/>
+    <w:abstractNumId w:val="62"/>
     <w:lvlOverride w:ilvl="0">
       <w:startOverride w:val="3"/>
     </w:lvlOverride>
   </w:num>
   <w:num w:numId="50" w16cid:durableId="377124950">
-    <w:abstractNumId w:val="61"/>
+    <w:abstractNumId w:val="62"/>
     <w:lvlOverride w:ilvl="0">
       <w:startOverride w:val="4"/>
     </w:lvlOverride>
   </w:num>
   <w:num w:numId="51" w16cid:durableId="607812016">
-    <w:abstractNumId w:val="61"/>
+    <w:abstractNumId w:val="62"/>
     <w:lvlOverride w:ilvl="0">
       <w:startOverride w:val="5"/>
     </w:lvlOverride>
@@ -43459,19 +46275,19 @@
     <w:abstractNumId w:val="12"/>
   </w:num>
   <w:num w:numId="56" w16cid:durableId="1164783749">
-    <w:abstractNumId w:val="68"/>
+    <w:abstractNumId w:val="69"/>
   </w:num>
   <w:num w:numId="57" w16cid:durableId="913005098">
-    <w:abstractNumId w:val="60"/>
+    <w:abstractNumId w:val="61"/>
   </w:num>
   <w:num w:numId="58" w16cid:durableId="1219778845">
-    <w:abstractNumId w:val="76"/>
+    <w:abstractNumId w:val="77"/>
   </w:num>
   <w:num w:numId="59" w16cid:durableId="238638311">
     <w:abstractNumId w:val="50"/>
   </w:num>
   <w:num w:numId="60" w16cid:durableId="2123960170">
-    <w:abstractNumId w:val="77"/>
+    <w:abstractNumId w:val="78"/>
   </w:num>
   <w:num w:numId="61" w16cid:durableId="1602493041">
     <w:abstractNumId w:val="19"/>
@@ -43480,7 +46296,7 @@
     <w:abstractNumId w:val="10"/>
   </w:num>
   <w:num w:numId="63" w16cid:durableId="2066367810">
-    <w:abstractNumId w:val="57"/>
+    <w:abstractNumId w:val="58"/>
   </w:num>
   <w:num w:numId="64" w16cid:durableId="1339507604">
     <w:abstractNumId w:val="48"/>
@@ -43489,22 +46305,22 @@
     <w:abstractNumId w:val="43"/>
   </w:num>
   <w:num w:numId="66" w16cid:durableId="528837816">
-    <w:abstractNumId w:val="84"/>
+    <w:abstractNumId w:val="85"/>
   </w:num>
   <w:num w:numId="67" w16cid:durableId="975909436">
-    <w:abstractNumId w:val="67"/>
+    <w:abstractNumId w:val="68"/>
   </w:num>
   <w:num w:numId="68" w16cid:durableId="1466040580">
-    <w:abstractNumId w:val="99"/>
+    <w:abstractNumId w:val="100"/>
   </w:num>
   <w:num w:numId="69" w16cid:durableId="210191331">
-    <w:abstractNumId w:val="89"/>
+    <w:abstractNumId w:val="90"/>
   </w:num>
   <w:num w:numId="70" w16cid:durableId="1262296157">
     <w:abstractNumId w:val="33"/>
   </w:num>
   <w:num w:numId="71" w16cid:durableId="1971857020">
-    <w:abstractNumId w:val="79"/>
+    <w:abstractNumId w:val="80"/>
   </w:num>
   <w:num w:numId="72" w16cid:durableId="2120448401">
     <w:abstractNumId w:val="38"/>
@@ -43519,22 +46335,22 @@
     <w:abstractNumId w:val="54"/>
   </w:num>
   <w:num w:numId="76" w16cid:durableId="1663850435">
-    <w:abstractNumId w:val="66"/>
+    <w:abstractNumId w:val="67"/>
   </w:num>
   <w:num w:numId="77" w16cid:durableId="804544196">
     <w:abstractNumId w:val="22"/>
   </w:num>
   <w:num w:numId="78" w16cid:durableId="1812021404">
-    <w:abstractNumId w:val="80"/>
+    <w:abstractNumId w:val="81"/>
   </w:num>
   <w:num w:numId="79" w16cid:durableId="1233807679">
-    <w:abstractNumId w:val="73"/>
+    <w:abstractNumId w:val="74"/>
   </w:num>
   <w:num w:numId="80" w16cid:durableId="1899435772">
-    <w:abstractNumId w:val="70"/>
+    <w:abstractNumId w:val="71"/>
   </w:num>
   <w:num w:numId="81" w16cid:durableId="406925585">
-    <w:abstractNumId w:val="94"/>
+    <w:abstractNumId w:val="95"/>
   </w:num>
   <w:num w:numId="82" w16cid:durableId="843396188">
     <w:abstractNumId w:val="28"/>
@@ -43543,28 +46359,28 @@
     <w:abstractNumId w:val="41"/>
   </w:num>
   <w:num w:numId="84" w16cid:durableId="923803672">
-    <w:abstractNumId w:val="59"/>
+    <w:abstractNumId w:val="60"/>
   </w:num>
   <w:num w:numId="85" w16cid:durableId="1773358063">
     <w:abstractNumId w:val="24"/>
   </w:num>
   <w:num w:numId="86" w16cid:durableId="84763516">
-    <w:abstractNumId w:val="83"/>
+    <w:abstractNumId w:val="84"/>
   </w:num>
   <w:num w:numId="87" w16cid:durableId="791820978">
-    <w:abstractNumId w:val="72"/>
+    <w:abstractNumId w:val="73"/>
   </w:num>
   <w:num w:numId="88" w16cid:durableId="128979204">
-    <w:abstractNumId w:val="95"/>
+    <w:abstractNumId w:val="96"/>
   </w:num>
   <w:num w:numId="89" w16cid:durableId="662197165">
-    <w:abstractNumId w:val="98"/>
+    <w:abstractNumId w:val="99"/>
   </w:num>
   <w:num w:numId="90" w16cid:durableId="1245456052">
-    <w:abstractNumId w:val="81"/>
+    <w:abstractNumId w:val="82"/>
   </w:num>
   <w:num w:numId="91" w16cid:durableId="342513056">
-    <w:abstractNumId w:val="91"/>
+    <w:abstractNumId w:val="92"/>
   </w:num>
   <w:num w:numId="92" w16cid:durableId="882790598">
     <w:abstractNumId w:val="21"/>
@@ -43579,7 +46395,7 @@
     <w:abstractNumId w:val="26"/>
   </w:num>
   <w:num w:numId="96" w16cid:durableId="791174499">
-    <w:abstractNumId w:val="92"/>
+    <w:abstractNumId w:val="93"/>
   </w:num>
   <w:num w:numId="97" w16cid:durableId="1031804172">
     <w:abstractNumId w:val="25"/>
@@ -43588,7 +46404,7 @@
     <w:abstractNumId w:val="31"/>
   </w:num>
   <w:num w:numId="99" w16cid:durableId="101152818">
-    <w:abstractNumId w:val="74"/>
+    <w:abstractNumId w:val="75"/>
   </w:num>
   <w:num w:numId="100" w16cid:durableId="982386779">
     <w:abstractNumId w:val="0"/>
@@ -43603,7 +46419,10 @@
     <w:abstractNumId w:val="40"/>
   </w:num>
   <w:num w:numId="104" w16cid:durableId="603923934">
-    <w:abstractNumId w:val="75"/>
+    <w:abstractNumId w:val="76"/>
+  </w:num>
+  <w:num w:numId="105" w16cid:durableId="1530608111">
+    <w:abstractNumId w:val="56"/>
   </w:num>
   <w:numIdMacAtCleanup w:val="103"/>
 </w:numbering>

</xml_diff>